<commit_message>
Corrige extracao de titulos com multiplos autores, particulas e sobrenomes compostos em GA
</commit_message>
<xml_diff>
--- a/superior-gestao-ambiental/revisao-equipe/checagem-biblioteca/Ementario_Completo_PPC_Gestao_Ambiental_Revisao_Biblioteca.docx
+++ b/superior-gestao-ambiental/revisao-equipe/checagem-biblioteca/Ementario_Completo_PPC_Gestao_Ambiental_Revisao_Biblioteca.docx
@@ -3351,7 +3351,18 @@
               <w:rPr>
                 <w:sz w:val="18"/>
               </w:rPr>
-              <w:t>BRADY, Nyle C. Elementos da natureza e propriedades dos solos. 3. ed. Porto Alegre: Bookman, 2013. CHRISTOFOLETTI, Antônio. Geomorfologia. 2. ed. São Paulo: Blucher, 1980.</w:t>
+              <w:t>BRADY, Nyle C. Elementos da natureza e propriedades dos solos. 3. ed. Porto Alegre: Bookman, 2013.</w:t>
+            </w:r>
+          </w:p>
+          <w:p>
+            <w:pPr>
+              <w:spacing w:after="80"/>
+            </w:pPr>
+            <w:r>
+              <w:rPr>
+                <w:sz w:val="18"/>
+              </w:rPr>
+              <w:t>CHRISTOFOLETTI, Antônio. Geomorfologia. 2. ed. São Paulo: Blucher, 1980.</w:t>
             </w:r>
           </w:p>
         </w:tc>
@@ -3387,7 +3398,7 @@
               <w:rPr>
                 <w:sz w:val="18"/>
               </w:rPr>
-              <w:t>ESTEVES, Francisco de Assis. Fundamentos de limnologia. 3.ed. Rio de Janeiro: Interciência, 2011. MENDONÇA, Francisco; DANNI-OLIVEIRA, Inês Moresco. Climatologia: noções básicas e climas do Brasil. São Paulo: Oficina de Textos, 2007.</w:t>
+              <w:t>ESTEVES, Francisco de Assis. Fundamentos de limnologia. 3.ed. Rio de Janeiro: Interciência, 2011.</w:t>
             </w:r>
           </w:p>
           <w:p>
@@ -3398,6 +3409,17 @@
               <w:rPr>
                 <w:sz w:val="18"/>
               </w:rPr>
+              <w:t>MENDONÇA, Francisco; DANNI-OLIVEIRA, Inês Moresco. Climatologia: noções básicas e climas do Brasil. São Paulo: Oficina de Textos, 2007.</w:t>
+            </w:r>
+          </w:p>
+          <w:p>
+            <w:pPr>
+              <w:spacing w:after="80"/>
+            </w:pPr>
+            <w:r>
+              <w:rPr>
+                <w:sz w:val="18"/>
+              </w:rPr>
               <w:t>POPP, José Henrique. Geologia geral. 6. ed. Rio de Janeiro: LTC, 2010.</w:t>
             </w:r>
           </w:p>
@@ -3409,7 +3431,18 @@
               <w:rPr>
                 <w:sz w:val="18"/>
               </w:rPr>
-              <w:t>GROTZINGER, John; JORDAN, Thomas H. Para entender a terra. 6. ed. Porto Alegre: Bookman, 2013. TROPPMAIR, Helmut. Biogeografia e meio ambiente. 9. ed. Rio de Janeiro: Technical Books, 2012.</w:t>
+              <w:t>GROTZINGER, John; JORDAN, Thomas H. Para entender a terra. 6. ed. Porto Alegre: Bookman, 2013.</w:t>
+            </w:r>
+          </w:p>
+          <w:p>
+            <w:pPr>
+              <w:spacing w:after="80"/>
+            </w:pPr>
+            <w:r>
+              <w:rPr>
+                <w:sz w:val="18"/>
+              </w:rPr>
+              <w:t>TROPPMAIR, Helmut. Biogeografia e meio ambiente. 9. ed. Rio de Janeiro: Technical Books, 2012.</w:t>
             </w:r>
           </w:p>
         </w:tc>
@@ -4473,7 +4506,29 @@
               <w:rPr>
                 <w:sz w:val="18"/>
               </w:rPr>
-              <w:t>KOCH, Ingedore Grunfeld Villaça. A coesão textual. 27. ed. São Paulo: Contexto, 2007. LOUSADA, Eliane; ABREU-TARDELLI, Lília Santos. Resenha. São Paulo: Parábola, 2004. ______. Resumo. 7. ed. São Paulo: Parábola, 2004.</w:t>
+              <w:t>KOCH, Ingedore Grunfeld Villaça. A coesão textual. 27. ed. São Paulo: Contexto, 2007.</w:t>
+            </w:r>
+          </w:p>
+          <w:p>
+            <w:pPr>
+              <w:spacing w:after="80"/>
+            </w:pPr>
+            <w:r>
+              <w:rPr>
+                <w:sz w:val="18"/>
+              </w:rPr>
+              <w:t>LOUSADA, Eliane; ABREU-TARDELLI, Lília Santos. Resenha. São Paulo: Parábola, 2004.</w:t>
+            </w:r>
+          </w:p>
+          <w:p>
+            <w:pPr>
+              <w:spacing w:after="80"/>
+            </w:pPr>
+            <w:r>
+              <w:rPr>
+                <w:sz w:val="18"/>
+              </w:rPr>
+              <w:t>______. Resumo. 7. ed. São Paulo: Parábola, 2004.</w:t>
             </w:r>
           </w:p>
           <w:p>
@@ -7299,7 +7354,40 @@
               <w:rPr>
                 <w:sz w:val="18"/>
               </w:rPr>
-              <w:t>FITZ, Paulo Roberto. Cartografia básica. São Paulo: Oficina de Textos, 2008. ______. Geoprocessamento sem complicação. São Paulo: Oficina de Textos, 2008. MENEZES, Paulo Márcio Leal de. Roteiro de cartografia. São Paulo: Oficina de Textos, 2013. ROBINSON, A. H. et al. Elements of cartography. 6. ed. New York: John Wiley &amp; Sons, 1995.</w:t>
+              <w:t>FITZ, Paulo Roberto. Cartografia básica. São Paulo: Oficina de Textos, 2008.</w:t>
+            </w:r>
+          </w:p>
+          <w:p>
+            <w:pPr>
+              <w:spacing w:after="80"/>
+            </w:pPr>
+            <w:r>
+              <w:rPr>
+                <w:sz w:val="18"/>
+              </w:rPr>
+              <w:t>______. Geoprocessamento sem complicação. São Paulo: Oficina de Textos, 2008.</w:t>
+            </w:r>
+          </w:p>
+          <w:p>
+            <w:pPr>
+              <w:spacing w:after="80"/>
+            </w:pPr>
+            <w:r>
+              <w:rPr>
+                <w:sz w:val="18"/>
+              </w:rPr>
+              <w:t>MENEZES, Paulo Márcio Leal de. Roteiro de cartografia. São Paulo: Oficina de Textos, 2013.</w:t>
+            </w:r>
+          </w:p>
+          <w:p>
+            <w:pPr>
+              <w:spacing w:after="80"/>
+            </w:pPr>
+            <w:r>
+              <w:rPr>
+                <w:sz w:val="18"/>
+              </w:rPr>
+              <w:t>ROBINSON, A. H. et al. Elements of cartography. 6. ed. New York: John Wiley &amp; Sons, 1995.</w:t>
             </w:r>
           </w:p>
         </w:tc>
@@ -9971,7 +10059,7 @@
               <w:rPr>
                 <w:sz w:val="18"/>
               </w:rPr>
-              <w:t>BUENO, Fabrício. Estatística para processos produtivos. Florianópolis: Visual Books, 2010. KIRSTEN, J. T.;</w:t>
+              <w:t>BUENO, Fabrício. Estatística para processos produtivos. Florianópolis: Visual Books, 2010.</w:t>
             </w:r>
           </w:p>
           <w:p>
@@ -9982,7 +10070,7 @@
               <w:rPr>
                 <w:sz w:val="18"/>
               </w:rPr>
-              <w:t>RABAHY, W. A. Estatística aplicada às ciências humanas e ao turismo. São Paulo: Saraiva, 2006.</w:t>
+              <w:t>KIRSTEN, J. T.; RABAHY, W. A. Estatística aplicada às ciências humanas e ao turismo. São Paulo: Saraiva, 2006.</w:t>
             </w:r>
           </w:p>
         </w:tc>
@@ -10978,7 +11066,18 @@
               <w:rPr>
                 <w:sz w:val="18"/>
               </w:rPr>
-              <w:t>AGÊNCIA NACIONAL DE ÁGUAS. Sistema Nacional de Informações sobre Recursos Hídricos: Conjuntura dos recursos hídricos no Brasil: Disponível em: https://www.snirh.gov.br/portal/snirh/centrais-de-conteudos/conjuntura-dos-recursos-hidricos Acesso em: 15 jul. 2026. AGÊNCIA NACIONAL DE ENERGIA ELÉTRICA. Introdução ao Gerenciamento de Recursos Hídricos. 2. ed. Brasília: ANEEL, 2001.</w:t>
+              <w:t>AGÊNCIA NACIONAL DE ÁGUAS. Sistema Nacional de Informações sobre Recursos Hídricos: Conjuntura dos recursos hídricos no Brasil: Disponível em: https://www.snirh.gov.br/portal/snirh/centrais-de-conteudos/conjuntura-dos-recursos-hidricos Acesso em: 15 jul. 2026.</w:t>
+            </w:r>
+          </w:p>
+          <w:p>
+            <w:pPr>
+              <w:spacing w:after="80"/>
+            </w:pPr>
+            <w:r>
+              <w:rPr>
+                <w:sz w:val="18"/>
+              </w:rPr>
+              <w:t>AGÊNCIA NACIONAL DE ENERGIA ELÉTRICA. Introdução ao Gerenciamento de Recursos Hídricos. 2. ed. Brasília: ANEEL, 2001.</w:t>
             </w:r>
           </w:p>
           <w:p>
@@ -11025,7 +11124,7 @@
               <w:rPr>
                 <w:sz w:val="18"/>
               </w:rPr>
-              <w:t>BANCO MUNDIAL. Estratégias de gerenciamento de recursos hídricos no Brasil: áreas de cooperação com o Banco Mundial. Brasília, 2003. ______. Sistema de suporte à decisão para a outorga de direitos de uso da água no Brasil. Brasília, 2003.</w:t>
+              <w:t>BANCO MUNDIAL. Estratégias de gerenciamento de recursos hídricos no Brasil: áreas de cooperação com o Banco Mundial. Brasília, 2003.</w:t>
             </w:r>
           </w:p>
           <w:p>
@@ -11036,7 +11135,29 @@
               <w:rPr>
                 <w:sz w:val="18"/>
               </w:rPr>
-              <w:t>BRASIL. Ministério do Meio Ambiente, Secretaria de Recursos Hídricos. Plano Nacional de Recursos Hídricos. Panorama e estado dos recursos hídricos do Brasil. Volume 1. Brasília: MMA, 2006. ______. Plano Nacional de Recursos Hídricos. Síntese executiva: português. Brasília: MMA, 2006.</w:t>
+              <w:t>______. Sistema de suporte à decisão para a outorga de direitos de uso da água no Brasil. Brasília, 2003.</w:t>
+            </w:r>
+          </w:p>
+          <w:p>
+            <w:pPr>
+              <w:spacing w:after="80"/>
+            </w:pPr>
+            <w:r>
+              <w:rPr>
+                <w:sz w:val="18"/>
+              </w:rPr>
+              <w:t>BRASIL. Ministério do Meio Ambiente, Secretaria de Recursos Hídricos. Plano Nacional de Recursos Hídricos. Panorama e estado dos recursos hídricos do Brasil. Volume 1. Brasília: MMA, 2006.</w:t>
+            </w:r>
+          </w:p>
+          <w:p>
+            <w:pPr>
+              <w:spacing w:after="80"/>
+            </w:pPr>
+            <w:r>
+              <w:rPr>
+                <w:sz w:val="18"/>
+              </w:rPr>
+              <w:t>______. Plano Nacional de Recursos Hídricos. Síntese executiva: português. Brasília: MMA, 2006.</w:t>
             </w:r>
           </w:p>
           <w:p>
@@ -14659,7 +14780,29 @@
               <w:rPr>
                 <w:sz w:val="18"/>
               </w:rPr>
-              <w:t>FREIRE, Paulo. Conscientização. São Paulo: Cortez, 1979. ______. Educação &amp; atualidade brasileira, São Paulo: Cortez, 2001. ______. Pedagogia da autonomia. 31. ed. São Paulo: Paz e Terra, 2005.</w:t>
+              <w:t>FREIRE, Paulo. Conscientização. São Paulo: Cortez, 1979.</w:t>
+            </w:r>
+          </w:p>
+          <w:p>
+            <w:pPr>
+              <w:spacing w:after="80"/>
+            </w:pPr>
+            <w:r>
+              <w:rPr>
+                <w:sz w:val="18"/>
+              </w:rPr>
+              <w:t>______. Educação &amp; atualidade brasileira, São Paulo: Cortez, 2001.</w:t>
+            </w:r>
+          </w:p>
+          <w:p>
+            <w:pPr>
+              <w:spacing w:after="80"/>
+            </w:pPr>
+            <w:r>
+              <w:rPr>
+                <w:sz w:val="18"/>
+              </w:rPr>
+              <w:t>______. Pedagogia da autonomia. 31. ed. São Paulo: Paz e Terra, 2005.</w:t>
             </w:r>
           </w:p>
           <w:p>
@@ -18331,7 +18474,18 @@
               <w:rPr>
                 <w:sz w:val="18"/>
               </w:rPr>
-              <w:t>BRASIL. Tribunal de Contas da União. Cartilha de licenciamento ambiental. Brasília, DF, 2004. Disponível em: &lt;https://moodle.ifsc.edu.br/mod/resource/view.php?id=84576&gt;. Acesso em: 28 ago. 2018. CONSELHO NACIONAL DO MEIO AMBIENTE. Legislação ambiental federal. Disponível em &lt;http://www2.mma.gov.br/port/conama/legi.cfm&gt;. Acesso em: 28 ago. 2018. ______. Resoluções do CONAMA. Brasília, DF: MMA, 2012. Disponível em: &lt;https://moodle.ifsc.edu.br/mod/resource/view.php?id=84571&gt;. Acesso em: 28 ago. 2018.</w:t>
+              <w:t>BRASIL. Tribunal de Contas da União. Cartilha de licenciamento ambiental. Brasília, DF, 2004. Disponível em: &lt;https://moodle.ifsc.edu.br/mod/resource/view.php?id=84576&gt;. Acesso em: 28 ago. 2018. CONSELHO NACIONAL DO MEIO AMBIENTE. Legislação ambiental federal. Disponível em &lt;http://www2.mma.gov.br/port/conama/legi.cfm&gt;. Acesso em: 28 ago. 2018.</w:t>
+            </w:r>
+          </w:p>
+          <w:p>
+            <w:pPr>
+              <w:spacing w:after="80"/>
+            </w:pPr>
+            <w:r>
+              <w:rPr>
+                <w:sz w:val="18"/>
+              </w:rPr>
+              <w:t>______. Resoluções do CONAMA. Brasília, DF: MMA, 2012. Disponível em: &lt;https://moodle.ifsc.edu.br/mod/resource/view.php?id=84571&gt;. Acesso em: 28 ago. 2018.</w:t>
             </w:r>
           </w:p>
         </w:tc>
@@ -19393,7 +19547,18 @@
               <w:rPr>
                 <w:sz w:val="18"/>
               </w:rPr>
-              <w:t>FANJUL, Adrián (org.). Gramática y práctica de español para brasileños. 2. ed. São Paulo: Moderna, 2011. GONZÁLEZ H. A. Conjugar: verbos de España y de América. Madrid: Edelsa Grupo Didascalia, 2011. PROST, Gisèle; NORIEGA FERNÁNDEZ, Alfredo. Al día: curso intermedio de español para los negocios. 3. ed. Madrid: SGEL, 2011.</w:t>
+              <w:t>FANJUL, Adrián (org.). Gramática y práctica de español para brasileños. 2. ed. São Paulo: Moderna, 2011. GONZÁLEZ H. A. Conjugar: verbos de España y de América. Madrid: Edelsa Grupo Didascalia, 2011.</w:t>
+            </w:r>
+          </w:p>
+          <w:p>
+            <w:pPr>
+              <w:spacing w:after="80"/>
+            </w:pPr>
+            <w:r>
+              <w:rPr>
+                <w:sz w:val="18"/>
+              </w:rPr>
+              <w:t>PROST, Gisèle; NORIEGA FERNÁNDEZ, Alfredo. Al día: curso intermedio de español para los negocios. 3. ed. Madrid: SGEL, 2011.</w:t>
             </w:r>
           </w:p>
         </w:tc>

</xml_diff>

<commit_message>
Atualiza base de ementas e regenera relatorios com arquivos mais recentes de Gestao Ambiental
</commit_message>
<xml_diff>
--- a/superior-gestao-ambiental/revisao-equipe/checagem-biblioteca/Ementario_Completo_PPC_Gestao_Ambiental_Revisao_Biblioteca.docx
+++ b/superior-gestao-ambiental/revisao-equipe/checagem-biblioteca/Ementario_Completo_PPC_Gestao_Ambiental_Revisao_Biblioteca.docx
@@ -4184,7 +4184,7 @@
               <w:rPr>
                 <w:sz w:val="18"/>
               </w:rPr>
-              <w:t>______. Resumo. 7. ed. São Paulo: Parábola, 2004.</w:t>
+              <w:t>LOUSADA, Eliane; ABREU-TARDELLI, Lília Santos. Resumo. 7. ed. São Paulo: Parábola, 2004.</w:t>
             </w:r>
           </w:p>
           <w:p>
@@ -7010,18 +7010,7 @@
               <w:rPr>
                 <w:sz w:val="18"/>
               </w:rPr>
-              <w:t>FITZ, Paulo Roberto. Cartografia básica. São Paulo: Oficina de Textos, 2008.</w:t>
-            </w:r>
-          </w:p>
-          <w:p>
-            <w:pPr>
-              <w:spacing w:after="80"/>
-            </w:pPr>
-            <w:r>
-              <w:rPr>
-                <w:sz w:val="18"/>
-              </w:rPr>
-              <w:t>______. Geoprocessamento sem complicação. São Paulo: Oficina de Textos, 2008.</w:t>
+              <w:t>FITZ, Paulo Roberto. Cartografia básica. São Paulo: Oficina de Textos, 2008. Geoprocessamento sem complicação. São Paulo: Oficina de Textos, 2008.</w:t>
             </w:r>
           </w:p>
           <w:p>
@@ -10791,7 +10780,7 @@
               <w:rPr>
                 <w:sz w:val="18"/>
               </w:rPr>
-              <w:t>______. Sistema de suporte à decisão para a outorga de direitos de uso da água no Brasil. Brasília, 2003.</w:t>
+              <w:t>BANCO MUNDIAL. Sistema de suporte à decisão para a outorga de direitos de uso da água no Brasil. Brasília, 2003.</w:t>
             </w:r>
           </w:p>
           <w:p>
@@ -10813,7 +10802,7 @@
               <w:rPr>
                 <w:sz w:val="18"/>
               </w:rPr>
-              <w:t>______. Plano Nacional de Recursos Hídricos. Síntese executiva: português. Brasília: MMA, 2006.</w:t>
+              <w:t>BRASIL. Plano Nacional de Recursos Hídricos. Síntese executiva: português. Brasília: MMA, 2006.</w:t>
             </w:r>
           </w:p>
           <w:p>
@@ -19203,7 +19192,18 @@
               <w:rPr>
                 <w:sz w:val="18"/>
               </w:rPr>
-              <w:t>FANJUL, Adrián (org.). Gramática y práctica de español para brasileños. 2. ed. São Paulo: Moderna, 2011. GONZÁLEZ H. A. Conjugar: verbos de España y de América. Madrid: Edelsa Grupo Didascalia, 2011.</w:t>
+              <w:t>FANJUL, Adrián (org.). Gramática y práctica de español para brasileños. 2. ed. São Paulo: Moderna, 2011.</w:t>
+            </w:r>
+          </w:p>
+          <w:p>
+            <w:pPr>
+              <w:spacing w:after="80"/>
+            </w:pPr>
+            <w:r>
+              <w:rPr>
+                <w:sz w:val="18"/>
+              </w:rPr>
+              <w:t>GONZÁLEZ H. A. Conjugar: verbos de España y de América. Madrid: Edelsa Grupo Didascalia, 2011.</w:t>
             </w:r>
           </w:p>
           <w:p>

</xml_diff>

<commit_message>
Aplica formatacao em negrito aos titulos de todas as 204 bibliografias no docx de Gestao Ambiental
</commit_message>
<xml_diff>
--- a/superior-gestao-ambiental/revisao-equipe/checagem-biblioteca/Ementario_Completo_PPC_Gestao_Ambiental_Revisao_Biblioteca.docx
+++ b/superior-gestao-ambiental/revisao-equipe/checagem-biblioteca/Ementario_Completo_PPC_Gestao_Ambiental_Revisao_Biblioteca.docx
@@ -1498,7 +1498,20 @@
               <w:rPr>
                 <w:sz w:val="18"/>
               </w:rPr>
-              <w:t>BUENO, Cecília (revisão técnica). A economia da natureza. Tradução de Ana Cláudia de Macêdo Vieira et al. 8. ed. Rio de Janeiro: Guanabara Koogan, 2021. 596 p., il. color. ISBN 9788527737074.</w:t>
+              <w:t xml:space="preserve">BUENO, Cecília (revisão técnica). </w:t>
+            </w:r>
+            <w:r>
+              <w:rPr>
+                <w:b/>
+                <w:sz w:val="18"/>
+              </w:rPr>
+              <w:t>A economia da natureza</w:t>
+            </w:r>
+            <w:r>
+              <w:rPr>
+                <w:sz w:val="18"/>
+              </w:rPr>
+              <w:t>. Tradução de Ana Cláudia de Macêdo Vieira et al. 8. ed. Rio de Janeiro: Guanabara Koogan, 2021. 596 p., il. color. ISBN 9788527737074.</w:t>
             </w:r>
           </w:p>
           <w:p>
@@ -1509,7 +1522,20 @@
               <w:rPr>
                 <w:sz w:val="18"/>
               </w:rPr>
-              <w:t>REECE, Jane B. Biologia de Campbell. Revisão de Denise Cantarelli Machado, Gaby Renard, Paulo Luiz de Oliveira. 10. ed. Porto Alegre: Artmed, 2015. xlv, 1442, il. (algumas col.). ISBN 9788582712160.</w:t>
+              <w:t xml:space="preserve">REECE, Jane B. </w:t>
+            </w:r>
+            <w:r>
+              <w:rPr>
+                <w:b/>
+                <w:sz w:val="18"/>
+              </w:rPr>
+              <w:t>Biologia de Campbell</w:t>
+            </w:r>
+            <w:r>
+              <w:rPr>
+                <w:sz w:val="18"/>
+              </w:rPr>
+              <w:t>. Revisão de Denise Cantarelli Machado, Gaby Renard, Paulo Luiz de Oliveira. 10. ed. Porto Alegre: Artmed, 2015. xlv, 1442, il. (algumas col.). ISBN 9788582712160.</w:t>
             </w:r>
           </w:p>
         </w:tc>
@@ -1545,7 +1571,20 @@
               <w:rPr>
                 <w:sz w:val="18"/>
               </w:rPr>
-              <w:t>CASTRO, Peter; HUBER, Michael E. Biologia marinha. 8. ed. Porto Alegre: Artmed, 2012. 461 p., il., color. Inclui bibliografia e índice. ISBN 9788580551020.</w:t>
+              <w:t xml:space="preserve">CASTRO, Peter; HUBER, Michael E. </w:t>
+            </w:r>
+            <w:r>
+              <w:rPr>
+                <w:b/>
+                <w:sz w:val="18"/>
+              </w:rPr>
+              <w:t>Biologia marinha</w:t>
+            </w:r>
+            <w:r>
+              <w:rPr>
+                <w:sz w:val="18"/>
+              </w:rPr>
+              <w:t>. 8. ed. Porto Alegre: Artmed, 2012. 461 p., il., color. Inclui bibliografia e índice. ISBN 9788580551020.</w:t>
             </w:r>
           </w:p>
           <w:p>
@@ -1556,7 +1595,20 @@
               <w:rPr>
                 <w:sz w:val="18"/>
               </w:rPr>
-              <w:t>DARWIN, Charles, 1809-1882. A origem das espécies e a seleção natural. Tradução de Soraya Freitas. São Paulo: Madras, 2011. 462 p. ISBN 9788537006573.</w:t>
+              <w:t xml:space="preserve">DARWIN, Charles, 1809-1882. </w:t>
+            </w:r>
+            <w:r>
+              <w:rPr>
+                <w:b/>
+                <w:sz w:val="18"/>
+              </w:rPr>
+              <w:t>A origem das espécies e a seleção natural</w:t>
+            </w:r>
+            <w:r>
+              <w:rPr>
+                <w:sz w:val="18"/>
+              </w:rPr>
+              <w:t>. Tradução de Soraya Freitas. São Paulo: Madras, 2011. 462 p. ISBN 9788537006573.</w:t>
             </w:r>
           </w:p>
           <w:p>
@@ -1567,7 +1619,20 @@
               <w:rPr>
                 <w:sz w:val="18"/>
               </w:rPr>
-              <w:t>PRIMACK, Richard B.; RODRIGUES, Efraim. Biologia da conservação. Londrina: Planta, 2001. 327 p., il., 23 cm. Bibliografia: p. 311-327. ISBN 8590200213. SOUSA-SOUTO, Leandro. Ecologia descomplicada: um guia simplificado para estudantes e profissionais da área ambiental. Aracajú: O Autor, 2018. 166 p. ISBN 9788591080519.</w:t>
+              <w:t xml:space="preserve">PRIMACK, Richard B.; RODRIGUES, Efraim. </w:t>
+            </w:r>
+            <w:r>
+              <w:rPr>
+                <w:b/>
+                <w:sz w:val="18"/>
+              </w:rPr>
+              <w:t>Biologia da conservação</w:t>
+            </w:r>
+            <w:r>
+              <w:rPr>
+                <w:sz w:val="18"/>
+              </w:rPr>
+              <w:t>. Londrina: Planta, 2001. 327 p., il., 23 cm. Bibliografia: p. 311-327. ISBN 8590200213. SOUSA-SOUTO, Leandro. Ecologia descomplicada: um guia simplificado para estudantes e profissionais da área ambiental. Aracajú: O Autor, 2018. 166 p. ISBN 9788591080519.</w:t>
             </w:r>
           </w:p>
         </w:tc>
@@ -2266,7 +2331,20 @@
               <w:rPr>
                 <w:sz w:val="18"/>
               </w:rPr>
-              <w:t>DANOWSKI, Déborah (Org.). Os mil nomes de Gaia: do Antropoceno à Idade da Terra. Rio de Janeiro: Machado, 2022.</w:t>
+              <w:t xml:space="preserve">DANOWSKI, Déborah (Org.). </w:t>
+            </w:r>
+            <w:r>
+              <w:rPr>
+                <w:b/>
+                <w:sz w:val="18"/>
+              </w:rPr>
+              <w:t>Os mil nomes de Gaia: do Antropoceno à Idade da Terra</w:t>
+            </w:r>
+            <w:r>
+              <w:rPr>
+                <w:sz w:val="18"/>
+              </w:rPr>
+              <w:t>. Rio de Janeiro: Machado, 2022.</w:t>
             </w:r>
           </w:p>
           <w:p>
@@ -2277,7 +2355,20 @@
               <w:rPr>
                 <w:sz w:val="18"/>
               </w:rPr>
-              <w:t>JONAS, Hans. O princípio responsabilidade: ensaio de uma ética para a civilização tecnológica. Rio de Janeiro: Contraponto; PUC-Rio, 2006.</w:t>
+              <w:t xml:space="preserve">JONAS, Hans. </w:t>
+            </w:r>
+            <w:r>
+              <w:rPr>
+                <w:b/>
+                <w:sz w:val="18"/>
+              </w:rPr>
+              <w:t>O princípio responsabilidade: ensaio de uma ética para a civilização tecnológica</w:t>
+            </w:r>
+            <w:r>
+              <w:rPr>
+                <w:sz w:val="18"/>
+              </w:rPr>
+              <w:t>. Rio de Janeiro: Contraponto; PUC-Rio, 2006.</w:t>
             </w:r>
           </w:p>
           <w:p>
@@ -2288,7 +2379,20 @@
               <w:rPr>
                 <w:sz w:val="18"/>
               </w:rPr>
-              <w:t>JONAS, Hans. O princípio vida: fundamentos para uma biologia filosófica. Petrópolis: Vozes, 2004.</w:t>
+              <w:t xml:space="preserve">JONAS, Hans. </w:t>
+            </w:r>
+            <w:r>
+              <w:rPr>
+                <w:b/>
+                <w:sz w:val="18"/>
+              </w:rPr>
+              <w:t>O princípio vida: fundamentos para uma biologia filosófica</w:t>
+            </w:r>
+            <w:r>
+              <w:rPr>
+                <w:sz w:val="18"/>
+              </w:rPr>
+              <w:t>. Petrópolis: Vozes, 2004.</w:t>
             </w:r>
           </w:p>
           <w:p>
@@ -2299,7 +2403,20 @@
               <w:rPr>
                 <w:sz w:val="18"/>
               </w:rPr>
-              <w:t>JUNGES, José Roque. Ética ambiental. São Leopoldo: Unisinos, 2005.</w:t>
+              <w:t xml:space="preserve">JUNGES, José Roque. </w:t>
+            </w:r>
+            <w:r>
+              <w:rPr>
+                <w:b/>
+                <w:sz w:val="18"/>
+              </w:rPr>
+              <w:t>Ética ambiental</w:t>
+            </w:r>
+            <w:r>
+              <w:rPr>
+                <w:sz w:val="18"/>
+              </w:rPr>
+              <w:t>. São Leopoldo: Unisinos, 2005.</w:t>
             </w:r>
           </w:p>
           <w:p>
@@ -2310,7 +2427,20 @@
               <w:rPr>
                 <w:sz w:val="18"/>
               </w:rPr>
-              <w:t>OLIVEIRA, Jelson. Nietzsche e a planta homem: sobre o perspectivismo vegetal. Pensando, v. 14, 2023.</w:t>
+              <w:t xml:space="preserve">OLIVEIRA, Jelson. </w:t>
+            </w:r>
+            <w:r>
+              <w:rPr>
+                <w:b/>
+                <w:sz w:val="18"/>
+              </w:rPr>
+              <w:t>Nietzsche e a planta homem: sobre o perspectivismo vegetal</w:t>
+            </w:r>
+            <w:r>
+              <w:rPr>
+                <w:sz w:val="18"/>
+              </w:rPr>
+              <w:t>. Pensando, v. 14, 2023.</w:t>
             </w:r>
           </w:p>
         </w:tc>
@@ -2346,7 +2476,20 @@
               <w:rPr>
                 <w:sz w:val="18"/>
               </w:rPr>
-              <w:t>FALABRETTI, Ericson; OLIVEIRA, Jelson (Orgs.). Fenomenologia da vida. Caxias do Sul: EDUCS, 2019.</w:t>
+              <w:t xml:space="preserve">FALABRETTI, Ericson; OLIVEIRA, Jelson (Orgs.). </w:t>
+            </w:r>
+            <w:r>
+              <w:rPr>
+                <w:b/>
+                <w:sz w:val="18"/>
+              </w:rPr>
+              <w:t>Fenomenologia da vida</w:t>
+            </w:r>
+            <w:r>
+              <w:rPr>
+                <w:sz w:val="18"/>
+              </w:rPr>
+              <w:t>. Caxias do Sul: EDUCS, 2019.</w:t>
             </w:r>
           </w:p>
           <w:p>
@@ -2357,7 +2500,20 @@
               <w:rPr>
                 <w:sz w:val="18"/>
               </w:rPr>
-              <w:t>FERRY, Luc. A nova ordem ecológica: a árvore, o animal e o homem. Rio de Janeiro: Difel, 2009.</w:t>
+              <w:t xml:space="preserve">FERRY, Luc. </w:t>
+            </w:r>
+            <w:r>
+              <w:rPr>
+                <w:b/>
+                <w:sz w:val="18"/>
+              </w:rPr>
+              <w:t>A nova ordem ecológica: a árvore, o animal e o homem</w:t>
+            </w:r>
+            <w:r>
+              <w:rPr>
+                <w:sz w:val="18"/>
+              </w:rPr>
+              <w:t>. Rio de Janeiro: Difel, 2009.</w:t>
             </w:r>
           </w:p>
           <w:p>
@@ -2368,7 +2524,20 @@
               <w:rPr>
                 <w:sz w:val="18"/>
               </w:rPr>
-              <w:t>GUATTARI, Félix. As três ecologias. Campinas: Papirus, 2011.</w:t>
+              <w:t xml:space="preserve">GUATTARI, Félix. </w:t>
+            </w:r>
+            <w:r>
+              <w:rPr>
+                <w:b/>
+                <w:sz w:val="18"/>
+              </w:rPr>
+              <w:t>As três ecologias</w:t>
+            </w:r>
+            <w:r>
+              <w:rPr>
+                <w:sz w:val="18"/>
+              </w:rPr>
+              <w:t>. Campinas: Papirus, 2011.</w:t>
             </w:r>
           </w:p>
           <w:p>
@@ -2379,7 +2548,20 @@
               <w:rPr>
                 <w:sz w:val="18"/>
               </w:rPr>
-              <w:t>LOVELOCK, James. Gaia: alerta final. Rio de Janeiro: Intrínseca, 2010.</w:t>
+              <w:t xml:space="preserve">LOVELOCK, James. </w:t>
+            </w:r>
+            <w:r>
+              <w:rPr>
+                <w:b/>
+                <w:sz w:val="18"/>
+              </w:rPr>
+              <w:t>Gaia: alerta final</w:t>
+            </w:r>
+            <w:r>
+              <w:rPr>
+                <w:sz w:val="18"/>
+              </w:rPr>
+              <w:t>. Rio de Janeiro: Intrínseca, 2010.</w:t>
             </w:r>
           </w:p>
           <w:p>
@@ -2390,7 +2572,20 @@
               <w:rPr>
                 <w:sz w:val="18"/>
               </w:rPr>
-              <w:t>OLIVEIRA, J. R.; MALTA, P. J. Hans Jonas e a filosofia da vida. Veritas (Porto Alegre), v. 66, p. 87-111, 2021.</w:t>
+              <w:t xml:space="preserve">OLIVEIRA, J. R.; MALTA, P. J. </w:t>
+            </w:r>
+            <w:r>
+              <w:rPr>
+                <w:b/>
+                <w:sz w:val="18"/>
+              </w:rPr>
+              <w:t>Hans Jonas e a filosofia da vida</w:t>
+            </w:r>
+            <w:r>
+              <w:rPr>
+                <w:sz w:val="18"/>
+              </w:rPr>
+              <w:t>. Veritas (Porto Alegre), v. 66, p. 87-111, 2021.</w:t>
             </w:r>
           </w:p>
           <w:p>
@@ -2401,7 +2596,20 @@
               <w:rPr>
                 <w:sz w:val="18"/>
               </w:rPr>
-              <w:t>OLIVEIRA, Jelson. Nietzsche, um proto-ambientalista? Poiesis: Revista de Filosofia, v. 12, n. 2, p. 4-29, 2015.</w:t>
+              <w:t xml:space="preserve">OLIVEIRA, Jelson. </w:t>
+            </w:r>
+            <w:r>
+              <w:rPr>
+                <w:b/>
+                <w:sz w:val="18"/>
+              </w:rPr>
+              <w:t>Nietzsche, um proto-ambientalista? Poiesis</w:t>
+            </w:r>
+            <w:r>
+              <w:rPr>
+                <w:sz w:val="18"/>
+              </w:rPr>
+              <w:t>: Revista de Filosofia, v. 12, n. 2, p. 4-29, 2015.</w:t>
             </w:r>
           </w:p>
         </w:tc>
@@ -3007,7 +3215,20 @@
               <w:rPr>
                 <w:sz w:val="18"/>
               </w:rPr>
-              <w:t>BRADY, Nyle C. Elementos da natureza e propriedades dos solos. 3. ed. Porto Alegre: Bookman, 2013.</w:t>
+              <w:t xml:space="preserve">BRADY, Nyle C. </w:t>
+            </w:r>
+            <w:r>
+              <w:rPr>
+                <w:b/>
+                <w:sz w:val="18"/>
+              </w:rPr>
+              <w:t>Elementos da natureza e propriedades dos solos</w:t>
+            </w:r>
+            <w:r>
+              <w:rPr>
+                <w:sz w:val="18"/>
+              </w:rPr>
+              <w:t>. 3. ed. Porto Alegre: Bookman, 2013.</w:t>
             </w:r>
           </w:p>
           <w:p>
@@ -3018,7 +3239,20 @@
               <w:rPr>
                 <w:sz w:val="18"/>
               </w:rPr>
-              <w:t>CHRISTOFOLETTI, Antônio. Geomorfologia. 2. ed. São Paulo: Blucher, 1980.</w:t>
+              <w:t xml:space="preserve">CHRISTOFOLETTI, Antônio. </w:t>
+            </w:r>
+            <w:r>
+              <w:rPr>
+                <w:b/>
+                <w:sz w:val="18"/>
+              </w:rPr>
+              <w:t>Geomorfologia</w:t>
+            </w:r>
+            <w:r>
+              <w:rPr>
+                <w:sz w:val="18"/>
+              </w:rPr>
+              <w:t>. 2. ed. São Paulo: Blucher, 1980.</w:t>
             </w:r>
           </w:p>
         </w:tc>
@@ -3054,7 +3288,20 @@
               <w:rPr>
                 <w:sz w:val="18"/>
               </w:rPr>
-              <w:t>ESTEVES, Francisco de Assis. Fundamentos de limnologia. 3.ed. Rio de Janeiro: Interciência, 2011.</w:t>
+              <w:t xml:space="preserve">ESTEVES, Francisco de Assis. </w:t>
+            </w:r>
+            <w:r>
+              <w:rPr>
+                <w:b/>
+                <w:sz w:val="18"/>
+              </w:rPr>
+              <w:t>Fundamentos de limnologia</w:t>
+            </w:r>
+            <w:r>
+              <w:rPr>
+                <w:sz w:val="18"/>
+              </w:rPr>
+              <w:t>. 3.ed. Rio de Janeiro: Interciência, 2011.</w:t>
             </w:r>
           </w:p>
           <w:p>
@@ -3065,7 +3312,20 @@
               <w:rPr>
                 <w:sz w:val="18"/>
               </w:rPr>
-              <w:t>MENDONÇA, Francisco; DANNI-OLIVEIRA, Inês Moresco. Climatologia: noções básicas e climas do Brasil. São Paulo: Oficina de Textos, 2007.</w:t>
+              <w:t xml:space="preserve">MENDONÇA, Francisco; DANNI-OLIVEIRA, Inês Moresco. </w:t>
+            </w:r>
+            <w:r>
+              <w:rPr>
+                <w:b/>
+                <w:sz w:val="18"/>
+              </w:rPr>
+              <w:t>Climatologia: noções básicas e climas do Brasil</w:t>
+            </w:r>
+            <w:r>
+              <w:rPr>
+                <w:sz w:val="18"/>
+              </w:rPr>
+              <w:t>. São Paulo: Oficina de Textos, 2007.</w:t>
             </w:r>
           </w:p>
           <w:p>
@@ -3076,7 +3336,20 @@
               <w:rPr>
                 <w:sz w:val="18"/>
               </w:rPr>
-              <w:t>POPP, José Henrique. Geologia geral. 6. ed. Rio de Janeiro: LTC, 2010.</w:t>
+              <w:t xml:space="preserve">POPP, José Henrique. </w:t>
+            </w:r>
+            <w:r>
+              <w:rPr>
+                <w:b/>
+                <w:sz w:val="18"/>
+              </w:rPr>
+              <w:t>Geologia geral</w:t>
+            </w:r>
+            <w:r>
+              <w:rPr>
+                <w:sz w:val="18"/>
+              </w:rPr>
+              <w:t>. 6. ed. Rio de Janeiro: LTC, 2010.</w:t>
             </w:r>
           </w:p>
           <w:p>
@@ -3087,7 +3360,20 @@
               <w:rPr>
                 <w:sz w:val="18"/>
               </w:rPr>
-              <w:t>GROTZINGER, John; JORDAN, Thomas H. Para entender a terra. 6. ed. Porto Alegre: Bookman, 2013.</w:t>
+              <w:t xml:space="preserve">GROTZINGER, John; JORDAN, Thomas H. </w:t>
+            </w:r>
+            <w:r>
+              <w:rPr>
+                <w:b/>
+                <w:sz w:val="18"/>
+              </w:rPr>
+              <w:t>Para entender a terra</w:t>
+            </w:r>
+            <w:r>
+              <w:rPr>
+                <w:sz w:val="18"/>
+              </w:rPr>
+              <w:t>. 6. ed. Porto Alegre: Bookman, 2013.</w:t>
             </w:r>
           </w:p>
           <w:p>
@@ -3098,7 +3384,20 @@
               <w:rPr>
                 <w:sz w:val="18"/>
               </w:rPr>
-              <w:t>TROPPMAIR, Helmut. Biogeografia e meio ambiente. 9. ed. Rio de Janeiro: Technical Books, 2012.</w:t>
+              <w:t xml:space="preserve">TROPPMAIR, Helmut. </w:t>
+            </w:r>
+            <w:r>
+              <w:rPr>
+                <w:b/>
+                <w:sz w:val="18"/>
+              </w:rPr>
+              <w:t>Biogeografia e meio ambiente</w:t>
+            </w:r>
+            <w:r>
+              <w:rPr>
+                <w:sz w:val="18"/>
+              </w:rPr>
+              <w:t>. 9. ed. Rio de Janeiro: Technical Books, 2012.</w:t>
             </w:r>
           </w:p>
         </w:tc>
@@ -3528,7 +3827,20 @@
               <w:rPr>
                 <w:sz w:val="18"/>
               </w:rPr>
-              <w:t>DUARTE, Regina Horta. História &amp; natureza. 2. ed. Belo Horizonte: Autêntica, 2013. 109 p., il. (História &amp;- reflexões; 9). Bibliografia: p. 104-108. ISBN 9788575261590.</w:t>
+              <w:t xml:space="preserve">DUARTE, Regina Horta. </w:t>
+            </w:r>
+            <w:r>
+              <w:rPr>
+                <w:b/>
+                <w:sz w:val="18"/>
+              </w:rPr>
+              <w:t>História &amp; natureza</w:t>
+            </w:r>
+            <w:r>
+              <w:rPr>
+                <w:sz w:val="18"/>
+              </w:rPr>
+              <w:t>. 2. ed. Belo Horizonte: Autêntica, 2013. 109 p., il. (História &amp;- reflexões; 9). Bibliografia: p. 104-108. ISBN 9788575261590.</w:t>
             </w:r>
           </w:p>
           <w:p>
@@ -3539,7 +3851,20 @@
               <w:rPr>
                 <w:sz w:val="18"/>
               </w:rPr>
-              <w:t>DEAN, Warren. A ferro e fogo: a história e a devastação da Mata Atlântica brasileira. Tradução de Cid Knipel Moreira Moreira. São Paulo: Companhia das Letras, 1996. 484 p. ISBN 9788571645905.</w:t>
+              <w:t xml:space="preserve">DEAN, Warren. </w:t>
+            </w:r>
+            <w:r>
+              <w:rPr>
+                <w:b/>
+                <w:sz w:val="18"/>
+              </w:rPr>
+              <w:t>A ferro e fogo: a história e a devastação da Mata Atlântica brasileira</w:t>
+            </w:r>
+            <w:r>
+              <w:rPr>
+                <w:sz w:val="18"/>
+              </w:rPr>
+              <w:t>. Tradução de Cid Knipel Moreira Moreira. São Paulo: Companhia das Letras, 1996. 484 p. ISBN 9788571645905.</w:t>
             </w:r>
           </w:p>
           <w:p>
@@ -3550,7 +3875,20 @@
               <w:rPr>
                 <w:sz w:val="18"/>
               </w:rPr>
-              <w:t>WORSTER, Donald. Transformações da terra: para uma perspectiva agroecológica da história. Ambiente e Sociedade, v. 5, no 2, ago./dez. 2002 – v. 6, no 1, jan.-jul. 2003, p. 23-44.</w:t>
+              <w:t xml:space="preserve">WORSTER, Donald. </w:t>
+            </w:r>
+            <w:r>
+              <w:rPr>
+                <w:b/>
+                <w:sz w:val="18"/>
+              </w:rPr>
+              <w:t>Transformações da terra: para uma perspectiva agroecológica da história</w:t>
+            </w:r>
+            <w:r>
+              <w:rPr>
+                <w:sz w:val="18"/>
+              </w:rPr>
+              <w:t>. Ambiente e Sociedade, v. 5, no 2, ago./dez. 2002 – v. 6, no 1, jan.-jul. 2003, p. 23-44.</w:t>
             </w:r>
           </w:p>
         </w:tc>
@@ -3586,7 +3924,20 @@
               <w:rPr>
                 <w:sz w:val="18"/>
               </w:rPr>
-              <w:t>CARSON, Rachel. Primavera silenciosa. São Paulo: Gaia, 2010.</w:t>
+              <w:t xml:space="preserve">CARSON, Rachel. </w:t>
+            </w:r>
+            <w:r>
+              <w:rPr>
+                <w:b/>
+                <w:sz w:val="18"/>
+              </w:rPr>
+              <w:t>Primavera silenciosa</w:t>
+            </w:r>
+            <w:r>
+              <w:rPr>
+                <w:sz w:val="18"/>
+              </w:rPr>
+              <w:t>. São Paulo: Gaia, 2010.</w:t>
             </w:r>
           </w:p>
           <w:p>
@@ -3597,7 +3948,20 @@
               <w:rPr>
                 <w:sz w:val="18"/>
               </w:rPr>
-              <w:t>CROSBY, Alfred W. Imperialismo ecológico: a expansão biológica da Europa, 900-1900. São Paulo: Companhia das Letras, 2011.</w:t>
+              <w:t xml:space="preserve">CROSBY, Alfred W. </w:t>
+            </w:r>
+            <w:r>
+              <w:rPr>
+                <w:b/>
+                <w:sz w:val="18"/>
+              </w:rPr>
+              <w:t>Imperialismo ecológico: a expansão biológica da Europa, 900-1900</w:t>
+            </w:r>
+            <w:r>
+              <w:rPr>
+                <w:sz w:val="18"/>
+              </w:rPr>
+              <w:t>. São Paulo: Companhia das Letras, 2011.</w:t>
             </w:r>
           </w:p>
           <w:p>
@@ -3608,7 +3972,20 @@
               <w:rPr>
                 <w:sz w:val="18"/>
               </w:rPr>
-              <w:t>LEOPOLD, Aldo. Pensar como uma montanha. Curitiba: Editora UFPR, 2014.</w:t>
+              <w:t xml:space="preserve">LEOPOLD, Aldo. </w:t>
+            </w:r>
+            <w:r>
+              <w:rPr>
+                <w:b/>
+                <w:sz w:val="18"/>
+              </w:rPr>
+              <w:t>Pensar como uma montanha</w:t>
+            </w:r>
+            <w:r>
+              <w:rPr>
+                <w:sz w:val="18"/>
+              </w:rPr>
+              <w:t>. Curitiba: Editora UFPR, 2014.</w:t>
             </w:r>
           </w:p>
           <w:p>
@@ -3619,7 +3996,20 @@
               <w:rPr>
                 <w:sz w:val="18"/>
               </w:rPr>
-              <w:t>LUTZENBERGER, José A. Fim do futuro? Manifesto ecológico brasileiro. Porto Alegre: Movimento, 1976. McNEILL, John R. Something New Under the Sun: An Environmental History of the Twentieth-Century World. New York/London: W. W. Norton, 2000.</w:t>
+              <w:t xml:space="preserve">LUTZENBERGER, José A. </w:t>
+            </w:r>
+            <w:r>
+              <w:rPr>
+                <w:b/>
+                <w:sz w:val="18"/>
+              </w:rPr>
+              <w:t>Fim do futuro? Manifesto ecológico brasileiro</w:t>
+            </w:r>
+            <w:r>
+              <w:rPr>
+                <w:sz w:val="18"/>
+              </w:rPr>
+              <w:t>. Porto Alegre: Movimento, 1976. McNEILL, John R. Something New Under the Sun: An Environmental History of the Twentieth-Century World. New York/London: W. W. Norton, 2000.</w:t>
             </w:r>
           </w:p>
           <w:p>
@@ -3630,7 +4020,20 @@
               <w:rPr>
                 <w:sz w:val="18"/>
               </w:rPr>
-              <w:t>PÁDUA, José Augusto (org.). Ecologia e política no Brasil. Rio de Janeiro: Iuperj; Espaço e Tempo, 1987.</w:t>
+              <w:t xml:space="preserve">PÁDUA, José Augusto (org.). </w:t>
+            </w:r>
+            <w:r>
+              <w:rPr>
+                <w:b/>
+                <w:sz w:val="18"/>
+              </w:rPr>
+              <w:t>Ecologia e política no Brasil</w:t>
+            </w:r>
+            <w:r>
+              <w:rPr>
+                <w:sz w:val="18"/>
+              </w:rPr>
+              <w:t>. Rio de Janeiro: Iuperj; Espaço e Tempo, 1987.</w:t>
             </w:r>
           </w:p>
           <w:p>
@@ -3641,7 +4044,20 @@
               <w:rPr>
                 <w:sz w:val="18"/>
               </w:rPr>
-              <w:t>SEDREZ, Lise Fernanda. História ambiental: possibilidades e desafios. In: CARDOSO, Ciro Flamarion; VAINFAS, Ronaldo (org.). Novos domínios da História. Rio de Janeiro: Elsevier, 2012.</w:t>
+              <w:t xml:space="preserve">SEDREZ, Lise Fernanda. História ambiental: possibilidades e desafios. In: CARDOSO, Ciro Flamarion; VAINFAS, Ronaldo (org.). </w:t>
+            </w:r>
+            <w:r>
+              <w:rPr>
+                <w:b/>
+                <w:sz w:val="18"/>
+              </w:rPr>
+              <w:t>Novos domínios da História</w:t>
+            </w:r>
+            <w:r>
+              <w:rPr>
+                <w:sz w:val="18"/>
+              </w:rPr>
+              <w:t>. Rio de Janeiro: Elsevier, 2012.</w:t>
             </w:r>
           </w:p>
           <w:p>
@@ -3652,7 +4068,20 @@
               <w:rPr>
                 <w:sz w:val="18"/>
               </w:rPr>
-              <w:t>STOLL, Mark. Lucro: uma história ambiental. Lisboa: Edições 70, 2023.</w:t>
+              <w:t xml:space="preserve">STOLL, Mark. </w:t>
+            </w:r>
+            <w:r>
+              <w:rPr>
+                <w:b/>
+                <w:sz w:val="18"/>
+              </w:rPr>
+              <w:t>Lucro: uma história ambiental</w:t>
+            </w:r>
+            <w:r>
+              <w:rPr>
+                <w:sz w:val="18"/>
+              </w:rPr>
+              <w:t>. Lisboa: Edições 70, 2023.</w:t>
             </w:r>
           </w:p>
           <w:p>
@@ -3663,7 +4092,20 @@
               <w:rPr>
                 <w:sz w:val="18"/>
               </w:rPr>
-              <w:t>VEIGA, José E. Desenvolvimento sustentável: o desafio do século XXI. Rio de Janeiro: Garamond, 2006.</w:t>
+              <w:t xml:space="preserve">VEIGA, José E. </w:t>
+            </w:r>
+            <w:r>
+              <w:rPr>
+                <w:b/>
+                <w:sz w:val="18"/>
+              </w:rPr>
+              <w:t>Desenvolvimento sustentável: o desafio do século XXI</w:t>
+            </w:r>
+            <w:r>
+              <w:rPr>
+                <w:sz w:val="18"/>
+              </w:rPr>
+              <w:t>. Rio de Janeiro: Garamond, 2006.</w:t>
             </w:r>
           </w:p>
         </w:tc>
@@ -4115,7 +4557,20 @@
               <w:rPr>
                 <w:sz w:val="18"/>
               </w:rPr>
-              <w:t>BLIKSTEIN, Izidoro. Técnicas de comunicação escrita. 22. ed. São Paulo: Ática, 2010. (Princípios, 12).</w:t>
+              <w:t xml:space="preserve">BLIKSTEIN, Izidoro. </w:t>
+            </w:r>
+            <w:r>
+              <w:rPr>
+                <w:b/>
+                <w:sz w:val="18"/>
+              </w:rPr>
+              <w:t>Técnicas de comunicação escrita</w:t>
+            </w:r>
+            <w:r>
+              <w:rPr>
+                <w:sz w:val="18"/>
+              </w:rPr>
+              <w:t>. 22. ed. São Paulo: Ática, 2010. (Princípios, 12).</w:t>
             </w:r>
           </w:p>
           <w:p>
@@ -4126,7 +4581,20 @@
               <w:rPr>
                 <w:sz w:val="18"/>
               </w:rPr>
-              <w:t>GARCIA, Othon M. Comunicação em prosa moderna: aprenda a escrever aprendendo a pensar. 24. ed. Rio de Janeiro: FGV, 2004.</w:t>
+              <w:t xml:space="preserve">GARCIA, Othon M. </w:t>
+            </w:r>
+            <w:r>
+              <w:rPr>
+                <w:b/>
+                <w:sz w:val="18"/>
+              </w:rPr>
+              <w:t>Comunicação em prosa moderna: aprenda a escrever aprendendo a pensar</w:t>
+            </w:r>
+            <w:r>
+              <w:rPr>
+                <w:sz w:val="18"/>
+              </w:rPr>
+              <w:t>. 24. ed. Rio de Janeiro: FGV, 2004.</w:t>
             </w:r>
           </w:p>
         </w:tc>
@@ -4162,7 +4630,20 @@
               <w:rPr>
                 <w:sz w:val="18"/>
               </w:rPr>
-              <w:t>KOCH, Ingedore Grunfeld Villaça. A coesão textual. 27. ed. São Paulo: Contexto, 2007.</w:t>
+              <w:t xml:space="preserve">KOCH, Ingedore Grunfeld Villaça. </w:t>
+            </w:r>
+            <w:r>
+              <w:rPr>
+                <w:b/>
+                <w:sz w:val="18"/>
+              </w:rPr>
+              <w:t>A coesão textual</w:t>
+            </w:r>
+            <w:r>
+              <w:rPr>
+                <w:sz w:val="18"/>
+              </w:rPr>
+              <w:t>. 27. ed. São Paulo: Contexto, 2007.</w:t>
             </w:r>
           </w:p>
           <w:p>
@@ -4173,7 +4654,20 @@
               <w:rPr>
                 <w:sz w:val="18"/>
               </w:rPr>
-              <w:t>LOUSADA, Eliane; ABREU-TARDELLI, Lília Santos. Resenha. São Paulo: Parábola, 2004.</w:t>
+              <w:t xml:space="preserve">LOUSADA, Eliane; ABREU-TARDELLI, Lília Santos. </w:t>
+            </w:r>
+            <w:r>
+              <w:rPr>
+                <w:b/>
+                <w:sz w:val="18"/>
+              </w:rPr>
+              <w:t>Resenha</w:t>
+            </w:r>
+            <w:r>
+              <w:rPr>
+                <w:sz w:val="18"/>
+              </w:rPr>
+              <w:t>. São Paulo: Parábola, 2004.</w:t>
             </w:r>
           </w:p>
           <w:p>
@@ -4184,7 +4678,20 @@
               <w:rPr>
                 <w:sz w:val="18"/>
               </w:rPr>
-              <w:t>LOUSADA, Eliane; ABREU-TARDELLI, Lília Santos. Resumo. 7. ed. São Paulo: Parábola, 2004.</w:t>
+              <w:t xml:space="preserve">LOUSADA, Eliane; ABREU-TARDELLI, Lília Santos. </w:t>
+            </w:r>
+            <w:r>
+              <w:rPr>
+                <w:b/>
+                <w:sz w:val="18"/>
+              </w:rPr>
+              <w:t>Resumo</w:t>
+            </w:r>
+            <w:r>
+              <w:rPr>
+                <w:sz w:val="18"/>
+              </w:rPr>
+              <w:t>. 7. ed. São Paulo: Parábola, 2004.</w:t>
             </w:r>
           </w:p>
           <w:p>
@@ -4195,7 +4702,20 @@
               <w:rPr>
                 <w:sz w:val="18"/>
               </w:rPr>
-              <w:t>PEREIRA, Maurício Gomes. Artigos científicos: como redigir, publicar e avaliar. Rio de Janeiro: Guanabara Koogan, 2011.</w:t>
+              <w:t xml:space="preserve">PEREIRA, Maurício Gomes. </w:t>
+            </w:r>
+            <w:r>
+              <w:rPr>
+                <w:b/>
+                <w:sz w:val="18"/>
+              </w:rPr>
+              <w:t>Artigos científicos: como redigir, publicar e avaliar</w:t>
+            </w:r>
+            <w:r>
+              <w:rPr>
+                <w:sz w:val="18"/>
+              </w:rPr>
+              <w:t>. Rio de Janeiro: Guanabara Koogan, 2011.</w:t>
             </w:r>
           </w:p>
         </w:tc>
@@ -4614,7 +5134,20 @@
               <w:rPr>
                 <w:sz w:val="18"/>
               </w:rPr>
-              <w:t>MARCONI, Marina de Andrade; LAKATOS, Eva Maria. Metodologia do trabalho científico: procedimentos básicos, pesquisa bibliográfica, projeto e relatório, publicações e trabalhos científicos. 7. ed. rev. e ampl. São Paulo: Atlas, 2007.</w:t>
+              <w:t xml:space="preserve">MARCONI, Marina de Andrade; LAKATOS, Eva Maria. </w:t>
+            </w:r>
+            <w:r>
+              <w:rPr>
+                <w:b/>
+                <w:sz w:val="18"/>
+              </w:rPr>
+              <w:t>Metodologia do trabalho científico: procedimentos básicos, pesquisa bibliográfica, projeto e relatório, publicações e trabalhos científicos</w:t>
+            </w:r>
+            <w:r>
+              <w:rPr>
+                <w:sz w:val="18"/>
+              </w:rPr>
+              <w:t>. 7. ed. rev. e ampl. São Paulo: Atlas, 2007.</w:t>
             </w:r>
           </w:p>
           <w:p>
@@ -4625,7 +5158,20 @@
               <w:rPr>
                 <w:sz w:val="18"/>
               </w:rPr>
-              <w:t>PEREIRA, Maurício Gomes. Artigos científicos: como redigir, publicar e avaliar. Rio de Janeiro: Guanabara Koogan, 2012.</w:t>
+              <w:t xml:space="preserve">PEREIRA, Maurício Gomes. </w:t>
+            </w:r>
+            <w:r>
+              <w:rPr>
+                <w:b/>
+                <w:sz w:val="18"/>
+              </w:rPr>
+              <w:t>Artigos científicos: como redigir, publicar e avaliar</w:t>
+            </w:r>
+            <w:r>
+              <w:rPr>
+                <w:sz w:val="18"/>
+              </w:rPr>
+              <w:t>. Rio de Janeiro: Guanabara Koogan, 2012.</w:t>
             </w:r>
           </w:p>
         </w:tc>
@@ -4661,7 +5207,20 @@
               <w:rPr>
                 <w:sz w:val="18"/>
               </w:rPr>
-              <w:t>DESCARTES, René; GILSON, Étienne. Discurso do método. 4. ed. São Paulo: WMF Martins Fontes, 2009. (Clássicos WMF).</w:t>
+              <w:t xml:space="preserve">DESCARTES, René; GILSON, Étienne. </w:t>
+            </w:r>
+            <w:r>
+              <w:rPr>
+                <w:b/>
+                <w:sz w:val="18"/>
+              </w:rPr>
+              <w:t>Discurso do método</w:t>
+            </w:r>
+            <w:r>
+              <w:rPr>
+                <w:sz w:val="18"/>
+              </w:rPr>
+              <w:t>. 4. ed. São Paulo: WMF Martins Fontes, 2009. (Clássicos WMF).</w:t>
             </w:r>
           </w:p>
           <w:p>
@@ -4672,7 +5231,20 @@
               <w:rPr>
                 <w:sz w:val="18"/>
               </w:rPr>
-              <w:t>LOUSADA, Eliane; ABREU-TARDELLI, Lília Santos (Org.). Trabalhos de pesquisa: diários de leitura para a revisão bibliográfica. São Paulo: Parábola Editorial, 2007. (Leitura e produção de textos técnicos e acadêmicos, 4).</w:t>
+              <w:t xml:space="preserve">LOUSADA, Eliane; ABREU-TARDELLI, Lília Santos (Org.). </w:t>
+            </w:r>
+            <w:r>
+              <w:rPr>
+                <w:b/>
+                <w:sz w:val="18"/>
+              </w:rPr>
+              <w:t>Trabalhos de pesquisa: diários de leitura para a revisão bibliográfica</w:t>
+            </w:r>
+            <w:r>
+              <w:rPr>
+                <w:sz w:val="18"/>
+              </w:rPr>
+              <w:t>. São Paulo: Parábola Editorial, 2007. (Leitura e produção de textos técnicos e acadêmicos, 4).</w:t>
             </w:r>
           </w:p>
           <w:p>
@@ -4683,7 +5255,20 @@
               <w:rPr>
                 <w:sz w:val="18"/>
               </w:rPr>
-              <w:t>MATTAR, João. Metodologia científica na era da informática. 3. ed. rev. e atual. São Paulo: Saraiva, 2008.</w:t>
+              <w:t xml:space="preserve">MATTAR, João. </w:t>
+            </w:r>
+            <w:r>
+              <w:rPr>
+                <w:b/>
+                <w:sz w:val="18"/>
+              </w:rPr>
+              <w:t>Metodologia científica na era da informática</w:t>
+            </w:r>
+            <w:r>
+              <w:rPr>
+                <w:sz w:val="18"/>
+              </w:rPr>
+              <w:t>. 3. ed. rev. e atual. São Paulo: Saraiva, 2008.</w:t>
             </w:r>
           </w:p>
         </w:tc>
@@ -5102,7 +5687,20 @@
               <w:rPr>
                 <w:sz w:val="18"/>
               </w:rPr>
-              <w:t>BARBOSA FILHO, Antonio Nunes. Segurança do trabalho e gestão ambiental. 4. ed. São Paulo: Atlas, 2011.</w:t>
+              <w:t xml:space="preserve">BARBOSA FILHO, Antonio Nunes. </w:t>
+            </w:r>
+            <w:r>
+              <w:rPr>
+                <w:b/>
+                <w:sz w:val="18"/>
+              </w:rPr>
+              <w:t>Segurança do trabalho e gestão ambiental</w:t>
+            </w:r>
+            <w:r>
+              <w:rPr>
+                <w:sz w:val="18"/>
+              </w:rPr>
+              <w:t>. 4. ed. São Paulo: Atlas, 2011.</w:t>
             </w:r>
           </w:p>
           <w:p>
@@ -5113,7 +5711,20 @@
               <w:rPr>
                 <w:sz w:val="18"/>
               </w:rPr>
-              <w:t>CARDELLA, Benedito. Segurança no trabalho e prevenção de acidentes: uma abordagem holística: segurança integrada à missão organizacional com produtividade, qualidade, preservação ambiental e desenvolvimento de pessoas. São Paulo: Atlas, 2010</w:t>
+              <w:t xml:space="preserve">CARDELLA, Benedito. </w:t>
+            </w:r>
+            <w:r>
+              <w:rPr>
+                <w:b/>
+                <w:sz w:val="18"/>
+              </w:rPr>
+              <w:t>Segurança no trabalho e prevenção de acidentes: uma abordagem holística: segurança integrada à missão organizacional com produtividade, qualidade, preservação ambiental e desenvolvimento de pessoas</w:t>
+            </w:r>
+            <w:r>
+              <w:rPr>
+                <w:sz w:val="18"/>
+              </w:rPr>
+              <w:t>. São Paulo: Atlas, 2010</w:t>
             </w:r>
           </w:p>
         </w:tc>
@@ -5149,7 +5760,20 @@
               <w:rPr>
                 <w:sz w:val="18"/>
               </w:rPr>
-              <w:t>BERGERON, J. David. Primeiros socorros. 2. ed. São Paulo: Atheneu, 2007.</w:t>
+              <w:t xml:space="preserve">BERGERON, J. David. </w:t>
+            </w:r>
+            <w:r>
+              <w:rPr>
+                <w:b/>
+                <w:sz w:val="18"/>
+              </w:rPr>
+              <w:t>Primeiros socorros</w:t>
+            </w:r>
+            <w:r>
+              <w:rPr>
+                <w:sz w:val="18"/>
+              </w:rPr>
+              <w:t>. 2. ed. São Paulo: Atheneu, 2007.</w:t>
             </w:r>
           </w:p>
           <w:p>
@@ -5160,7 +5784,20 @@
               <w:rPr>
                 <w:sz w:val="18"/>
               </w:rPr>
-              <w:t>BRASIL. Ministério do trabalho. Normas Regulamentadoras. Disponível em: &lt;http://trabalho.gov.br/seguranca-e-saude-no-trabalho/normatizacao/normas-regulamentadoras&gt;. Acesso em: 27 ago. 2018.</w:t>
+              <w:t xml:space="preserve">BRASIL. </w:t>
+            </w:r>
+            <w:r>
+              <w:rPr>
+                <w:b/>
+                <w:sz w:val="18"/>
+              </w:rPr>
+              <w:t>Ministério do trabalho</w:t>
+            </w:r>
+            <w:r>
+              <w:rPr>
+                <w:sz w:val="18"/>
+              </w:rPr>
+              <w:t>. Normas Regulamentadoras. Disponível em: &lt;http://trabalho.gov.br/seguranca-e-saude-no-trabalho/normatizacao/normas-regulamentadoras&gt;. Acesso em: 27 ago. 2018.</w:t>
             </w:r>
           </w:p>
           <w:p>
@@ -5171,7 +5808,20 @@
               <w:rPr>
                 <w:sz w:val="18"/>
               </w:rPr>
-              <w:t>GONÇALVES, Danielle Carvalho; GONÇALVES, Isabelle Carvalho; GONÇALVES, Edwar Abreu. Manual de segurança e saúde no trabalho. 6. ed. São Paulo: LTR, 2015.</w:t>
+              <w:t xml:space="preserve">GONÇALVES, Danielle Carvalho; GONÇALVES, Isabelle Carvalho; GONÇALVES, Edwar Abreu. </w:t>
+            </w:r>
+            <w:r>
+              <w:rPr>
+                <w:b/>
+                <w:sz w:val="18"/>
+              </w:rPr>
+              <w:t>Manual de segurança e saúde no trabalho</w:t>
+            </w:r>
+            <w:r>
+              <w:rPr>
+                <w:sz w:val="18"/>
+              </w:rPr>
+              <w:t>. 6. ed. São Paulo: LTR, 2015.</w:t>
             </w:r>
           </w:p>
         </w:tc>
@@ -5657,7 +6307,20 @@
               <w:rPr>
                 <w:sz w:val="18"/>
               </w:rPr>
-              <w:t>LOUREIRO, Carlos Frederico. Questão ambiental: questões de vida. São Paulo: Cortez, 2019.</w:t>
+              <w:t xml:space="preserve">LOUREIRO, Carlos Frederico. </w:t>
+            </w:r>
+            <w:r>
+              <w:rPr>
+                <w:b/>
+                <w:sz w:val="18"/>
+              </w:rPr>
+              <w:t>Questão ambiental: questões de vida</w:t>
+            </w:r>
+            <w:r>
+              <w:rPr>
+                <w:sz w:val="18"/>
+              </w:rPr>
+              <w:t>. São Paulo: Cortez, 2019.</w:t>
             </w:r>
           </w:p>
           <w:p>
@@ -5668,7 +6331,20 @@
               <w:rPr>
                 <w:sz w:val="18"/>
               </w:rPr>
-              <w:t>REIGOTA, Marcos. O que é educação ambiental. 2. ed. São Paulo: Brasiliense, 2009. 107 p. (Primeiros passos, 292). ISBN 9788511001228.</w:t>
+              <w:t xml:space="preserve">REIGOTA, Marcos. </w:t>
+            </w:r>
+            <w:r>
+              <w:rPr>
+                <w:b/>
+                <w:sz w:val="18"/>
+              </w:rPr>
+              <w:t>O que é educação ambiental</w:t>
+            </w:r>
+            <w:r>
+              <w:rPr>
+                <w:sz w:val="18"/>
+              </w:rPr>
+              <w:t>. 2. ed. São Paulo: Brasiliense, 2009. 107 p. (Primeiros passos, 292). ISBN 9788511001228.</w:t>
             </w:r>
           </w:p>
         </w:tc>
@@ -5704,7 +6380,20 @@
               <w:rPr>
                 <w:sz w:val="18"/>
               </w:rPr>
-              <w:t>CARVALHO, Isabel Cristina de Moura. Educação ambiental: a formação do sujeito ecológico. 6. ed. São Paulo: Cortez, 2012. 255 p. (Docência em formação. Saberes Pedagógicos). ISBN 9788524919725.</w:t>
+              <w:t xml:space="preserve">CARVALHO, Isabel Cristina de Moura. </w:t>
+            </w:r>
+            <w:r>
+              <w:rPr>
+                <w:b/>
+                <w:sz w:val="18"/>
+              </w:rPr>
+              <w:t>Educação ambiental: a formação do sujeito ecológico</w:t>
+            </w:r>
+            <w:r>
+              <w:rPr>
+                <w:sz w:val="18"/>
+              </w:rPr>
+              <w:t>. 6. ed. São Paulo: Cortez, 2012. 255 p. (Docência em formação. Saberes Pedagógicos). ISBN 9788524919725.</w:t>
             </w:r>
           </w:p>
           <w:p>
@@ -5715,7 +6404,20 @@
               <w:rPr>
                 <w:sz w:val="18"/>
               </w:rPr>
-              <w:t>COIMBRA, José de Ávila Aguiar, 1930- (coord.). Meio ambiente e consumismo. São Paulo: Senac São Paulo, 2008. 254 p. (Meio ambiente, 8). ISBN 9788573596755.</w:t>
+              <w:t xml:space="preserve">COIMBRA, José de Ávila Aguiar, 1930- (coord.). </w:t>
+            </w:r>
+            <w:r>
+              <w:rPr>
+                <w:b/>
+                <w:sz w:val="18"/>
+              </w:rPr>
+              <w:t>Meio ambiente e consumismo</w:t>
+            </w:r>
+            <w:r>
+              <w:rPr>
+                <w:sz w:val="18"/>
+              </w:rPr>
+              <w:t>. São Paulo: Senac São Paulo, 2008. 254 p. (Meio ambiente, 8). ISBN 9788573596755.</w:t>
             </w:r>
           </w:p>
           <w:p>
@@ -5726,7 +6428,20 @@
               <w:rPr>
                 <w:sz w:val="18"/>
               </w:rPr>
-              <w:t>GUATTARI, Félix. As três ecologias. 21. ed. Campinas, SP: Papirus, 2012. 56 p. ISBN 8530801067. GRÜN, Mauro. Ética e educação ambiental: a conexão necessária. 14. ed. São Paulo: Papirus, 2011. 126 p., 21 cm. (Magistério: formação e trabalho pedagógico). Bibliografia: p. 121-126. ISBN 8530804333.</w:t>
+              <w:t xml:space="preserve">GUATTARI, Félix. </w:t>
+            </w:r>
+            <w:r>
+              <w:rPr>
+                <w:b/>
+                <w:sz w:val="18"/>
+              </w:rPr>
+              <w:t>As três ecologias</w:t>
+            </w:r>
+            <w:r>
+              <w:rPr>
+                <w:sz w:val="18"/>
+              </w:rPr>
+              <w:t>. 21. ed. Campinas, SP: Papirus, 2012. 56 p. ISBN 8530801067. GRÜN, Mauro. Ética e educação ambiental: a conexão necessária. 14. ed. São Paulo: Papirus, 2011. 126 p., 21 cm. (Magistério: formação e trabalho pedagógico). Bibliografia: p. 121-126. ISBN 8530804333.</w:t>
             </w:r>
           </w:p>
         </w:tc>
@@ -6277,7 +6992,20 @@
               <w:rPr>
                 <w:sz w:val="18"/>
               </w:rPr>
-              <w:t>DIAS, Reinaldo; ZAVAGLIA, Tércia; CASSAR, Maurício. Introdução à administração: da competitividade à sustentabilidade. 3. ed. rev. Campinas, SP: Alínea, 2013.</w:t>
+              <w:t xml:space="preserve">DIAS, Reinaldo; ZAVAGLIA, Tércia; CASSAR, Maurício. </w:t>
+            </w:r>
+            <w:r>
+              <w:rPr>
+                <w:b/>
+                <w:sz w:val="18"/>
+              </w:rPr>
+              <w:t>Introdução à administração: da competitividade à sustentabilidade</w:t>
+            </w:r>
+            <w:r>
+              <w:rPr>
+                <w:sz w:val="18"/>
+              </w:rPr>
+              <w:t>. 3. ed. rev. Campinas, SP: Alínea, 2013.</w:t>
             </w:r>
           </w:p>
           <w:p>
@@ -6288,7 +7016,20 @@
               <w:rPr>
                 <w:sz w:val="18"/>
               </w:rPr>
-              <w:t>DIAS, Reinaldo. Gestão ambiental: responsabilidade social e sustentabilidade. 3. ed. São Paulo: Atlas, 2017.</w:t>
+              <w:t xml:space="preserve">DIAS, Reinaldo. </w:t>
+            </w:r>
+            <w:r>
+              <w:rPr>
+                <w:b/>
+                <w:sz w:val="18"/>
+              </w:rPr>
+              <w:t>Gestão ambiental: responsabilidade social e sustentabilidade</w:t>
+            </w:r>
+            <w:r>
+              <w:rPr>
+                <w:sz w:val="18"/>
+              </w:rPr>
+              <w:t>. 3. ed. São Paulo: Atlas, 2017.</w:t>
             </w:r>
           </w:p>
           <w:p>
@@ -6299,7 +7040,20 @@
               <w:rPr>
                 <w:sz w:val="18"/>
               </w:rPr>
-              <w:t>LACOMBE, F. J. M.; HEILBORN, G. L. J. Administração: princípios e tendências. 3. ed. São Paulo: Saraiva, 2015.</w:t>
+              <w:t xml:space="preserve">LACOMBE, F. J. M.; HEILBORN, G. L. J. </w:t>
+            </w:r>
+            <w:r>
+              <w:rPr>
+                <w:b/>
+                <w:sz w:val="18"/>
+              </w:rPr>
+              <w:t>Administração: princípios e tendências</w:t>
+            </w:r>
+            <w:r>
+              <w:rPr>
+                <w:sz w:val="18"/>
+              </w:rPr>
+              <w:t>. 3. ed. São Paulo: Saraiva, 2015.</w:t>
             </w:r>
           </w:p>
         </w:tc>
@@ -6335,7 +7089,20 @@
               <w:rPr>
                 <w:sz w:val="18"/>
               </w:rPr>
-              <w:t>ALIGLERI, L.; ALIGLERI, L. A.; KRUGLIANSKAS, I. Gestão Socioambiental: responsabilidade e sustentabilidade dos negócios. São Paulo: Atlas, 2009.</w:t>
+              <w:t xml:space="preserve">ALIGLERI, L.; ALIGLERI, L. A.; KRUGLIANSKAS, I. </w:t>
+            </w:r>
+            <w:r>
+              <w:rPr>
+                <w:b/>
+                <w:sz w:val="18"/>
+              </w:rPr>
+              <w:t>Gestão Socioambiental: responsabilidade e sustentabilidade dos negócios</w:t>
+            </w:r>
+            <w:r>
+              <w:rPr>
+                <w:sz w:val="18"/>
+              </w:rPr>
+              <w:t>. São Paulo: Atlas, 2009.</w:t>
             </w:r>
           </w:p>
           <w:p>
@@ -6346,7 +7113,20 @@
               <w:rPr>
                 <w:sz w:val="18"/>
               </w:rPr>
-              <w:t>BARBIERI, J. C. Gestão ambiental empresarial: conceitos, modelos e instrumentos. 3. ed. atual. e ampl.</w:t>
+              <w:t xml:space="preserve">BARBIERI, J. C. </w:t>
+            </w:r>
+            <w:r>
+              <w:rPr>
+                <w:b/>
+                <w:sz w:val="18"/>
+              </w:rPr>
+              <w:t>Gestão ambiental empresarial: conceitos, modelos e instrumentos</w:t>
+            </w:r>
+            <w:r>
+              <w:rPr>
+                <w:sz w:val="18"/>
+              </w:rPr>
+              <w:t>. 3. ed. atual. e ampl.</w:t>
             </w:r>
           </w:p>
           <w:p>
@@ -6357,7 +7137,20 @@
               <w:rPr>
                 <w:sz w:val="18"/>
               </w:rPr>
-              <w:t>DONAIRE, Denis; OLIVEIRA, Edenis Cesar de. Gestão ambiental na empresa: fundamentos e aplicações. 3. ed. São Paulo: Atlas, 2018.</w:t>
+              <w:t xml:space="preserve">DONAIRE, Denis; OLIVEIRA, Edenis Cesar de. </w:t>
+            </w:r>
+            <w:r>
+              <w:rPr>
+                <w:b/>
+                <w:sz w:val="18"/>
+              </w:rPr>
+              <w:t>Gestão ambiental na empresa: fundamentos e aplicações</w:t>
+            </w:r>
+            <w:r>
+              <w:rPr>
+                <w:sz w:val="18"/>
+              </w:rPr>
+              <w:t>. 3. ed. São Paulo: Atlas, 2018.</w:t>
             </w:r>
           </w:p>
           <w:p>
@@ -6368,7 +7161,20 @@
               <w:rPr>
                 <w:sz w:val="18"/>
               </w:rPr>
-              <w:t>MAXIMIANO, A. C. A. Introdução à administração. 8. ed. rev. e ampl. São Paulo: Atlas, 2008.</w:t>
+              <w:t xml:space="preserve">MAXIMIANO, A. C. A. </w:t>
+            </w:r>
+            <w:r>
+              <w:rPr>
+                <w:b/>
+                <w:sz w:val="18"/>
+              </w:rPr>
+              <w:t>Introdução à administração</w:t>
+            </w:r>
+            <w:r>
+              <w:rPr>
+                <w:sz w:val="18"/>
+              </w:rPr>
+              <w:t>. 8. ed. rev. e ampl. São Paulo: Atlas, 2008.</w:t>
             </w:r>
           </w:p>
         </w:tc>
@@ -6952,7 +7758,20 @@
               <w:rPr>
                 <w:sz w:val="18"/>
               </w:rPr>
-              <w:t>LOCH, Carlos. A interpretação de imagens aéreas: noções básicas e algumas aplicações nos campos profissionais. 5. ed. Florianópolis: Ed. da UFSC, 2008.</w:t>
+              <w:t xml:space="preserve">LOCH, Carlos. </w:t>
+            </w:r>
+            <w:r>
+              <w:rPr>
+                <w:b/>
+                <w:sz w:val="18"/>
+              </w:rPr>
+              <w:t>A interpretação de imagens aéreas: noções básicas e algumas aplicações nos campos profissionais</w:t>
+            </w:r>
+            <w:r>
+              <w:rPr>
+                <w:sz w:val="18"/>
+              </w:rPr>
+              <w:t>. 5. ed. Florianópolis: Ed. da UFSC, 2008.</w:t>
             </w:r>
           </w:p>
           <w:p>
@@ -6963,7 +7782,20 @@
               <w:rPr>
                 <w:sz w:val="18"/>
               </w:rPr>
-              <w:t>LONGLEY, Paul A. Sistemas e ciência da informação geográfica. 3. ed. Porto Alegre: Bookman, 2013.</w:t>
+              <w:t xml:space="preserve">LONGLEY, Paul A. </w:t>
+            </w:r>
+            <w:r>
+              <w:rPr>
+                <w:b/>
+                <w:sz w:val="18"/>
+              </w:rPr>
+              <w:t>Sistemas e ciência da informação geográfica</w:t>
+            </w:r>
+            <w:r>
+              <w:rPr>
+                <w:sz w:val="18"/>
+              </w:rPr>
+              <w:t>. 3. ed. Porto Alegre: Bookman, 2013.</w:t>
             </w:r>
           </w:p>
         </w:tc>
@@ -6999,7 +7831,20 @@
               <w:rPr>
                 <w:sz w:val="18"/>
               </w:rPr>
-              <w:t>CASSOL, R. et al. Comparação entre câmeras fotográficas digitais com GPS para aplicação em geotagging. In: XXV CONGRESSO BRASILEIRO DE CARTOGRAFIA, 2011, Curitiba. Anais... Curitiba, 2011. p. 412-419.</w:t>
+              <w:t xml:space="preserve">CASSOL, R. et al. </w:t>
+            </w:r>
+            <w:r>
+              <w:rPr>
+                <w:b/>
+                <w:sz w:val="18"/>
+              </w:rPr>
+              <w:t>Comparação entre câmeras fotográficas digitais com GPS para aplicação em geotagging</w:t>
+            </w:r>
+            <w:r>
+              <w:rPr>
+                <w:sz w:val="18"/>
+              </w:rPr>
+              <w:t>. In: XXV CONGRESSO BRASILEIRO DE CARTOGRAFIA, 2011, Curitiba. Anais... Curitiba, 2011. p. 412-419.</w:t>
             </w:r>
           </w:p>
           <w:p>
@@ -7010,7 +7855,20 @@
               <w:rPr>
                 <w:sz w:val="18"/>
               </w:rPr>
-              <w:t>FITZ, Paulo Roberto. Cartografia básica. São Paulo: Oficina de Textos, 2008. Geoprocessamento sem complicação. São Paulo: Oficina de Textos, 2008.</w:t>
+              <w:t xml:space="preserve">FITZ, Paulo Roberto. </w:t>
+            </w:r>
+            <w:r>
+              <w:rPr>
+                <w:b/>
+                <w:sz w:val="18"/>
+              </w:rPr>
+              <w:t>Cartografia básica</w:t>
+            </w:r>
+            <w:r>
+              <w:rPr>
+                <w:sz w:val="18"/>
+              </w:rPr>
+              <w:t>. São Paulo: Oficina de Textos, 2008. Geoprocessamento sem complicação. São Paulo: Oficina de Textos, 2008.</w:t>
             </w:r>
           </w:p>
           <w:p>
@@ -7021,7 +7879,20 @@
               <w:rPr>
                 <w:sz w:val="18"/>
               </w:rPr>
-              <w:t>MENEZES, Paulo Márcio Leal de. Roteiro de cartografia. São Paulo: Oficina de Textos, 2013.</w:t>
+              <w:t xml:space="preserve">MENEZES, Paulo Márcio Leal de. </w:t>
+            </w:r>
+            <w:r>
+              <w:rPr>
+                <w:b/>
+                <w:sz w:val="18"/>
+              </w:rPr>
+              <w:t>Roteiro de cartografia</w:t>
+            </w:r>
+            <w:r>
+              <w:rPr>
+                <w:sz w:val="18"/>
+              </w:rPr>
+              <w:t>. São Paulo: Oficina de Textos, 2013.</w:t>
             </w:r>
           </w:p>
           <w:p>
@@ -7032,7 +7903,20 @@
               <w:rPr>
                 <w:sz w:val="18"/>
               </w:rPr>
-              <w:t>ROBINSON, A. H. et al. Elements of cartography. 6. ed. New York: John Wiley &amp; Sons, 1995.</w:t>
+              <w:t xml:space="preserve">ROBINSON, A. H. et al. </w:t>
+            </w:r>
+            <w:r>
+              <w:rPr>
+                <w:b/>
+                <w:sz w:val="18"/>
+              </w:rPr>
+              <w:t>Elements of cartography</w:t>
+            </w:r>
+            <w:r>
+              <w:rPr>
+                <w:sz w:val="18"/>
+              </w:rPr>
+              <w:t>. 6. ed. New York: John Wiley &amp; Sons, 1995.</w:t>
             </w:r>
           </w:p>
         </w:tc>
@@ -7484,7 +8368,20 @@
               <w:rPr>
                 <w:sz w:val="18"/>
               </w:rPr>
-              <w:t>ARREDONDO, Lani. Aprenda a se comunicar com habilidade e clareza: 24 técnicas para tornar sua comunicação mais eficiente e seu dia-a-dia mais produtivo. Rio de Janeiro: Sextante, 2007.</w:t>
+              <w:t xml:space="preserve">ARREDONDO, Lani. </w:t>
+            </w:r>
+            <w:r>
+              <w:rPr>
+                <w:b/>
+                <w:sz w:val="18"/>
+              </w:rPr>
+              <w:t>Aprenda a se comunicar com habilidade e clareza: 24 técnicas para tornar sua comunicação mais eficiente e seu dia-a-dia mais produtivo</w:t>
+            </w:r>
+            <w:r>
+              <w:rPr>
+                <w:sz w:val="18"/>
+              </w:rPr>
+              <w:t>. Rio de Janeiro: Sextante, 2007.</w:t>
             </w:r>
           </w:p>
           <w:p>
@@ -7495,7 +8392,20 @@
               <w:rPr>
                 <w:sz w:val="18"/>
               </w:rPr>
-              <w:t>PEASE, A.; PEASE, B. Desvendando os segredos da linguagem corporal. Rio de Janeiro: Sextante, 2005.</w:t>
+              <w:t xml:space="preserve">PEASE, A.; PEASE, B. </w:t>
+            </w:r>
+            <w:r>
+              <w:rPr>
+                <w:b/>
+                <w:sz w:val="18"/>
+              </w:rPr>
+              <w:t>Desvendando os segredos da linguagem corporal</w:t>
+            </w:r>
+            <w:r>
+              <w:rPr>
+                <w:sz w:val="18"/>
+              </w:rPr>
+              <w:t>. Rio de Janeiro: Sextante, 2005.</w:t>
             </w:r>
           </w:p>
         </w:tc>
@@ -7531,7 +8441,20 @@
               <w:rPr>
                 <w:sz w:val="18"/>
               </w:rPr>
-              <w:t>ALVES, Léo da Silva. A arte da oratória: técnicas de oratória moderna e comunicação eficiente. Brasília, DF: Brasília Jurídica, 2004.</w:t>
+              <w:t xml:space="preserve">ALVES, Léo da Silva. </w:t>
+            </w:r>
+            <w:r>
+              <w:rPr>
+                <w:b/>
+                <w:sz w:val="18"/>
+              </w:rPr>
+              <w:t>A arte da oratória: técnicas de oratória moderna e comunicação eficiente</w:t>
+            </w:r>
+            <w:r>
+              <w:rPr>
+                <w:sz w:val="18"/>
+              </w:rPr>
+              <w:t>. Brasília, DF: Brasília Jurídica, 2004.</w:t>
             </w:r>
           </w:p>
           <w:p>
@@ -7542,7 +8465,20 @@
               <w:rPr>
                 <w:sz w:val="18"/>
               </w:rPr>
-              <w:t>GUGLIELMI, Anna. A linguagem secreta do corpo: a comunicação não verbal. 3. ed. Petrópolis, RJ: Vozes, 2011.</w:t>
+              <w:t xml:space="preserve">GUGLIELMI, Anna. </w:t>
+            </w:r>
+            <w:r>
+              <w:rPr>
+                <w:b/>
+                <w:sz w:val="18"/>
+              </w:rPr>
+              <w:t>A linguagem secreta do corpo: a comunicação não verbal</w:t>
+            </w:r>
+            <w:r>
+              <w:rPr>
+                <w:sz w:val="18"/>
+              </w:rPr>
+              <w:t>. 3. ed. Petrópolis, RJ: Vozes, 2011.</w:t>
             </w:r>
           </w:p>
           <w:p>
@@ -7553,7 +8489,20 @@
               <w:rPr>
                 <w:sz w:val="18"/>
               </w:rPr>
-              <w:t>PEASE, A.; PEASE, B. A linguagem corporal no trabalho: como causar uma boa impressão e se destacar na carreira. Rio de Janeiro: Sextante, 2013.</w:t>
+              <w:t xml:space="preserve">PEASE, A.; PEASE, B. </w:t>
+            </w:r>
+            <w:r>
+              <w:rPr>
+                <w:b/>
+                <w:sz w:val="18"/>
+              </w:rPr>
+              <w:t>A linguagem corporal no trabalho: como causar uma boa impressão e se destacar na carreira</w:t>
+            </w:r>
+            <w:r>
+              <w:rPr>
+                <w:sz w:val="18"/>
+              </w:rPr>
+              <w:t>. Rio de Janeiro: Sextante, 2013.</w:t>
             </w:r>
           </w:p>
           <w:p>
@@ -7564,7 +8513,20 @@
               <w:rPr>
                 <w:sz w:val="18"/>
               </w:rPr>
-              <w:t>POLITO, Reinaldo. Como falar corretamente e sem inibições. 111. ed. São Paulo: Saraiva, 2006.</w:t>
+              <w:t xml:space="preserve">POLITO, Reinaldo. </w:t>
+            </w:r>
+            <w:r>
+              <w:rPr>
+                <w:b/>
+                <w:sz w:val="18"/>
+              </w:rPr>
+              <w:t>Como falar corretamente e sem inibições</w:t>
+            </w:r>
+            <w:r>
+              <w:rPr>
+                <w:sz w:val="18"/>
+              </w:rPr>
+              <w:t>. 111. ed. São Paulo: Saraiva, 2006.</w:t>
             </w:r>
           </w:p>
           <w:p>
@@ -7575,7 +8537,20 @@
               <w:rPr>
                 <w:sz w:val="18"/>
               </w:rPr>
-              <w:t>WEIL, Pierre; TOMPAKOW, Roland. O corpo fala: a linguagem silenciosa da comunicação não verbal. 74. ed. Petrópolis, RJ: Vozes, 2015.</w:t>
+              <w:t xml:space="preserve">WEIL, Pierre; TOMPAKOW, Roland. </w:t>
+            </w:r>
+            <w:r>
+              <w:rPr>
+                <w:b/>
+                <w:sz w:val="18"/>
+              </w:rPr>
+              <w:t>O corpo fala: a linguagem silenciosa da comunicação não verbal</w:t>
+            </w:r>
+            <w:r>
+              <w:rPr>
+                <w:sz w:val="18"/>
+              </w:rPr>
+              <w:t>. 74. ed. Petrópolis, RJ: Vozes, 2015.</w:t>
             </w:r>
           </w:p>
         </w:tc>
@@ -8057,7 +9032,20 @@
               <w:rPr>
                 <w:sz w:val="18"/>
               </w:rPr>
-              <w:t>ROCHA, Maria Carolina Vieira da. Microbiologia ambiental. Curitiba: InterSaberes, 2020. 255 p., il., color. ISBN 9788522702329.</w:t>
+              <w:t xml:space="preserve">ROCHA, Maria Carolina Vieira da. </w:t>
+            </w:r>
+            <w:r>
+              <w:rPr>
+                <w:b/>
+                <w:sz w:val="18"/>
+              </w:rPr>
+              <w:t>Microbiologia ambiental</w:t>
+            </w:r>
+            <w:r>
+              <w:rPr>
+                <w:sz w:val="18"/>
+              </w:rPr>
+              <w:t>. Curitiba: InterSaberes, 2020. 255 p., il., color. ISBN 9788522702329.</w:t>
             </w:r>
           </w:p>
           <w:p>
@@ -8068,7 +9056,20 @@
               <w:rPr>
                 <w:sz w:val="18"/>
               </w:rPr>
-              <w:t>SISINNO, Cristina Lúcia Silveira; OLIVEIRA-FILHO, Eduardo Cyrino. Princípios de toxicologia ambiental: conceito e aplicações. Rio de Janeiro: Interciência, 2013. 198 p., il. ISBN 9788571932630.</w:t>
+              <w:t xml:space="preserve">SISINNO, Cristina Lúcia Silveira; OLIVEIRA-FILHO, Eduardo Cyrino. </w:t>
+            </w:r>
+            <w:r>
+              <w:rPr>
+                <w:b/>
+                <w:sz w:val="18"/>
+              </w:rPr>
+              <w:t>Princípios de toxicologia ambiental: conceito e aplicações</w:t>
+            </w:r>
+            <w:r>
+              <w:rPr>
+                <w:sz w:val="18"/>
+              </w:rPr>
+              <w:t>. Rio de Janeiro: Interciência, 2013. 198 p., il. ISBN 9788571932630.</w:t>
             </w:r>
           </w:p>
         </w:tc>
@@ -8104,7 +9105,20 @@
               <w:rPr>
                 <w:sz w:val="18"/>
               </w:rPr>
-              <w:t>AZEVEDO, Fausto Antonio de; CHASIN, Alice A. M. (coord.). As bases toxicológicas da ecotoxicologia. São Carlos, SP; São Paulo: RiMa: Intertox, 2003. 322p., il. Inclui bibliografia. ISBN 8589843017 (Intertox) 858655264x (RiMa).</w:t>
+              <w:t xml:space="preserve">AZEVEDO, Fausto Antonio de; CHASIN, Alice A. M. (coord.). </w:t>
+            </w:r>
+            <w:r>
+              <w:rPr>
+                <w:b/>
+                <w:sz w:val="18"/>
+              </w:rPr>
+              <w:t>As bases toxicológicas da ecotoxicologia</w:t>
+            </w:r>
+            <w:r>
+              <w:rPr>
+                <w:sz w:val="18"/>
+              </w:rPr>
+              <w:t>. São Carlos, SP; São Paulo: RiMa: Intertox, 2003. 322p., il. Inclui bibliografia. ISBN 8589843017 (Intertox) 858655264x (RiMa).</w:t>
             </w:r>
           </w:p>
           <w:p>
@@ -8115,7 +9129,20 @@
               <w:rPr>
                 <w:sz w:val="18"/>
               </w:rPr>
-              <w:t>PELCZAR, Michael Joseph et al. Microbiologia: conceitos e aplicações, volume 2. Colaboração de Merna F. Pelczar. Revisão de Celso Vataru Nakamura. Tradução de Sueli Fumie Yamada. 2. ed. São Paulo: Pearson Education do Brasil, 2016. 517 p. ISBN 9788534604543.</w:t>
+              <w:t xml:space="preserve">PELCZAR, Michael Joseph et al. </w:t>
+            </w:r>
+            <w:r>
+              <w:rPr>
+                <w:b/>
+                <w:sz w:val="18"/>
+              </w:rPr>
+              <w:t>Microbiologia: conceitos e aplicações, volume 2</w:t>
+            </w:r>
+            <w:r>
+              <w:rPr>
+                <w:sz w:val="18"/>
+              </w:rPr>
+              <w:t>. Colaboração de Merna F. Pelczar. Revisão de Celso Vataru Nakamura. Tradução de Sueli Fumie Yamada. 2. ed. São Paulo: Pearson Education do Brasil, 2016. 517 p. ISBN 9788534604543.</w:t>
             </w:r>
           </w:p>
           <w:p>
@@ -8126,7 +9153,20 @@
               <w:rPr>
                 <w:sz w:val="18"/>
               </w:rPr>
-              <w:t>TORTORA, Gerard J.; FUNKE, Berdell R.; CASE, Christine L. Microbiologia. Tradução de Danielle Soares de Oliveira Daian, Luis Fernando Marques Dorvillé. 12. ed. Porto Alegre: Artmed, 2017. 935 p., il., color. ISBN 9788582713532.</w:t>
+              <w:t xml:space="preserve">TORTORA, Gerard J.; FUNKE, Berdell R.; CASE, Christine L. </w:t>
+            </w:r>
+            <w:r>
+              <w:rPr>
+                <w:b/>
+                <w:sz w:val="18"/>
+              </w:rPr>
+              <w:t>Microbiologia</w:t>
+            </w:r>
+            <w:r>
+              <w:rPr>
+                <w:sz w:val="18"/>
+              </w:rPr>
+              <w:t>. Tradução de Danielle Soares de Oliveira Daian, Luis Fernando Marques Dorvillé. 12. ed. Porto Alegre: Artmed, 2017. 935 p., il., color. ISBN 9788582713532.</w:t>
             </w:r>
           </w:p>
         </w:tc>
@@ -8626,7 +9666,20 @@
               <w:rPr>
                 <w:sz w:val="18"/>
               </w:rPr>
-              <w:t>BAIRD, Colin; CANN, Michael. Química ambiental. Tradução de Marco Tadeu Grassi. 4. ed. Porto Alegre: Bookman, 2011. 844 p., il. ISBN 9788577808489.</w:t>
+              <w:t xml:space="preserve">BAIRD, Colin; CANN, Michael. </w:t>
+            </w:r>
+            <w:r>
+              <w:rPr>
+                <w:b/>
+                <w:sz w:val="18"/>
+              </w:rPr>
+              <w:t>Química ambiental</w:t>
+            </w:r>
+            <w:r>
+              <w:rPr>
+                <w:sz w:val="18"/>
+              </w:rPr>
+              <w:t>. Tradução de Marco Tadeu Grassi. 4. ed. Porto Alegre: Bookman, 2011. 844 p., il. ISBN 9788577808489.</w:t>
             </w:r>
           </w:p>
           <w:p>
@@ -8637,7 +9690,20 @@
               <w:rPr>
                 <w:sz w:val="18"/>
               </w:rPr>
-              <w:t>ROCHA, Júlio Cesar; ROSA, André Henrique; CARDOSO, Arnaldo Alves. Introdução à química ambiental. 2. ed. Porto Alegre: Bookman, 2009. 256 p., il., color, 25 cm. ISBN 9788577804696.</w:t>
+              <w:t xml:space="preserve">ROCHA, Júlio Cesar; ROSA, André Henrique; CARDOSO, Arnaldo Alves. </w:t>
+            </w:r>
+            <w:r>
+              <w:rPr>
+                <w:b/>
+                <w:sz w:val="18"/>
+              </w:rPr>
+              <w:t>Introdução à química ambiental</w:t>
+            </w:r>
+            <w:r>
+              <w:rPr>
+                <w:sz w:val="18"/>
+              </w:rPr>
+              <w:t>. 2. ed. Porto Alegre: Bookman, 2009. 256 p., il., color, 25 cm. ISBN 9788577804696.</w:t>
             </w:r>
           </w:p>
         </w:tc>
@@ -8673,7 +9739,20 @@
               <w:rPr>
                 <w:sz w:val="18"/>
               </w:rPr>
-              <w:t>ATKINS, P. W.; JONES, Loretta. Princípios de química: questionando a vida moderna e o meio ambiente. Tradução de Ricardo Bicca de Alencastro. 5. ed. Porto Alegre: Bookman, 2012. 922 p., il. ISBN 9788540700383.</w:t>
+              <w:t xml:space="preserve">ATKINS, P. W.; JONES, Loretta. </w:t>
+            </w:r>
+            <w:r>
+              <w:rPr>
+                <w:b/>
+                <w:sz w:val="18"/>
+              </w:rPr>
+              <w:t>Princípios de química: questionando a vida moderna e o meio ambiente</w:t>
+            </w:r>
+            <w:r>
+              <w:rPr>
+                <w:sz w:val="18"/>
+              </w:rPr>
+              <w:t>. Tradução de Ricardo Bicca de Alencastro. 5. ed. Porto Alegre: Bookman, 2012. 922 p., il. ISBN 9788540700383.</w:t>
             </w:r>
           </w:p>
           <w:p>
@@ -8684,7 +9763,20 @@
               <w:rPr>
                 <w:sz w:val="18"/>
               </w:rPr>
-              <w:t>LENZI, Ervim; FAVERO, Luzia Otilia Bortotti; LUCHESE, Eduardo Bernardi. Introdução à química da água: ciência, vida e sobrevivência. Rio de Janeiro: LTC, 2009. 604 p., il. Inclui bibliografia. ISBN 9788521616795.</w:t>
+              <w:t xml:space="preserve">LENZI, Ervim; FAVERO, Luzia Otilia Bortotti; LUCHESE, Eduardo Bernardi. </w:t>
+            </w:r>
+            <w:r>
+              <w:rPr>
+                <w:b/>
+                <w:sz w:val="18"/>
+              </w:rPr>
+              <w:t>Introdução à química da água: ciência, vida e sobrevivência</w:t>
+            </w:r>
+            <w:r>
+              <w:rPr>
+                <w:sz w:val="18"/>
+              </w:rPr>
+              <w:t>. Rio de Janeiro: LTC, 2009. 604 p., il. Inclui bibliografia. ISBN 9788521616795.</w:t>
             </w:r>
           </w:p>
           <w:p>
@@ -8695,7 +9787,20 @@
               <w:rPr>
                 <w:sz w:val="18"/>
               </w:rPr>
-              <w:t>LENZI, Ervim; FAVERO, Luzia Otilia Bortotti. Introdução à química da atmosfera: ciência, vida e sobrevivência. 2. ed. Rio de Janeiro: LTC, 2019. 465 p., il. ISBN 9788521634843.</w:t>
+              <w:t xml:space="preserve">LENZI, Ervim; FAVERO, Luzia Otilia Bortotti. </w:t>
+            </w:r>
+            <w:r>
+              <w:rPr>
+                <w:b/>
+                <w:sz w:val="18"/>
+              </w:rPr>
+              <w:t>Introdução à química da atmosfera: ciência, vida e sobrevivência</w:t>
+            </w:r>
+            <w:r>
+              <w:rPr>
+                <w:sz w:val="18"/>
+              </w:rPr>
+              <w:t>. 2. ed. Rio de Janeiro: LTC, 2019. 465 p., il. ISBN 9788521634843.</w:t>
             </w:r>
           </w:p>
         </w:tc>
@@ -9136,7 +10241,20 @@
               <w:rPr>
                 <w:sz w:val="18"/>
               </w:rPr>
-              <w:t>BEGON, M.; TOWSEND, C.R.; HARPER, J.L. Ecologia: de indivíduos a ecossistemas. 4. ed. Porto Alegre: Artmed, 2007.</w:t>
+              <w:t xml:space="preserve">BEGON, M.; TOWSEND, C.R.; HARPER, J.L. </w:t>
+            </w:r>
+            <w:r>
+              <w:rPr>
+                <w:b/>
+                <w:sz w:val="18"/>
+              </w:rPr>
+              <w:t>Ecologia: de indivíduos a ecossistemas</w:t>
+            </w:r>
+            <w:r>
+              <w:rPr>
+                <w:sz w:val="18"/>
+              </w:rPr>
+              <w:t>. 4. ed. Porto Alegre: Artmed, 2007.</w:t>
             </w:r>
           </w:p>
           <w:p>
@@ -9147,7 +10265,20 @@
               <w:rPr>
                 <w:sz w:val="18"/>
               </w:rPr>
-              <w:t>ODUM, E. P.; BARRETT, G. W. Fundamentos de ecologia. São Paulo: Cengage Learning, 2011.</w:t>
+              <w:t xml:space="preserve">ODUM, E. P.; BARRETT, G. W. </w:t>
+            </w:r>
+            <w:r>
+              <w:rPr>
+                <w:b/>
+                <w:sz w:val="18"/>
+              </w:rPr>
+              <w:t>Fundamentos de ecologia</w:t>
+            </w:r>
+            <w:r>
+              <w:rPr>
+                <w:sz w:val="18"/>
+              </w:rPr>
+              <w:t>. São Paulo: Cengage Learning, 2011.</w:t>
             </w:r>
           </w:p>
         </w:tc>
@@ -9183,7 +10314,20 @@
               <w:rPr>
                 <w:sz w:val="18"/>
               </w:rPr>
-              <w:t>GERLING, C. et al. (org.). Manual de ecossistemas marinhos e costeiros para educadores. Santos, SP: Ed. Comunicar, 2016. Acesso em: 23 ago. 2018.</w:t>
+              <w:t xml:space="preserve">GERLING, C. et al. (org.). </w:t>
+            </w:r>
+            <w:r>
+              <w:rPr>
+                <w:b/>
+                <w:sz w:val="18"/>
+              </w:rPr>
+              <w:t>Manual de ecossistemas marinhos e costeiros para educadores</w:t>
+            </w:r>
+            <w:r>
+              <w:rPr>
+                <w:sz w:val="18"/>
+              </w:rPr>
+              <w:t>. Santos, SP: Ed. Comunicar, 2016. Acesso em: 23 ago. 2018.</w:t>
             </w:r>
           </w:p>
           <w:p>
@@ -9194,7 +10338,20 @@
               <w:rPr>
                 <w:sz w:val="18"/>
               </w:rPr>
-              <w:t>BRASIL. Ministério da Agricultura, Pecuária e Abastecimento. Curso de recuperação de áreas degradadas. Acesso em: 23 ago. 2018.</w:t>
+              <w:t xml:space="preserve">BRASIL. </w:t>
+            </w:r>
+            <w:r>
+              <w:rPr>
+                <w:b/>
+                <w:sz w:val="18"/>
+              </w:rPr>
+              <w:t>Ministério da Agricultura, Pecuária e Abastecimento</w:t>
+            </w:r>
+            <w:r>
+              <w:rPr>
+                <w:sz w:val="18"/>
+              </w:rPr>
+              <w:t>. Curso de recuperação de áreas degradadas. Acesso em: 23 ago. 2018.</w:t>
             </w:r>
           </w:p>
           <w:p>
@@ -9205,7 +10362,20 @@
               <w:rPr>
                 <w:sz w:val="18"/>
               </w:rPr>
-              <w:t>MILLER, G. Tyler; SPOOLMAN, Scott. Ciência ambiental. 2. ed. São Paulo: Cengage Learning, 2015.</w:t>
+              <w:t xml:space="preserve">MILLER, G. Tyler; SPOOLMAN, Scott. </w:t>
+            </w:r>
+            <w:r>
+              <w:rPr>
+                <w:b/>
+                <w:sz w:val="18"/>
+              </w:rPr>
+              <w:t>Ciência ambiental</w:t>
+            </w:r>
+            <w:r>
+              <w:rPr>
+                <w:sz w:val="18"/>
+              </w:rPr>
+              <w:t>. 2. ed. São Paulo: Cengage Learning, 2015.</w:t>
             </w:r>
           </w:p>
           <w:p>
@@ -9216,7 +10386,20 @@
               <w:rPr>
                 <w:sz w:val="18"/>
               </w:rPr>
-              <w:t>RICKLEFS, R.E. A economia da natureza. 6. ed. Rio de Janeiro: Guanabara Koogan, 2010.</w:t>
+              <w:t xml:space="preserve">RICKLEFS, R.E. </w:t>
+            </w:r>
+            <w:r>
+              <w:rPr>
+                <w:b/>
+                <w:sz w:val="18"/>
+              </w:rPr>
+              <w:t>A economia da natureza</w:t>
+            </w:r>
+            <w:r>
+              <w:rPr>
+                <w:sz w:val="18"/>
+              </w:rPr>
+              <w:t>. 6. ed. Rio de Janeiro: Guanabara Koogan, 2010.</w:t>
             </w:r>
           </w:p>
           <w:p>
@@ -9227,7 +10410,20 @@
               <w:rPr>
                 <w:sz w:val="18"/>
               </w:rPr>
-              <w:t>RODRIGUES, Efraim. Ecologia da restauração. Londrina: Planta, 2013.</w:t>
+              <w:t xml:space="preserve">RODRIGUES, Efraim. </w:t>
+            </w:r>
+            <w:r>
+              <w:rPr>
+                <w:b/>
+                <w:sz w:val="18"/>
+              </w:rPr>
+              <w:t>Ecologia da restauração</w:t>
+            </w:r>
+            <w:r>
+              <w:rPr>
+                <w:sz w:val="18"/>
+              </w:rPr>
+              <w:t>. Londrina: Planta, 2013.</w:t>
             </w:r>
           </w:p>
         </w:tc>
@@ -9657,7 +10853,20 @@
               <w:rPr>
                 <w:sz w:val="18"/>
               </w:rPr>
-              <w:t>BARBETTA, Pedro Alberto. Estatística aplicada às ciências sociais. 8. ed. rev. Florianópolis: Ed. da UFSC, 2012.</w:t>
+              <w:t xml:space="preserve">BARBETTA, Pedro Alberto. </w:t>
+            </w:r>
+            <w:r>
+              <w:rPr>
+                <w:b/>
+                <w:sz w:val="18"/>
+              </w:rPr>
+              <w:t>Estatística aplicada às ciências sociais</w:t>
+            </w:r>
+            <w:r>
+              <w:rPr>
+                <w:sz w:val="18"/>
+              </w:rPr>
+              <w:t>. 8. ed. rev. Florianópolis: Ed. da UFSC, 2012.</w:t>
             </w:r>
           </w:p>
           <w:p>
@@ -9668,7 +10877,20 @@
               <w:rPr>
                 <w:sz w:val="18"/>
               </w:rPr>
-              <w:t>MORETTIN, Pedro Alberto; BUSSAB, Wilton de Oliveira. Estatística básica. 8. ed. São Paulo: Saraiva, 2013.</w:t>
+              <w:t xml:space="preserve">MORETTIN, Pedro Alberto; BUSSAB, Wilton de Oliveira. </w:t>
+            </w:r>
+            <w:r>
+              <w:rPr>
+                <w:b/>
+                <w:sz w:val="18"/>
+              </w:rPr>
+              <w:t>Estatística básica</w:t>
+            </w:r>
+            <w:r>
+              <w:rPr>
+                <w:sz w:val="18"/>
+              </w:rPr>
+              <w:t>. 8. ed. São Paulo: Saraiva, 2013.</w:t>
             </w:r>
           </w:p>
         </w:tc>
@@ -9704,7 +10926,20 @@
               <w:rPr>
                 <w:sz w:val="18"/>
               </w:rPr>
-              <w:t>BUENO, Fabrício. Estatística para processos produtivos. Florianópolis: Visual Books, 2010.</w:t>
+              <w:t xml:space="preserve">BUENO, Fabrício. </w:t>
+            </w:r>
+            <w:r>
+              <w:rPr>
+                <w:b/>
+                <w:sz w:val="18"/>
+              </w:rPr>
+              <w:t>Estatística para processos produtivos</w:t>
+            </w:r>
+            <w:r>
+              <w:rPr>
+                <w:sz w:val="18"/>
+              </w:rPr>
+              <w:t>. Florianópolis: Visual Books, 2010.</w:t>
             </w:r>
           </w:p>
           <w:p>
@@ -9715,7 +10950,20 @@
               <w:rPr>
                 <w:sz w:val="18"/>
               </w:rPr>
-              <w:t>KIRSTEN, J. T.; RABAHY, W. A. Estatística aplicada às ciências humanas e ao turismo. São Paulo: Saraiva, 2006.</w:t>
+              <w:t xml:space="preserve">KIRSTEN, J. T.; RABAHY, W. A. </w:t>
+            </w:r>
+            <w:r>
+              <w:rPr>
+                <w:b/>
+                <w:sz w:val="18"/>
+              </w:rPr>
+              <w:t>Estatística aplicada às ciências humanas e ao turismo</w:t>
+            </w:r>
+            <w:r>
+              <w:rPr>
+                <w:sz w:val="18"/>
+              </w:rPr>
+              <w:t>. São Paulo: Saraiva, 2006.</w:t>
             </w:r>
           </w:p>
         </w:tc>
@@ -10212,7 +11460,20 @@
               <w:rPr>
                 <w:sz w:val="18"/>
               </w:rPr>
-              <w:t>GUERRA, Antonio José Teixeira; COELHO, Maria Célia Nunes (org.). Unidades de conservação: abordagens e características geográficas. 2. ed. Rio de Janeiro: Bertrand Brasil, 2012. 296 p., il. Inclui bibliografia e índice. ISBN 9788528613711.</w:t>
+              <w:t xml:space="preserve">GUERRA, Antonio José Teixeira; COELHO, Maria Célia Nunes (org.). </w:t>
+            </w:r>
+            <w:r>
+              <w:rPr>
+                <w:b/>
+                <w:sz w:val="18"/>
+              </w:rPr>
+              <w:t>Unidades de conservação: abordagens e características geográficas</w:t>
+            </w:r>
+            <w:r>
+              <w:rPr>
+                <w:sz w:val="18"/>
+              </w:rPr>
+              <w:t>. 2. ed. Rio de Janeiro: Bertrand Brasil, 2012. 296 p., il. Inclui bibliografia e índice. ISBN 9788528613711.</w:t>
             </w:r>
           </w:p>
           <w:p>
@@ -10223,7 +11484,20 @@
               <w:rPr>
                 <w:sz w:val="18"/>
               </w:rPr>
-              <w:t>PRIMACK, Richard B.; RODRIGUES, Efraim. Biologia da conservação. Londrina: Planta, 2001. 327 p., il., 23 cm. Biibliografia: p. 311-327. ISBN 8590200213.</w:t>
+              <w:t xml:space="preserve">PRIMACK, Richard B.; RODRIGUES, Efraim. </w:t>
+            </w:r>
+            <w:r>
+              <w:rPr>
+                <w:b/>
+                <w:sz w:val="18"/>
+              </w:rPr>
+              <w:t>Biologia da conservação</w:t>
+            </w:r>
+            <w:r>
+              <w:rPr>
+                <w:sz w:val="18"/>
+              </w:rPr>
+              <w:t>. Londrina: Planta, 2001. 327 p., il., 23 cm. Biibliografia: p. 311-327. ISBN 8590200213.</w:t>
             </w:r>
           </w:p>
         </w:tc>
@@ -10259,7 +11533,20 @@
               <w:rPr>
                 <w:sz w:val="18"/>
               </w:rPr>
-              <w:t>LOUREIRO, Carlos Frederico Bernardo; AZAZIEL, Marcus; FRANCA, Nahyda. Educação ambiental e conselho em unidades de conservação: aspectos teóricos e metodológicos. Rio de Janeiro: Ibase, 2007. 87 p. ISBN 9788589447164.</w:t>
+              <w:t xml:space="preserve">LOUREIRO, Carlos Frederico Bernardo; AZAZIEL, Marcus; FRANCA, Nahyda. </w:t>
+            </w:r>
+            <w:r>
+              <w:rPr>
+                <w:b/>
+                <w:sz w:val="18"/>
+              </w:rPr>
+              <w:t>Educação ambiental e conselho em unidades de conservação: aspectos teóricos e metodológicos</w:t>
+            </w:r>
+            <w:r>
+              <w:rPr>
+                <w:sz w:val="18"/>
+              </w:rPr>
+              <w:t>. Rio de Janeiro: Ibase, 2007. 87 p. ISBN 9788589447164.</w:t>
             </w:r>
           </w:p>
           <w:p>
@@ -10270,7 +11557,20 @@
               <w:rPr>
                 <w:sz w:val="18"/>
               </w:rPr>
-              <w:t>LUZ, Lêda (org.). Iniciativas de inclusão produtiva e gestão participativa de unidades de conservação dos ambientes marinhos e costeiros do Brasil. Brasília: Instituto Chico Mendes de Conservação da Biodiversidade, 2017. 116 p., il. ISBN 9788561842666.</w:t>
+              <w:t xml:space="preserve">LUZ, Lêda (org.). </w:t>
+            </w:r>
+            <w:r>
+              <w:rPr>
+                <w:b/>
+                <w:sz w:val="18"/>
+              </w:rPr>
+              <w:t>Iniciativas de inclusão produtiva e gestão participativa de unidades de conservação dos ambientes marinhos e costeiros do Brasil</w:t>
+            </w:r>
+            <w:r>
+              <w:rPr>
+                <w:sz w:val="18"/>
+              </w:rPr>
+              <w:t>. Brasília: Instituto Chico Mendes de Conservação da Biodiversidade, 2017. 116 p., il. ISBN 9788561842666.</w:t>
             </w:r>
           </w:p>
           <w:p>
@@ -10281,7 +11581,20 @@
               <w:rPr>
                 <w:sz w:val="18"/>
               </w:rPr>
-              <w:t>RUSCHMANN, Doris van de Meene; PHILIPPI JUNIOR, Arlindo (ed.). Gestão ambiental e sustentabilidade no turismo. Barueri: Manole, 2010. 1027 p. (Ambiental, 9). ISBN 9788520424971.</w:t>
+              <w:t xml:space="preserve">RUSCHMANN, Doris van de Meene; PHILIPPI JUNIOR, Arlindo (ed.). </w:t>
+            </w:r>
+            <w:r>
+              <w:rPr>
+                <w:b/>
+                <w:sz w:val="18"/>
+              </w:rPr>
+              <w:t>Gestão ambiental e sustentabilidade no turismo</w:t>
+            </w:r>
+            <w:r>
+              <w:rPr>
+                <w:sz w:val="18"/>
+              </w:rPr>
+              <w:t>. Barueri: Manole, 2010. 1027 p. (Ambiental, 9). ISBN 9788520424971.</w:t>
             </w:r>
           </w:p>
         </w:tc>
@@ -10711,7 +12024,20 @@
               <w:rPr>
                 <w:sz w:val="18"/>
               </w:rPr>
-              <w:t>AGÊNCIA NACIONAL DE ÁGUAS. Sistema Nacional de Informações sobre Recursos Hídricos: Conjuntura dos recursos hídricos no Brasil: Disponível em: https://www.snirh.gov.br/portal/snirh/centrais-de-conteudos/conjuntura-dos-recursos-hidricos Acesso em: 15 jul. 2026.</w:t>
+              <w:t xml:space="preserve">AGÊNCIA NACIONAL DE ÁGUAS. </w:t>
+            </w:r>
+            <w:r>
+              <w:rPr>
+                <w:b/>
+                <w:sz w:val="18"/>
+              </w:rPr>
+              <w:t>Sistema Nacional de Informações sobre Recursos Hídricos: Conjuntura dos recursos hídricos no Brasil: Disponível em: https://www.snirh.gov.br/portal/snirh/centrais-de-conteudos/conjuntura-dos-recursos-hidricos Acesso em: 15 jul</w:t>
+            </w:r>
+            <w:r>
+              <w:rPr>
+                <w:sz w:val="18"/>
+              </w:rPr>
+              <w:t>. 2026.</w:t>
             </w:r>
           </w:p>
           <w:p>
@@ -10722,7 +12048,20 @@
               <w:rPr>
                 <w:sz w:val="18"/>
               </w:rPr>
-              <w:t>AGÊNCIA NACIONAL DE ENERGIA ELÉTRICA. Introdução ao Gerenciamento de Recursos Hídricos. 2. ed. Brasília: ANEEL, 2001.</w:t>
+              <w:t xml:space="preserve">AGÊNCIA NACIONAL DE ENERGIA ELÉTRICA. </w:t>
+            </w:r>
+            <w:r>
+              <w:rPr>
+                <w:b/>
+                <w:sz w:val="18"/>
+              </w:rPr>
+              <w:t>Introdução ao Gerenciamento de Recursos Hídricos</w:t>
+            </w:r>
+            <w:r>
+              <w:rPr>
+                <w:sz w:val="18"/>
+              </w:rPr>
+              <w:t>. 2. ed. Brasília: ANEEL, 2001.</w:t>
             </w:r>
           </w:p>
           <w:p>
@@ -10733,7 +12072,20 @@
               <w:rPr>
                 <w:sz w:val="18"/>
               </w:rPr>
-              <w:t>BRAGA, Benedito (Org.). Águas doces no Brasil: capital ecológico, uso e conservação. 4. ed., rev. e atual. São Paulo: Escrituras, 2015.</w:t>
+              <w:t xml:space="preserve">BRAGA, Benedito (Org.). </w:t>
+            </w:r>
+            <w:r>
+              <w:rPr>
+                <w:b/>
+                <w:sz w:val="18"/>
+              </w:rPr>
+              <w:t>Águas doces no Brasil: capital ecológico, uso e conservação</w:t>
+            </w:r>
+            <w:r>
+              <w:rPr>
+                <w:sz w:val="18"/>
+              </w:rPr>
+              <w:t>. 4. ed., rev. e atual. São Paulo: Escrituras, 2015.</w:t>
             </w:r>
           </w:p>
         </w:tc>
@@ -10769,7 +12121,20 @@
               <w:rPr>
                 <w:sz w:val="18"/>
               </w:rPr>
-              <w:t>BANCO MUNDIAL. Estratégias de gerenciamento de recursos hídricos no Brasil: áreas de cooperação com o Banco Mundial. Brasília, 2003.</w:t>
+              <w:t xml:space="preserve">BANCO MUNDIAL. </w:t>
+            </w:r>
+            <w:r>
+              <w:rPr>
+                <w:b/>
+                <w:sz w:val="18"/>
+              </w:rPr>
+              <w:t>Estratégias de gerenciamento de recursos hídricos no Brasil: áreas de cooperação com o Banco Mundial</w:t>
+            </w:r>
+            <w:r>
+              <w:rPr>
+                <w:sz w:val="18"/>
+              </w:rPr>
+              <w:t>. Brasília, 2003.</w:t>
             </w:r>
           </w:p>
           <w:p>
@@ -10780,7 +12145,20 @@
               <w:rPr>
                 <w:sz w:val="18"/>
               </w:rPr>
-              <w:t>BANCO MUNDIAL. Sistema de suporte à decisão para a outorga de direitos de uso da água no Brasil. Brasília, 2003.</w:t>
+              <w:t xml:space="preserve">BANCO MUNDIAL. </w:t>
+            </w:r>
+            <w:r>
+              <w:rPr>
+                <w:b/>
+                <w:sz w:val="18"/>
+              </w:rPr>
+              <w:t>Sistema de suporte à decisão para a outorga de direitos de uso da água no Brasil</w:t>
+            </w:r>
+            <w:r>
+              <w:rPr>
+                <w:sz w:val="18"/>
+              </w:rPr>
+              <w:t>. Brasília, 2003.</w:t>
             </w:r>
           </w:p>
           <w:p>
@@ -10791,7 +12169,20 @@
               <w:rPr>
                 <w:sz w:val="18"/>
               </w:rPr>
-              <w:t>BRASIL. Ministério do Meio Ambiente, Secretaria de Recursos Hídricos. Plano Nacional de Recursos Hídricos. Panorama e estado dos recursos hídricos do Brasil. Volume 1. Brasília: MMA, 2006.</w:t>
+              <w:t xml:space="preserve">BRASIL. </w:t>
+            </w:r>
+            <w:r>
+              <w:rPr>
+                <w:b/>
+                <w:sz w:val="18"/>
+              </w:rPr>
+              <w:t>Ministério do Meio Ambiente, Secretaria de Recursos Hídricos</w:t>
+            </w:r>
+            <w:r>
+              <w:rPr>
+                <w:sz w:val="18"/>
+              </w:rPr>
+              <w:t>. Plano Nacional de Recursos Hídricos. Panorama e estado dos recursos hídricos do Brasil. Volume 1. Brasília: MMA, 2006.</w:t>
             </w:r>
           </w:p>
           <w:p>
@@ -10802,7 +12193,20 @@
               <w:rPr>
                 <w:sz w:val="18"/>
               </w:rPr>
-              <w:t>BRASIL. Plano Nacional de Recursos Hídricos. Síntese executiva: português. Brasília: MMA, 2006.</w:t>
+              <w:t xml:space="preserve">BRASIL. </w:t>
+            </w:r>
+            <w:r>
+              <w:rPr>
+                <w:b/>
+                <w:sz w:val="18"/>
+              </w:rPr>
+              <w:t>Plano Nacional de Recursos Hídricos</w:t>
+            </w:r>
+            <w:r>
+              <w:rPr>
+                <w:sz w:val="18"/>
+              </w:rPr>
+              <w:t>. Síntese executiva: português. Brasília: MMA, 2006.</w:t>
             </w:r>
           </w:p>
           <w:p>
@@ -10813,7 +12217,20 @@
               <w:rPr>
                 <w:sz w:val="18"/>
               </w:rPr>
-              <w:t>CECH, T. V. Recursos hídricos: história, desenvolvimento, política e gestão. 3. ed. Rio de Janeiro: LTC, 2013.</w:t>
+              <w:t xml:space="preserve">CECH, T. V. </w:t>
+            </w:r>
+            <w:r>
+              <w:rPr>
+                <w:b/>
+                <w:sz w:val="18"/>
+              </w:rPr>
+              <w:t>Recursos hídricos: história, desenvolvimento, política e gestão</w:t>
+            </w:r>
+            <w:r>
+              <w:rPr>
+                <w:sz w:val="18"/>
+              </w:rPr>
+              <w:t>. 3. ed. Rio de Janeiro: LTC, 2013.</w:t>
             </w:r>
           </w:p>
         </w:tc>
@@ -11254,7 +12671,20 @@
               <w:rPr>
                 <w:sz w:val="18"/>
               </w:rPr>
-              <w:t>JARDIM, Arnaldo; YOSHIDA, Consuelo Yatsuda Moromizato; MACHADO FILHO, José Valverde. Política nacional, gestão e gerenciamento de resíduos sólidos. São Paulo: Manole, 2012.</w:t>
+              <w:t xml:space="preserve">JARDIM, Arnaldo; YOSHIDA, Consuelo Yatsuda Moromizato; MACHADO FILHO, José Valverde. </w:t>
+            </w:r>
+            <w:r>
+              <w:rPr>
+                <w:b/>
+                <w:sz w:val="18"/>
+              </w:rPr>
+              <w:t>Política nacional, gestão e gerenciamento de resíduos sólidos</w:t>
+            </w:r>
+            <w:r>
+              <w:rPr>
+                <w:sz w:val="18"/>
+              </w:rPr>
+              <w:t>. São Paulo: Manole, 2012.</w:t>
             </w:r>
           </w:p>
           <w:p>
@@ -11265,7 +12695,20 @@
               <w:rPr>
                 <w:sz w:val="18"/>
               </w:rPr>
-              <w:t>MASSUKADO, Luciana Miyoko. Compostagem: nada se cria, nada se perde; tudo se transforma. Brasília, DF: Editora IFB, 2016.</w:t>
+              <w:t xml:space="preserve">MASSUKADO, Luciana Miyoko. </w:t>
+            </w:r>
+            <w:r>
+              <w:rPr>
+                <w:b/>
+                <w:sz w:val="18"/>
+              </w:rPr>
+              <w:t>Compostagem: nada se cria, nada se perde; tudo se transforma</w:t>
+            </w:r>
+            <w:r>
+              <w:rPr>
+                <w:sz w:val="18"/>
+              </w:rPr>
+              <w:t>. Brasília, DF: Editora IFB, 2016.</w:t>
             </w:r>
           </w:p>
         </w:tc>
@@ -11301,7 +12744,20 @@
               <w:rPr>
                 <w:sz w:val="18"/>
               </w:rPr>
-              <w:t>BOOURSCHEID, Antonio; SOUZA, Rhonan Lima de. Resíduos de construção e demolição como material alternativo. Florianópolis: Publicação do IFSC, 2010.</w:t>
+              <w:t xml:space="preserve">BOOURSCHEID, Antonio; SOUZA, Rhonan Lima de. </w:t>
+            </w:r>
+            <w:r>
+              <w:rPr>
+                <w:b/>
+                <w:sz w:val="18"/>
+              </w:rPr>
+              <w:t>Resíduos de construção e demolição como material alternativo</w:t>
+            </w:r>
+            <w:r>
+              <w:rPr>
+                <w:sz w:val="18"/>
+              </w:rPr>
+              <w:t>. Florianópolis: Publicação do IFSC, 2010.</w:t>
             </w:r>
           </w:p>
           <w:p>
@@ -11312,7 +12768,20 @@
               <w:rPr>
                 <w:sz w:val="18"/>
               </w:rPr>
-              <w:t>MANO, Eloisa Biasotto; PACHECO, Élen B. A. V.; BONELLI, Cláudia M. C. Meio ambiente, poluição e reciclagem. 2. ed. São Paulo: Blucher, 2010.</w:t>
+              <w:t xml:space="preserve">MANO, Eloisa Biasotto; PACHECO, Élen B. A. V.; BONELLI, Cláudia M. C. </w:t>
+            </w:r>
+            <w:r>
+              <w:rPr>
+                <w:b/>
+                <w:sz w:val="18"/>
+              </w:rPr>
+              <w:t>Meio ambiente, poluição e reciclagem</w:t>
+            </w:r>
+            <w:r>
+              <w:rPr>
+                <w:sz w:val="18"/>
+              </w:rPr>
+              <w:t>. 2. ed. São Paulo: Blucher, 2010.</w:t>
             </w:r>
           </w:p>
           <w:p>
@@ -11323,7 +12792,20 @@
               <w:rPr>
                 <w:sz w:val="18"/>
               </w:rPr>
-              <w:t>WALDMAN, Maurício. Lixo: cenários e desafios : abordagens básicas para entender os resíduos sólidos. São Paulo: Cortez, 2010.</w:t>
+              <w:t xml:space="preserve">WALDMAN, Maurício. </w:t>
+            </w:r>
+            <w:r>
+              <w:rPr>
+                <w:b/>
+                <w:sz w:val="18"/>
+              </w:rPr>
+              <w:t>Lixo: cenários e desafios : abordagens básicas para entender os resíduos sólidos</w:t>
+            </w:r>
+            <w:r>
+              <w:rPr>
+                <w:sz w:val="18"/>
+              </w:rPr>
+              <w:t>. São Paulo: Cortez, 2010.</w:t>
             </w:r>
           </w:p>
         </w:tc>
@@ -11780,7 +13262,20 @@
               <w:rPr>
                 <w:sz w:val="18"/>
               </w:rPr>
-              <w:t>BASTOS, Rossano Lopes; SOUZA, Marise Campos de (Org.). Patrimônio Cultural arqueológico: Diálogos, Reflexões e práticas. São Paulo: IPHAN/SP, 2011.</w:t>
+              <w:t xml:space="preserve">BASTOS, Rossano Lopes; SOUZA, Marise Campos de (Org.). </w:t>
+            </w:r>
+            <w:r>
+              <w:rPr>
+                <w:b/>
+                <w:sz w:val="18"/>
+              </w:rPr>
+              <w:t>Patrimônio Cultural arqueológico: Diálogos, Reflexões e práticas</w:t>
+            </w:r>
+            <w:r>
+              <w:rPr>
+                <w:sz w:val="18"/>
+              </w:rPr>
+              <w:t>. São Paulo: IPHAN/SP, 2011.</w:t>
             </w:r>
           </w:p>
           <w:p>
@@ -11791,7 +13286,20 @@
               <w:rPr>
                 <w:sz w:val="18"/>
               </w:rPr>
-              <w:t>BASTOS, R. L.; SOUZA, Marise Campos de. Normas e gerenciamento do patrimônio arqueológico. 3. ed. São Paulo: Imprensa oficial/IPHAN, 2010.</w:t>
+              <w:t xml:space="preserve">BASTOS, R. L.; SOUZA, Marise Campos de. </w:t>
+            </w:r>
+            <w:r>
+              <w:rPr>
+                <w:b/>
+                <w:sz w:val="18"/>
+              </w:rPr>
+              <w:t>Normas e gerenciamento do patrimônio arqueológico</w:t>
+            </w:r>
+            <w:r>
+              <w:rPr>
+                <w:sz w:val="18"/>
+              </w:rPr>
+              <w:t>. 3. ed. São Paulo: Imprensa oficial/IPHAN, 2010.</w:t>
             </w:r>
           </w:p>
           <w:p>
@@ -11802,7 +13310,20 @@
               <w:rPr>
                 <w:sz w:val="18"/>
               </w:rPr>
-              <w:t>FUNARI, Pedro Paulo, PELIGRINI, Sandra de Cássia Araújo. Patrimônio histórico e cultural. Rio de Janeiro: Jorge Zahar, 2006.</w:t>
+              <w:t xml:space="preserve">FUNARI, Pedro Paulo, PELIGRINI, Sandra de Cássia Araújo. </w:t>
+            </w:r>
+            <w:r>
+              <w:rPr>
+                <w:b/>
+                <w:sz w:val="18"/>
+              </w:rPr>
+              <w:t>Patrimônio histórico e cultural</w:t>
+            </w:r>
+            <w:r>
+              <w:rPr>
+                <w:sz w:val="18"/>
+              </w:rPr>
+              <w:t>. Rio de Janeiro: Jorge Zahar, 2006.</w:t>
             </w:r>
           </w:p>
           <w:p>
@@ -11813,7 +13334,20 @@
               <w:rPr>
                 <w:sz w:val="18"/>
               </w:rPr>
-              <w:t>LARAIA, Roque de Barros. Cultura: um conceito antropológico. Rio de Janeiro: Zahar, 1986.</w:t>
+              <w:t xml:space="preserve">LARAIA, Roque de Barros. </w:t>
+            </w:r>
+            <w:r>
+              <w:rPr>
+                <w:b/>
+                <w:sz w:val="18"/>
+              </w:rPr>
+              <w:t>Cultura: um conceito antropológico</w:t>
+            </w:r>
+            <w:r>
+              <w:rPr>
+                <w:sz w:val="18"/>
+              </w:rPr>
+              <w:t>. Rio de Janeiro: Zahar, 1986.</w:t>
             </w:r>
           </w:p>
         </w:tc>
@@ -11849,7 +13383,20 @@
               <w:rPr>
                 <w:sz w:val="18"/>
               </w:rPr>
-              <w:t>CAMPOS, Jussef Daibert Salomão de. (org.). Patrimônio cultural plural. Belo Hori- zonte: Arraes, 2015.</w:t>
+              <w:t xml:space="preserve">CAMPOS, Jussef Daibert Salomão de. (org.). </w:t>
+            </w:r>
+            <w:r>
+              <w:rPr>
+                <w:b/>
+                <w:sz w:val="18"/>
+              </w:rPr>
+              <w:t>Patrimônio cultural plural</w:t>
+            </w:r>
+            <w:r>
+              <w:rPr>
+                <w:sz w:val="18"/>
+              </w:rPr>
+              <w:t>. Belo Hori- zonte: Arraes, 2015.</w:t>
             </w:r>
           </w:p>
           <w:p>
@@ -11860,7 +13407,20 @@
               <w:rPr>
                 <w:sz w:val="18"/>
               </w:rPr>
-              <w:t>PIMENTA, Margareth de Castro Afeche; FIGUEIREDO, Lauro César. (orgs.). Lugares: patrimônio, memória e paisagens. Florianópolis: Editora da UFSC, 2014.</w:t>
+              <w:t xml:space="preserve">PIMENTA, Margareth de Castro Afeche; FIGUEIREDO, Lauro César. (orgs.). </w:t>
+            </w:r>
+            <w:r>
+              <w:rPr>
+                <w:b/>
+                <w:sz w:val="18"/>
+              </w:rPr>
+              <w:t>Lugares: patrimônio, memória e paisagens</w:t>
+            </w:r>
+            <w:r>
+              <w:rPr>
+                <w:sz w:val="18"/>
+              </w:rPr>
+              <w:t>. Florianópolis: Editora da UFSC, 2014.</w:t>
             </w:r>
           </w:p>
           <w:p>
@@ -11871,7 +13431,20 @@
               <w:rPr>
                 <w:sz w:val="18"/>
               </w:rPr>
-              <w:t>RIBEIRO, Rafael Winter. Paisagem cultural e patrimônio. Rio de Janeiro: IPHAN/COPEDOC, 2007.</w:t>
+              <w:t xml:space="preserve">RIBEIRO, Rafael Winter. </w:t>
+            </w:r>
+            <w:r>
+              <w:rPr>
+                <w:b/>
+                <w:sz w:val="18"/>
+              </w:rPr>
+              <w:t>Paisagem cultural e patrimônio</w:t>
+            </w:r>
+            <w:r>
+              <w:rPr>
+                <w:sz w:val="18"/>
+              </w:rPr>
+              <w:t>. Rio de Janeiro: IPHAN/COPEDOC, 2007.</w:t>
             </w:r>
           </w:p>
         </w:tc>
@@ -12411,7 +13984,20 @@
               <w:rPr>
                 <w:sz w:val="18"/>
               </w:rPr>
-              <w:t>FITZ, Paulo Roberto. Geoprocessamento sem complicação. São Paulo: Oficina de Textos, 2008.</w:t>
+              <w:t xml:space="preserve">FITZ, Paulo Roberto. </w:t>
+            </w:r>
+            <w:r>
+              <w:rPr>
+                <w:b/>
+                <w:sz w:val="18"/>
+              </w:rPr>
+              <w:t>Geoprocessamento sem complicação</w:t>
+            </w:r>
+            <w:r>
+              <w:rPr>
+                <w:sz w:val="18"/>
+              </w:rPr>
+              <w:t>. São Paulo: Oficina de Textos, 2008.</w:t>
             </w:r>
           </w:p>
           <w:p>
@@ -12422,7 +14008,20 @@
               <w:rPr>
                 <w:sz w:val="18"/>
               </w:rPr>
-              <w:t>SARAIVA, Sérgio; TULER, Marcelo. Fundamentos de topografia. Porto Alegre: Bookman, 2014.</w:t>
+              <w:t xml:space="preserve">SARAIVA, Sérgio; TULER, Marcelo. </w:t>
+            </w:r>
+            <w:r>
+              <w:rPr>
+                <w:b/>
+                <w:sz w:val="18"/>
+              </w:rPr>
+              <w:t>Fundamentos de topografia</w:t>
+            </w:r>
+            <w:r>
+              <w:rPr>
+                <w:sz w:val="18"/>
+              </w:rPr>
+              <w:t>. Porto Alegre: Bookman, 2014.</w:t>
             </w:r>
           </w:p>
         </w:tc>
@@ -12458,7 +14057,20 @@
               <w:rPr>
                 <w:sz w:val="18"/>
               </w:rPr>
-              <w:t>BRASIL. Ministério do Desenvolvimento Agrário. Instituto Nacional de Colonização e Reforma Agrária. Norma técnica para georreferenciamento de imóveis rurais. Disponível em: https://moodle.ifsc.edu.br/mod/resource/view.php?id=84466 . Acesso em: 28 ago. 2018.</w:t>
+              <w:t xml:space="preserve">BRASIL. </w:t>
+            </w:r>
+            <w:r>
+              <w:rPr>
+                <w:b/>
+                <w:sz w:val="18"/>
+              </w:rPr>
+              <w:t>Ministério do Desenvolvimento Agrário</w:t>
+            </w:r>
+            <w:r>
+              <w:rPr>
+                <w:sz w:val="18"/>
+              </w:rPr>
+              <w:t>. Instituto Nacional de Colonização e Reforma Agrária. Norma técnica para georreferenciamento de imóveis rurais. Disponível em: https://moodle.ifsc.edu.br/mod/resource/view.php?id=84466 . Acesso em: 28 ago. 2018.</w:t>
             </w:r>
           </w:p>
           <w:p>
@@ -12469,7 +14081,20 @@
               <w:rPr>
                 <w:sz w:val="18"/>
               </w:rPr>
-              <w:t>LONGLEY, Paul A. Sistemas e ciência da informação geográfica. Porto Alegre: Bookman, 2009.</w:t>
+              <w:t xml:space="preserve">LONGLEY, Paul A. </w:t>
+            </w:r>
+            <w:r>
+              <w:rPr>
+                <w:b/>
+                <w:sz w:val="18"/>
+              </w:rPr>
+              <w:t>Sistemas e ciência da informação geográfica</w:t>
+            </w:r>
+            <w:r>
+              <w:rPr>
+                <w:sz w:val="18"/>
+              </w:rPr>
+              <w:t>. Porto Alegre: Bookman, 2009.</w:t>
             </w:r>
           </w:p>
           <w:p>
@@ -12480,7 +14105,20 @@
               <w:rPr>
                 <w:sz w:val="18"/>
               </w:rPr>
-              <w:t>MENEZES, Paulo Márcio Leal de. Roteiro de cartografia. São Paulo: Oficina de Textos, 2013.</w:t>
+              <w:t xml:space="preserve">MENEZES, Paulo Márcio Leal de. </w:t>
+            </w:r>
+            <w:r>
+              <w:rPr>
+                <w:b/>
+                <w:sz w:val="18"/>
+              </w:rPr>
+              <w:t>Roteiro de cartografia</w:t>
+            </w:r>
+            <w:r>
+              <w:rPr>
+                <w:sz w:val="18"/>
+              </w:rPr>
+              <w:t>. São Paulo: Oficina de Textos, 2013.</w:t>
             </w:r>
           </w:p>
           <w:p>
@@ -12491,7 +14129,20 @@
               <w:rPr>
                 <w:sz w:val="18"/>
               </w:rPr>
-              <w:t>SILVA, A. G. O.; AZEVEDO, V. W. B. &amp; SEIXAS, A. Métodos de levantamentos planimétricos para o georreferenciamento de imóveis rurais. In.: Anais I Simpósio de Geotecnologias no Pantanal, Campo Grande, 11-15, EMBRAPA Informática Agropecuária. 2006. Disponível em: http://mtc-m17.sid.inpe.br/col/sid.inpe.br/mtc-m17@80/2006/12.12.13.39/doc/p111.pdf. Acesso em: 28 ago. 2018.</w:t>
+              <w:t xml:space="preserve">SILVA, A. G. O.; AZEVEDO, V. W. B. &amp; SEIXAS, A. </w:t>
+            </w:r>
+            <w:r>
+              <w:rPr>
+                <w:b/>
+                <w:sz w:val="18"/>
+              </w:rPr>
+              <w:t>Métodos de levantamentos planimétricos para o georreferenciamento de imóveis rurais</w:t>
+            </w:r>
+            <w:r>
+              <w:rPr>
+                <w:sz w:val="18"/>
+              </w:rPr>
+              <w:t>. In.: Anais I Simpósio de Geotecnologias no Pantanal, Campo Grande, 11-15, EMBRAPA Informática Agropecuária. 2006. Disponível em: http://mtc-m17.sid.inpe.br/col/sid.inpe.br/mtc-m17@80/2006/12.12.13.39/doc/p111.pdf. Acesso em: 28 ago. 2018.</w:t>
             </w:r>
           </w:p>
           <w:p>
@@ -12502,7 +14153,20 @@
               <w:rPr>
                 <w:sz w:val="18"/>
               </w:rPr>
-              <w:t>VEIGA, L. A.K.; ZANETTI, M. A. Z.; FAGGION, P. L. Fundamentos de topografia. Curitiba: UFPR, 2007. Disponível em: https://moodle.ifsc.edu.br/mod/resource/view.php?id=84468 . Acesso em: 28 ago. 2018</w:t>
+              <w:t xml:space="preserve">VEIGA, L. A.K.; ZANETTI, M. A. Z.; FAGGION, P. L. </w:t>
+            </w:r>
+            <w:r>
+              <w:rPr>
+                <w:b/>
+                <w:sz w:val="18"/>
+              </w:rPr>
+              <w:t>Fundamentos de topografia</w:t>
+            </w:r>
+            <w:r>
+              <w:rPr>
+                <w:sz w:val="18"/>
+              </w:rPr>
+              <w:t>. Curitiba: UFPR, 2007. Disponível em: https://moodle.ifsc.edu.br/mod/resource/view.php?id=84468 . Acesso em: 28 ago. 2018</w:t>
             </w:r>
           </w:p>
         </w:tc>
@@ -13746,7 +15410,20 @@
               <w:rPr>
                 <w:sz w:val="18"/>
               </w:rPr>
-              <w:t>ALTIERI, Miguel A. Agroecologia: bases científicas para uma agricultura sustentável. 3. ed. São Paulo: Expressão Popular, 2012.</w:t>
+              <w:t xml:space="preserve">ALTIERI, Miguel A. </w:t>
+            </w:r>
+            <w:r>
+              <w:rPr>
+                <w:b/>
+                <w:sz w:val="18"/>
+              </w:rPr>
+              <w:t>Agroecologia: bases científicas para uma agricultura sustentável</w:t>
+            </w:r>
+            <w:r>
+              <w:rPr>
+                <w:sz w:val="18"/>
+              </w:rPr>
+              <w:t>. 3. ed. São Paulo: Expressão Popular, 2012.</w:t>
             </w:r>
           </w:p>
           <w:p>
@@ -13757,7 +15434,20 @@
               <w:rPr>
                 <w:sz w:val="18"/>
               </w:rPr>
-              <w:t>CAPORAL, F. R.; COSTABEBER, J. A. Agroecologia: alguns conceitos e princípios. Brasília: MDA/SAF/DATER-IICA, 2004.</w:t>
+              <w:t xml:space="preserve">CAPORAL, F. R.; COSTABEBER, J. A. </w:t>
+            </w:r>
+            <w:r>
+              <w:rPr>
+                <w:b/>
+                <w:sz w:val="18"/>
+              </w:rPr>
+              <w:t>Agroecologia: alguns conceitos e princípios</w:t>
+            </w:r>
+            <w:r>
+              <w:rPr>
+                <w:sz w:val="18"/>
+              </w:rPr>
+              <w:t>. Brasília: MDA/SAF/DATER-IICA, 2004.</w:t>
             </w:r>
           </w:p>
           <w:p>
@@ -13768,7 +15458,20 @@
               <w:rPr>
                 <w:sz w:val="18"/>
               </w:rPr>
-              <w:t>LEPSCH, I. F. 19 Lições de Pedologia. 2. ed. São Paulo: Oficina de Textos, 2016.</w:t>
+              <w:t xml:space="preserve">LEPSCH, I. F. </w:t>
+            </w:r>
+            <w:r>
+              <w:rPr>
+                <w:b/>
+                <w:sz w:val="18"/>
+              </w:rPr>
+              <w:t>19 Lições de Pedologia</w:t>
+            </w:r>
+            <w:r>
+              <w:rPr>
+                <w:sz w:val="18"/>
+              </w:rPr>
+              <w:t>. 2. ed. São Paulo: Oficina de Textos, 2016.</w:t>
             </w:r>
           </w:p>
           <w:p>
@@ -13779,7 +15482,20 @@
               <w:rPr>
                 <w:sz w:val="18"/>
               </w:rPr>
-              <w:t>BERTONI, J.; LOMBARDI NETO, F. Conservação do solo. 9. ed. São Paulo: Ícone, 2017.</w:t>
+              <w:t xml:space="preserve">BERTONI, J.; LOMBARDI NETO, F. </w:t>
+            </w:r>
+            <w:r>
+              <w:rPr>
+                <w:b/>
+                <w:sz w:val="18"/>
+              </w:rPr>
+              <w:t>Conservação do solo</w:t>
+            </w:r>
+            <w:r>
+              <w:rPr>
+                <w:sz w:val="18"/>
+              </w:rPr>
+              <w:t>. 9. ed. São Paulo: Ícone, 2017.</w:t>
             </w:r>
           </w:p>
         </w:tc>
@@ -13815,7 +15531,20 @@
               <w:rPr>
                 <w:sz w:val="18"/>
               </w:rPr>
-              <w:t>GLIESSMAN, S. R. Agroecologia: processos ecológicos em agricultura sustentável. 4. ed. Porto Alegre: Ed. UFRGS, 2015.</w:t>
+              <w:t xml:space="preserve">GLIESSMAN, S. R. </w:t>
+            </w:r>
+            <w:r>
+              <w:rPr>
+                <w:b/>
+                <w:sz w:val="18"/>
+              </w:rPr>
+              <w:t>Agroecologia: processos ecológicos em agricultura sustentável</w:t>
+            </w:r>
+            <w:r>
+              <w:rPr>
+                <w:sz w:val="18"/>
+              </w:rPr>
+              <w:t>. 4. ed. Porto Alegre: Ed. UFRGS, 2015.</w:t>
             </w:r>
           </w:p>
           <w:p>
@@ -13826,7 +15555,20 @@
               <w:rPr>
                 <w:sz w:val="18"/>
               </w:rPr>
-              <w:t>EMBRAPA. Sistema Brasileiro de Classificação de Solos. 5. ed. Brasília: Embrapa, 2018.</w:t>
+              <w:t xml:space="preserve">EMBRAPA. </w:t>
+            </w:r>
+            <w:r>
+              <w:rPr>
+                <w:b/>
+                <w:sz w:val="18"/>
+              </w:rPr>
+              <w:t>Sistema Brasileiro de Classificação de Solos</w:t>
+            </w:r>
+            <w:r>
+              <w:rPr>
+                <w:sz w:val="18"/>
+              </w:rPr>
+              <w:t>. 5. ed. Brasília: Embrapa, 2018.</w:t>
             </w:r>
           </w:p>
           <w:p>
@@ -13837,7 +15579,20 @@
               <w:rPr>
                 <w:sz w:val="18"/>
               </w:rPr>
-              <w:t>BRASIL. Ministério do Desenvolvimento Agrário e Agricultura Familiar. Plano Nacional de Agroecologia e Produção Orgânica (PLANAPO). Brasília, 2023/2024.</w:t>
+              <w:t xml:space="preserve">BRASIL. </w:t>
+            </w:r>
+            <w:r>
+              <w:rPr>
+                <w:b/>
+                <w:sz w:val="18"/>
+              </w:rPr>
+              <w:t>Ministério do Desenvolvimento Agrário e Agricultura Familiar</w:t>
+            </w:r>
+            <w:r>
+              <w:rPr>
+                <w:sz w:val="18"/>
+              </w:rPr>
+              <w:t>. Plano Nacional de Agroecologia e Produção Orgânica (PLANAPO). Brasília, 2023/2024.</w:t>
             </w:r>
           </w:p>
           <w:p>
@@ -13848,7 +15603,20 @@
               <w:rPr>
                 <w:sz w:val="18"/>
               </w:rPr>
-              <w:t>BRASIL. Ministério da Agricultura, Pecuária e Abastecimento. Plano Setorial de Mitigação e Adaptação às Mudanças Climáticas para a Consolidação de uma Economia de Baixa Emissão de Carbono na Agricultura (Plano ABC+). Brasília, 2021.</w:t>
+              <w:t xml:space="preserve">BRASIL. </w:t>
+            </w:r>
+            <w:r>
+              <w:rPr>
+                <w:b/>
+                <w:sz w:val="18"/>
+              </w:rPr>
+              <w:t>Ministério da Agricultura, Pecuária e Abastecimento</w:t>
+            </w:r>
+            <w:r>
+              <w:rPr>
+                <w:sz w:val="18"/>
+              </w:rPr>
+              <w:t>. Plano Setorial de Mitigação e Adaptação às Mudanças Climáticas para a Consolidação de uma Economia de Baixa Emissão de Carbono na Agricultura (Plano ABC+). Brasília, 2021.</w:t>
             </w:r>
           </w:p>
           <w:p>
@@ -13859,7 +15627,20 @@
               <w:rPr>
                 <w:sz w:val="18"/>
               </w:rPr>
-              <w:t>SACHS, I. Caminhos para o desenvolvimento sustentável. 4. ed. Rio de Janeiro: Garamond, 2009.</w:t>
+              <w:t xml:space="preserve">SACHS, I. </w:t>
+            </w:r>
+            <w:r>
+              <w:rPr>
+                <w:b/>
+                <w:sz w:val="18"/>
+              </w:rPr>
+              <w:t>Caminhos para o desenvolvimento sustentável</w:t>
+            </w:r>
+            <w:r>
+              <w:rPr>
+                <w:sz w:val="18"/>
+              </w:rPr>
+              <w:t>. 4. ed. Rio de Janeiro: Garamond, 2009.</w:t>
             </w:r>
           </w:p>
           <w:p>
@@ -13870,7 +15651,20 @@
               <w:rPr>
                 <w:sz w:val="18"/>
               </w:rPr>
-              <w:t>EMBRAPA. Solos e agroecologia. Coleção Transição Agroecológica, Vol. 4. Brasília, DF: Embrapa, 2018. Sistema Brasileiro de Classificação de Solos. 5. ed. Brasília: Embrapa, 2018. Elementos da Natureza e Propriedades dos Solos. 3. ed. Porto Alegre: Bookman, 2013. Conservação do Solo. 10. ed. São Paulo: Ícone, 2017. 19 Lições de Pedologia. 2. ed. São Paulo: Oficina de Textos, 2016. Empresa Brasileira de Pesquisa Agropecuária. Solos e Agroecologia. Coleção Transição Agroecológica. Brasília: Embrapa, 2018. Caminhos para o Desenvolvimento Sustentável. 4. ed. Rio de Janeiro: Garamond, 2009.</w:t>
+              <w:t xml:space="preserve">EMBRAPA. </w:t>
+            </w:r>
+            <w:r>
+              <w:rPr>
+                <w:b/>
+                <w:sz w:val="18"/>
+              </w:rPr>
+              <w:t>Solos e agroecologia</w:t>
+            </w:r>
+            <w:r>
+              <w:rPr>
+                <w:sz w:val="18"/>
+              </w:rPr>
+              <w:t>. Coleção Transição Agroecológica, Vol. 4. Brasília, DF: Embrapa, 2018. Sistema Brasileiro de Classificação de Solos. 5. ed. Brasília: Embrapa, 2018. Elementos da Natureza e Propriedades dos Solos. 3. ed. Porto Alegre: Bookman, 2013. Conservação do Solo. 10. ed. São Paulo: Ícone, 2017. 19 Lições de Pedologia. 2. ed. São Paulo: Oficina de Textos, 2016. Empresa Brasileira de Pesquisa Agropecuária. Solos e Agroecologia. Coleção Transição Agroecológica. Brasília: Embrapa, 2018. Caminhos para o Desenvolvimento Sustentável. 4. ed. Rio de Janeiro: Garamond, 2009.</w:t>
             </w:r>
           </w:p>
         </w:tc>
@@ -14367,7 +16161,20 @@
               <w:rPr>
                 <w:sz w:val="18"/>
               </w:rPr>
-              <w:t>FREIRE, Paulo. Extensão ou comunicação? 5. ed. Rio de Janeiro: Paz e Terra, 1980.</w:t>
+              <w:t xml:space="preserve">FREIRE, Paulo. </w:t>
+            </w:r>
+            <w:r>
+              <w:rPr>
+                <w:b/>
+                <w:sz w:val="18"/>
+              </w:rPr>
+              <w:t>Extensão ou comunicação? 5. ed</w:t>
+            </w:r>
+            <w:r>
+              <w:rPr>
+                <w:sz w:val="18"/>
+              </w:rPr>
+              <w:t>. Rio de Janeiro: Paz e Terra, 1980.</w:t>
             </w:r>
           </w:p>
           <w:p>
@@ -14378,7 +16185,20 @@
               <w:rPr>
                 <w:sz w:val="18"/>
               </w:rPr>
-              <w:t>TAVARES, Christiane Andrade Regis; FREITAS, Katia Siqueira de. Extensão universitária: o patinho feio da academia? Jundiaí, SP: Paco, 2016.</w:t>
+              <w:t xml:space="preserve">TAVARES, Christiane Andrade Regis; FREITAS, Katia Siqueira de. </w:t>
+            </w:r>
+            <w:r>
+              <w:rPr>
+                <w:b/>
+                <w:sz w:val="18"/>
+              </w:rPr>
+              <w:t>Extensão universitária: o patinho feio da academia? Jundiaí, SP: Paco, 2016</w:t>
+            </w:r>
+            <w:r>
+              <w:rPr>
+                <w:sz w:val="18"/>
+              </w:rPr>
+              <w:t>.</w:t>
             </w:r>
           </w:p>
         </w:tc>
@@ -14414,7 +16234,20 @@
               <w:rPr>
                 <w:sz w:val="18"/>
               </w:rPr>
-              <w:t>BOTOMÉ, Silvio Paulo. Pesquisa alienada e ensino alienante: o equívoco da extensão universitária. Petrópolis: Vozes, 1996.</w:t>
+              <w:t xml:space="preserve">BOTOMÉ, Silvio Paulo. </w:t>
+            </w:r>
+            <w:r>
+              <w:rPr>
+                <w:b/>
+                <w:sz w:val="18"/>
+              </w:rPr>
+              <w:t>Pesquisa alienada e ensino alienante: o equívoco da extensão universitária</w:t>
+            </w:r>
+            <w:r>
+              <w:rPr>
+                <w:sz w:val="18"/>
+              </w:rPr>
+              <w:t>. Petrópolis: Vozes, 1996.</w:t>
             </w:r>
           </w:p>
           <w:p>
@@ -14425,7 +16258,20 @@
               <w:rPr>
                 <w:sz w:val="18"/>
               </w:rPr>
-              <w:t>FREIRE, Paulo. Conscientização. São Paulo: Cortez, 1979.</w:t>
+              <w:t xml:space="preserve">FREIRE, Paulo. </w:t>
+            </w:r>
+            <w:r>
+              <w:rPr>
+                <w:b/>
+                <w:sz w:val="18"/>
+              </w:rPr>
+              <w:t>Conscientização</w:t>
+            </w:r>
+            <w:r>
+              <w:rPr>
+                <w:sz w:val="18"/>
+              </w:rPr>
+              <w:t>. São Paulo: Cortez, 1979.</w:t>
             </w:r>
           </w:p>
           <w:p>
@@ -14436,7 +16282,20 @@
               <w:rPr>
                 <w:sz w:val="18"/>
               </w:rPr>
-              <w:t>______. Educação &amp; atualidade brasileira, São Paulo: Cortez, 2001.</w:t>
+              <w:t xml:space="preserve">______. </w:t>
+            </w:r>
+            <w:r>
+              <w:rPr>
+                <w:b/>
+                <w:sz w:val="18"/>
+              </w:rPr>
+              <w:t>Educação &amp; atualidade brasileira</w:t>
+            </w:r>
+            <w:r>
+              <w:rPr>
+                <w:sz w:val="18"/>
+              </w:rPr>
+              <w:t>, São Paulo: Cortez, 2001.</w:t>
             </w:r>
           </w:p>
           <w:p>
@@ -14447,7 +16306,20 @@
               <w:rPr>
                 <w:sz w:val="18"/>
               </w:rPr>
-              <w:t>______. Pedagogia da autonomia. 31. ed. São Paulo: Paz e Terra, 2005.</w:t>
+              <w:t xml:space="preserve">______. </w:t>
+            </w:r>
+            <w:r>
+              <w:rPr>
+                <w:b/>
+                <w:sz w:val="18"/>
+              </w:rPr>
+              <w:t>Pedagogia da autonomia</w:t>
+            </w:r>
+            <w:r>
+              <w:rPr>
+                <w:sz w:val="18"/>
+              </w:rPr>
+              <w:t>. 31. ed. São Paulo: Paz e Terra, 2005.</w:t>
             </w:r>
           </w:p>
           <w:p>
@@ -14458,7 +16330,20 @@
               <w:rPr>
                 <w:sz w:val="18"/>
               </w:rPr>
-              <w:t>SANTOS, Boaventura de Sousa (Org.). Conhecimento prudente para uma vida decente. São Paulo: Cortez, 2004.</w:t>
+              <w:t xml:space="preserve">SANTOS, Boaventura de Sousa (Org.). </w:t>
+            </w:r>
+            <w:r>
+              <w:rPr>
+                <w:b/>
+                <w:sz w:val="18"/>
+              </w:rPr>
+              <w:t>Conhecimento prudente para uma vida decente</w:t>
+            </w:r>
+            <w:r>
+              <w:rPr>
+                <w:sz w:val="18"/>
+              </w:rPr>
+              <w:t>. São Paulo: Cortez, 2004.</w:t>
             </w:r>
           </w:p>
         </w:tc>
@@ -14888,7 +16773,20 @@
               <w:rPr>
                 <w:sz w:val="18"/>
               </w:rPr>
-              <w:t>ASSUMPÇÃO, Luiz Fernando Joly. Sistema de gestão ambiental: manual prático para implementação de SGA e certificação ISO 14.001/2004. 4. ed. rev. e atual. Curitiba: Juruá, 2014.</w:t>
+              <w:t xml:space="preserve">ASSUMPÇÃO, Luiz Fernando Joly. </w:t>
+            </w:r>
+            <w:r>
+              <w:rPr>
+                <w:b/>
+                <w:sz w:val="18"/>
+              </w:rPr>
+              <w:t>Sistema de gestão ambiental: manual prático para implementação de SGA e certificação ISO 14.001/2004</w:t>
+            </w:r>
+            <w:r>
+              <w:rPr>
+                <w:sz w:val="18"/>
+              </w:rPr>
+              <w:t>. 4. ed. rev. e atual. Curitiba: Juruá, 2014.</w:t>
             </w:r>
           </w:p>
           <w:p>
@@ -14899,7 +16797,20 @@
               <w:rPr>
                 <w:sz w:val="18"/>
               </w:rPr>
-              <w:t>PIMENTA, Handson Cláudio Dias; GOUVINHAS, Reidson Pereira. Ferramentas de gestão ambiental: competitividade e sustentabilidade. Natal: Ed. do CEFET-RN, 2007. Disponível em: &lt;https://moodle.ifsc.edu.br/mod/resource/view.php?id=84470&gt;. Acesso em: 28 ago. 2018.</w:t>
+              <w:t xml:space="preserve">PIMENTA, Handson Cláudio Dias; GOUVINHAS, Reidson Pereira. </w:t>
+            </w:r>
+            <w:r>
+              <w:rPr>
+                <w:b/>
+                <w:sz w:val="18"/>
+              </w:rPr>
+              <w:t>Ferramentas de gestão ambiental: competitividade e sustentabilidade</w:t>
+            </w:r>
+            <w:r>
+              <w:rPr>
+                <w:sz w:val="18"/>
+              </w:rPr>
+              <w:t>. Natal: Ed. do CEFET-RN, 2007. Disponível em: &lt;https://moodle.ifsc.edu.br/mod/resource/view.php?id=84470&gt;. Acesso em: 28 ago. 2018.</w:t>
             </w:r>
           </w:p>
         </w:tc>
@@ -14935,7 +16846,20 @@
               <w:rPr>
                 <w:sz w:val="18"/>
               </w:rPr>
-              <w:t>BARBIERI, José Carlos. Gestão ambiental empresarial: conceitos, modelos e instrumentos. 3. ed. atual. e ampl. São Paulo: Saraiva, 2011.</w:t>
+              <w:t xml:space="preserve">BARBIERI, José Carlos. </w:t>
+            </w:r>
+            <w:r>
+              <w:rPr>
+                <w:b/>
+                <w:sz w:val="18"/>
+              </w:rPr>
+              <w:t>Gestão ambiental empresarial: conceitos, modelos e instrumentos</w:t>
+            </w:r>
+            <w:r>
+              <w:rPr>
+                <w:sz w:val="18"/>
+              </w:rPr>
+              <w:t>. 3. ed. atual. e ampl. São Paulo: Saraiva, 2011.</w:t>
             </w:r>
           </w:p>
           <w:p>
@@ -14946,7 +16870,20 @@
               <w:rPr>
                 <w:sz w:val="18"/>
               </w:rPr>
-              <w:t>CAMPOS, L. M. S.; MELO, D. A. Indicadores de desempenho dos Sistemas de Gestão Ambiental (SGA): uma pesquisa teórica. Produção, v. 18, n. 3, p. 540-555, 2008 Disponível em: &lt;https://moodle.ifsc.edu.br/mod/resource/view.php?id=84488&gt;. Acesso em: 28 ago. 2018.</w:t>
+              <w:t xml:space="preserve">CAMPOS, L. M. S.; MELO, D. A. </w:t>
+            </w:r>
+            <w:r>
+              <w:rPr>
+                <w:b/>
+                <w:sz w:val="18"/>
+              </w:rPr>
+              <w:t>Indicadores de desempenho dos Sistemas de Gestão Ambiental (SGA): uma pesquisa teórica</w:t>
+            </w:r>
+            <w:r>
+              <w:rPr>
+                <w:sz w:val="18"/>
+              </w:rPr>
+              <w:t>. Produção, v. 18, n. 3, p. 540-555, 2008 Disponível em: &lt;https://moodle.ifsc.edu.br/mod/resource/view.php?id=84488&gt;. Acesso em: 28 ago. 2018.</w:t>
             </w:r>
           </w:p>
           <w:p>
@@ -14957,7 +16894,20 @@
               <w:rPr>
                 <w:sz w:val="18"/>
               </w:rPr>
-              <w:t>MARTINS, M. de F. et al. O ecodesign como ferramenta de gestão ambiental aplicada ao setor da construção civil: o caso de um condomínio horizontal com proposta sustentável em Campina Grande - PB. Revista Ciências Administrativas, Fortaleza, v. 17, n. 3, p. 883-914, set./dez. 2011. Disponível em: &lt;https://moodle.ifsc.edu.br/mod/resource/view.php?id=84500&gt;. Acesso em: 28 ago. 2018.</w:t>
+              <w:t xml:space="preserve">MARTINS, M. de F. et al. </w:t>
+            </w:r>
+            <w:r>
+              <w:rPr>
+                <w:b/>
+                <w:sz w:val="18"/>
+              </w:rPr>
+              <w:t>O ecodesign como ferramenta de gestão ambiental aplicada ao setor da construção civil: o caso de um condomínio horizontal com proposta sustentável em Campina Grande - PB</w:t>
+            </w:r>
+            <w:r>
+              <w:rPr>
+                <w:sz w:val="18"/>
+              </w:rPr>
+              <w:t>. Revista Ciências Administrativas, Fortaleza, v. 17, n. 3, p. 883-914, set./dez. 2011. Disponível em: &lt;https://moodle.ifsc.edu.br/mod/resource/view.php?id=84500&gt;. Acesso em: 28 ago. 2018.</w:t>
             </w:r>
           </w:p>
           <w:p>
@@ -14968,7 +16918,20 @@
               <w:rPr>
                 <w:sz w:val="18"/>
               </w:rPr>
-              <w:t>SÁNCHEZ, Luis Enrique. Avaliação de impacto ambiental: conceitos e métodos. 2. ed. atual. ampl. São Paulo: Oficina de Textos, 2013.</w:t>
+              <w:t xml:space="preserve">SÁNCHEZ, Luis Enrique. </w:t>
+            </w:r>
+            <w:r>
+              <w:rPr>
+                <w:b/>
+                <w:sz w:val="18"/>
+              </w:rPr>
+              <w:t>Avaliação de impacto ambiental: conceitos e métodos</w:t>
+            </w:r>
+            <w:r>
+              <w:rPr>
+                <w:sz w:val="18"/>
+              </w:rPr>
+              <w:t>. 2. ed. atual. ampl. São Paulo: Oficina de Textos, 2013.</w:t>
             </w:r>
           </w:p>
         </w:tc>
@@ -15421,7 +17384,20 @@
               <w:rPr>
                 <w:sz w:val="18"/>
               </w:rPr>
-              <w:t>MACHADO, Paulo Affonso Leme. Direito ambiental brasileiro. 26. ed., rev.,ampl. e atual. São Paulo: Malheiros, 2018. 1430 p.. ISBN 9788539204014.</w:t>
+              <w:t xml:space="preserve">MACHADO, Paulo Affonso Leme. </w:t>
+            </w:r>
+            <w:r>
+              <w:rPr>
+                <w:b/>
+                <w:sz w:val="18"/>
+              </w:rPr>
+              <w:t>Direito ambiental brasileiro</w:t>
+            </w:r>
+            <w:r>
+              <w:rPr>
+                <w:sz w:val="18"/>
+              </w:rPr>
+              <w:t>. 26. ed., rev.,ampl. e atual. São Paulo: Malheiros, 2018. 1430 p.. ISBN 9788539204014.</w:t>
             </w:r>
           </w:p>
           <w:p>
@@ -15432,7 +17408,20 @@
               <w:rPr>
                 <w:sz w:val="18"/>
               </w:rPr>
-              <w:t>TRENNEPOHL, Curt; TRENNEPOHL, Natascha; Terence. Legislação Ambiental Comentada. 2º ed. Ed. Revista dos Tribunais, 2024. 536p. ISBN ‎ 6526029841.</w:t>
+              <w:t xml:space="preserve">TRENNEPOHL, Curt; TRENNEPOHL, Natascha; Terence. </w:t>
+            </w:r>
+            <w:r>
+              <w:rPr>
+                <w:b/>
+                <w:sz w:val="18"/>
+              </w:rPr>
+              <w:t>Legislação Ambiental Comentada</w:t>
+            </w:r>
+            <w:r>
+              <w:rPr>
+                <w:sz w:val="18"/>
+              </w:rPr>
+              <w:t>. 2º ed. Ed. Revista dos Tribunais, 2024. 536p. ISBN ‎ 6526029841.</w:t>
             </w:r>
           </w:p>
         </w:tc>
@@ -15468,7 +17457,20 @@
               <w:rPr>
                 <w:sz w:val="18"/>
               </w:rPr>
-              <w:t>DIAS, Reinaldo. Gestão ambiental: responsabilidade social e sustentabilidade. 3. ed. São Paulo: Atlas, 2017. 234 p.  ISBN 9788597010336.</w:t>
+              <w:t xml:space="preserve">DIAS, Reinaldo. </w:t>
+            </w:r>
+            <w:r>
+              <w:rPr>
+                <w:b/>
+                <w:sz w:val="18"/>
+              </w:rPr>
+              <w:t>Gestão ambiental: responsabilidade social e sustentabilidade</w:t>
+            </w:r>
+            <w:r>
+              <w:rPr>
+                <w:sz w:val="18"/>
+              </w:rPr>
+              <w:t>. 3. ed. São Paulo: Atlas, 2017. 234 p.  ISBN 9788597010336.</w:t>
             </w:r>
           </w:p>
           <w:p>
@@ -15479,7 +17481,20 @@
               <w:rPr>
                 <w:sz w:val="18"/>
               </w:rPr>
-              <w:t>FREITAS, Mariana Almeida Passos de. Zona costeira e meio ambiente: aspectos jurídicos. 5. reimp. Curitiba: Juruá, 2005. 231 p., il. ISBN 8536209720.</w:t>
+              <w:t xml:space="preserve">FREITAS, Mariana Almeida Passos de. </w:t>
+            </w:r>
+            <w:r>
+              <w:rPr>
+                <w:b/>
+                <w:sz w:val="18"/>
+              </w:rPr>
+              <w:t>Zona costeira e meio ambiente: aspectos jurídicos</w:t>
+            </w:r>
+            <w:r>
+              <w:rPr>
+                <w:sz w:val="18"/>
+              </w:rPr>
+              <w:t>. 5. reimp. Curitiba: Juruá, 2005. 231 p., il. ISBN 8536209720.</w:t>
             </w:r>
           </w:p>
           <w:p>
@@ -15490,7 +17505,20 @@
               <w:rPr>
                 <w:sz w:val="18"/>
               </w:rPr>
-              <w:t>GRANZIERA, Maria Luiza Machado. Direito de águas: disciplina jurídica das águas doces. 3. ed. rev. e atual. São Paulo: Atlas, 2006. 252 p. ISBN 8522444560.</w:t>
+              <w:t xml:space="preserve">GRANZIERA, Maria Luiza Machado. </w:t>
+            </w:r>
+            <w:r>
+              <w:rPr>
+                <w:b/>
+                <w:sz w:val="18"/>
+              </w:rPr>
+              <w:t>Direito de águas: disciplina jurídica das águas doces</w:t>
+            </w:r>
+            <w:r>
+              <w:rPr>
+                <w:sz w:val="18"/>
+              </w:rPr>
+              <w:t>. 3. ed. rev. e atual. São Paulo: Atlas, 2006. 252 p. ISBN 8522444560.</w:t>
             </w:r>
           </w:p>
         </w:tc>
@@ -15876,7 +17904,20 @@
               <w:rPr>
                 <w:sz w:val="18"/>
               </w:rPr>
-              <w:t>GIL, Antonio Carlos. Como elaborar projetos de pesquisa. São Paulo: Atlas, 2017.</w:t>
+              <w:t xml:space="preserve">GIL, Antonio Carlos. </w:t>
+            </w:r>
+            <w:r>
+              <w:rPr>
+                <w:b/>
+                <w:sz w:val="18"/>
+              </w:rPr>
+              <w:t>Como elaborar projetos de pesquisa</w:t>
+            </w:r>
+            <w:r>
+              <w:rPr>
+                <w:sz w:val="18"/>
+              </w:rPr>
+              <w:t>. São Paulo: Atlas, 2017.</w:t>
             </w:r>
           </w:p>
           <w:p>
@@ -15887,7 +17928,20 @@
               <w:rPr>
                 <w:sz w:val="18"/>
               </w:rPr>
-              <w:t>LAKATOS, Eva Maria; MARCONI, Marina de Andrade. Fundamentos de metodologia científica. 9. ed. São Paulo: Atlas, 2021.</w:t>
+              <w:t xml:space="preserve">LAKATOS, Eva Maria; MARCONI, Marina de Andrade. </w:t>
+            </w:r>
+            <w:r>
+              <w:rPr>
+                <w:b/>
+                <w:sz w:val="18"/>
+              </w:rPr>
+              <w:t>Fundamentos de metodologia científica</w:t>
+            </w:r>
+            <w:r>
+              <w:rPr>
+                <w:sz w:val="18"/>
+              </w:rPr>
+              <w:t>. 9. ed. São Paulo: Atlas, 2021.</w:t>
             </w:r>
           </w:p>
           <w:p>
@@ -15898,7 +17952,20 @@
               <w:rPr>
                 <w:sz w:val="18"/>
               </w:rPr>
-              <w:t>SEVERINO, Antônio Joaquim. Metodologia do trabalho científico. São Paulo: Cortez, 2017.</w:t>
+              <w:t xml:space="preserve">SEVERINO, Antônio Joaquim. </w:t>
+            </w:r>
+            <w:r>
+              <w:rPr>
+                <w:b/>
+                <w:sz w:val="18"/>
+              </w:rPr>
+              <w:t>Metodologia do trabalho científico</w:t>
+            </w:r>
+            <w:r>
+              <w:rPr>
+                <w:sz w:val="18"/>
+              </w:rPr>
+              <w:t>. São Paulo: Cortez, 2017.</w:t>
             </w:r>
           </w:p>
         </w:tc>
@@ -15934,7 +18001,20 @@
               <w:rPr>
                 <w:sz w:val="18"/>
               </w:rPr>
-              <w:t>CRESWELL, John W. Projeto de pesquisa: métodos qualitativo, quantitativo e misto. Porto Alegre: Artmed, 2010.</w:t>
+              <w:t xml:space="preserve">CRESWELL, John W. </w:t>
+            </w:r>
+            <w:r>
+              <w:rPr>
+                <w:b/>
+                <w:sz w:val="18"/>
+              </w:rPr>
+              <w:t>Projeto de pesquisa: métodos qualitativo, quantitativo e misto</w:t>
+            </w:r>
+            <w:r>
+              <w:rPr>
+                <w:sz w:val="18"/>
+              </w:rPr>
+              <w:t>. Porto Alegre: Artmed, 2010.</w:t>
             </w:r>
           </w:p>
           <w:p>
@@ -15945,7 +18025,20 @@
               <w:rPr>
                 <w:sz w:val="18"/>
               </w:rPr>
-              <w:t>GIL, Antonio Carlos. Métodos e técnicas de pesquisa social. São Paulo: Atlas, 2019.</w:t>
+              <w:t xml:space="preserve">GIL, Antonio Carlos. </w:t>
+            </w:r>
+            <w:r>
+              <w:rPr>
+                <w:b/>
+                <w:sz w:val="18"/>
+              </w:rPr>
+              <w:t>Métodos e técnicas de pesquisa social</w:t>
+            </w:r>
+            <w:r>
+              <w:rPr>
+                <w:sz w:val="18"/>
+              </w:rPr>
+              <w:t>. São Paulo: Atlas, 2019.</w:t>
             </w:r>
           </w:p>
           <w:p>
@@ -15956,7 +18049,20 @@
               <w:rPr>
                 <w:sz w:val="18"/>
               </w:rPr>
-              <w:t>MARCONI, Marina de Andrade; LAKATOS, Eva Maria. Técnicas de pesquisa. São Paulo: Atlas, 2017.</w:t>
+              <w:t xml:space="preserve">MARCONI, Marina de Andrade; LAKATOS, Eva Maria. </w:t>
+            </w:r>
+            <w:r>
+              <w:rPr>
+                <w:b/>
+                <w:sz w:val="18"/>
+              </w:rPr>
+              <w:t>Técnicas de pesquisa</w:t>
+            </w:r>
+            <w:r>
+              <w:rPr>
+                <w:sz w:val="18"/>
+              </w:rPr>
+              <w:t>. São Paulo: Atlas, 2017.</w:t>
             </w:r>
           </w:p>
           <w:p>
@@ -15967,7 +18073,20 @@
               <w:rPr>
                 <w:sz w:val="18"/>
               </w:rPr>
-              <w:t>YIN, Robert K. Estudo de caso: planejamento e métodos. Porto Alegre: Bookman, 2015.</w:t>
+              <w:t xml:space="preserve">YIN, Robert K. </w:t>
+            </w:r>
+            <w:r>
+              <w:rPr>
+                <w:b/>
+                <w:sz w:val="18"/>
+              </w:rPr>
+              <w:t>Estudo de caso: planejamento e métodos</w:t>
+            </w:r>
+            <w:r>
+              <w:rPr>
+                <w:sz w:val="18"/>
+              </w:rPr>
+              <w:t>. Porto Alegre: Bookman, 2015.</w:t>
             </w:r>
           </w:p>
           <w:p>
@@ -15978,7 +18097,20 @@
               <w:rPr>
                 <w:sz w:val="18"/>
               </w:rPr>
-              <w:t>PRODANOV, Cleber Cristiano; FREITAS, Ernani Cesar de. Metodologia do trabalho científico: métodos e técnicas da pesquisa e do trabalho acadêmico. Novo Hamburgo: Feevale, 2013.</w:t>
+              <w:t xml:space="preserve">PRODANOV, Cleber Cristiano; FREITAS, Ernani Cesar de. </w:t>
+            </w:r>
+            <w:r>
+              <w:rPr>
+                <w:b/>
+                <w:sz w:val="18"/>
+              </w:rPr>
+              <w:t>Metodologia do trabalho científico: métodos e técnicas da pesquisa e do trabalho acadêmico</w:t>
+            </w:r>
+            <w:r>
+              <w:rPr>
+                <w:sz w:val="18"/>
+              </w:rPr>
+              <w:t>. Novo Hamburgo: Feevale, 2013.</w:t>
             </w:r>
           </w:p>
         </w:tc>
@@ -16452,7 +18584,20 @@
               <w:rPr>
                 <w:sz w:val="18"/>
               </w:rPr>
-              <w:t>LIBÂNIO, Marcelo. Fundamentos de qualidade e tratamento de água. 3. ed. Campinas, SP: Átomo, 2010.</w:t>
+              <w:t xml:space="preserve">LIBÂNIO, Marcelo. </w:t>
+            </w:r>
+            <w:r>
+              <w:rPr>
+                <w:b/>
+                <w:sz w:val="18"/>
+              </w:rPr>
+              <w:t>Fundamentos de qualidade e tratamento de água</w:t>
+            </w:r>
+            <w:r>
+              <w:rPr>
+                <w:sz w:val="18"/>
+              </w:rPr>
+              <w:t>. 3. ed. Campinas, SP: Átomo, 2010.</w:t>
             </w:r>
           </w:p>
           <w:p>
@@ -16463,7 +18608,20 @@
               <w:rPr>
                 <w:sz w:val="18"/>
               </w:rPr>
-              <w:t>NUVOLARI, Ariovaldo. Esgoto sanitário: coleta, transporte, tratamento e reúso agrícola. 2. ed. São Paulo: Blucher, 2011.</w:t>
+              <w:t xml:space="preserve">NUVOLARI, Ariovaldo. </w:t>
+            </w:r>
+            <w:r>
+              <w:rPr>
+                <w:b/>
+                <w:sz w:val="18"/>
+              </w:rPr>
+              <w:t>Esgoto sanitário: coleta, transporte, tratamento e reúso agrícola</w:t>
+            </w:r>
+            <w:r>
+              <w:rPr>
+                <w:sz w:val="18"/>
+              </w:rPr>
+              <w:t>. 2. ed. São Paulo: Blucher, 2011.</w:t>
             </w:r>
           </w:p>
         </w:tc>
@@ -16499,7 +18657,20 @@
               <w:rPr>
                 <w:sz w:val="18"/>
               </w:rPr>
-              <w:t>SPERLING, Marcos Von. Introdução à qualidade das águas e ao tratamento de esgotos: princípios do tratamento biológico de águas residuárias. 3. ed. Belo Horizonte: Ed. da UFMG, 2005.</w:t>
+              <w:t xml:space="preserve">SPERLING, Marcos Von. </w:t>
+            </w:r>
+            <w:r>
+              <w:rPr>
+                <w:b/>
+                <w:sz w:val="18"/>
+              </w:rPr>
+              <w:t>Introdução à qualidade das águas e ao tratamento de esgotos: princípios do tratamento biológico de águas residuárias</w:t>
+            </w:r>
+            <w:r>
+              <w:rPr>
+                <w:sz w:val="18"/>
+              </w:rPr>
+              <w:t>. 3. ed. Belo Horizonte: Ed. da UFMG, 2005.</w:t>
             </w:r>
           </w:p>
           <w:p>
@@ -16510,7 +18681,20 @@
               <w:rPr>
                 <w:sz w:val="18"/>
               </w:rPr>
-              <w:t>SPERLING, Marcos Von. Princípios básicos do tratamento de esgotos. Belo Horizonte: Ed. UFMG, 1996. v. 2. (Princípios do tratamento biológico de águas residuais, 2).</w:t>
+              <w:t xml:space="preserve">SPERLING, Marcos Von. </w:t>
+            </w:r>
+            <w:r>
+              <w:rPr>
+                <w:b/>
+                <w:sz w:val="18"/>
+              </w:rPr>
+              <w:t>Princípios básicos do tratamento de esgotos</w:t>
+            </w:r>
+            <w:r>
+              <w:rPr>
+                <w:sz w:val="18"/>
+              </w:rPr>
+              <w:t>. Belo Horizonte: Ed. UFMG, 1996. v. 2. (Princípios do tratamento biológico de águas residuais, 2).</w:t>
             </w:r>
           </w:p>
         </w:tc>
@@ -16940,7 +19124,20 @@
               <w:rPr>
                 <w:sz w:val="18"/>
               </w:rPr>
-              <w:t>ALMEIDA, F. S.; GARRIDO, F de S. R. G; ALMEIDA, A. A. Avaliação de impactos ambientais: uma introdução ao tema com ênfase na atuação do gestor ambiental. Diversidade e Gestão, Rio de Janeiro, v. 1, p. 70-87, jul. 2017. Disponível em: &lt;https://moodle.ifsc.edu.br/mod/resource/view.php?id=84539&gt;. Acesso em: 28 ago. 2018.</w:t>
+              <w:t xml:space="preserve">ALMEIDA, F. S.; GARRIDO, F de S. R. G; ALMEIDA, A. A. </w:t>
+            </w:r>
+            <w:r>
+              <w:rPr>
+                <w:b/>
+                <w:sz w:val="18"/>
+              </w:rPr>
+              <w:t>Avaliação de impactos ambientais: uma introdução ao tema com ênfase na atuação do gestor ambiental</w:t>
+            </w:r>
+            <w:r>
+              <w:rPr>
+                <w:sz w:val="18"/>
+              </w:rPr>
+              <w:t>. Diversidade e Gestão, Rio de Janeiro, v. 1, p. 70-87, jul. 2017. Disponível em: &lt;https://moodle.ifsc.edu.br/mod/resource/view.php?id=84539&gt;. Acesso em: 28 ago. 2018.</w:t>
             </w:r>
           </w:p>
           <w:p>
@@ -16951,7 +19148,20 @@
               <w:rPr>
                 <w:sz w:val="18"/>
               </w:rPr>
-              <w:t>SÁNCHEZ, Luis Enrique. Avaliação de impacto ambiental: conceitos e métodos. 2. ed. atual. ampl. São Paulo: Oficina de Textos, 2013.</w:t>
+              <w:t xml:space="preserve">SÁNCHEZ, Luis Enrique. </w:t>
+            </w:r>
+            <w:r>
+              <w:rPr>
+                <w:b/>
+                <w:sz w:val="18"/>
+              </w:rPr>
+              <w:t>Avaliação de impacto ambiental: conceitos e métodos</w:t>
+            </w:r>
+            <w:r>
+              <w:rPr>
+                <w:sz w:val="18"/>
+              </w:rPr>
+              <w:t>. 2. ed. atual. ampl. São Paulo: Oficina de Textos, 2013.</w:t>
             </w:r>
           </w:p>
         </w:tc>
@@ -16987,7 +19197,20 @@
               <w:rPr>
                 <w:sz w:val="18"/>
               </w:rPr>
-              <w:t>CREMONEZ, F. E. et al. Avaliação de impacto ambiental: metodologias aplicadas no Brasil. Revista Monografias Ambientais, Santa Maria, RS, v. 13, n. 5, p. 3821–3830, dez. 2014. Disponível em:  &lt;https://moodle.ifsc.edu.br/mod/resource/view.php?id=84540&gt;. Acesso em: 28 ago. 2018.</w:t>
+              <w:t xml:space="preserve">CREMONEZ, F. E. et al. </w:t>
+            </w:r>
+            <w:r>
+              <w:rPr>
+                <w:b/>
+                <w:sz w:val="18"/>
+              </w:rPr>
+              <w:t>Avaliação de impacto ambiental: metodologias aplicadas no Brasil</w:t>
+            </w:r>
+            <w:r>
+              <w:rPr>
+                <w:sz w:val="18"/>
+              </w:rPr>
+              <w:t>. Revista Monografias Ambientais, Santa Maria, RS, v. 13, n. 5, p. 3821–3830, dez. 2014. Disponível em:  &lt;https://moodle.ifsc.edu.br/mod/resource/view.php?id=84540&gt;. Acesso em: 28 ago. 2018.</w:t>
             </w:r>
           </w:p>
           <w:p>
@@ -16998,7 +19221,20 @@
               <w:rPr>
                 <w:sz w:val="18"/>
               </w:rPr>
-              <w:t>OLIVEIRA, F. F. G. de; MEDEIROS, W. D. de A. Bases teórico-conceitual de métodos para avaliação de impactos ambientais em EIA/RIMA. Mercator, Fortaleza, v. 6, n. 11, p. 79-92, nov. 2008.  Disponível em: &lt;https://moodle.ifsc.edu.br/mod/resource/view.php?id=84550&gt;. Acesso em: 28 ago. 2018.</w:t>
+              <w:t xml:space="preserve">OLIVEIRA, F. F. G. de; MEDEIROS, W. D. de A. </w:t>
+            </w:r>
+            <w:r>
+              <w:rPr>
+                <w:b/>
+                <w:sz w:val="18"/>
+              </w:rPr>
+              <w:t>Bases teórico-conceitual de métodos para avaliação de impactos ambientais em EIA/RIMA</w:t>
+            </w:r>
+            <w:r>
+              <w:rPr>
+                <w:sz w:val="18"/>
+              </w:rPr>
+              <w:t>. Mercator, Fortaleza, v. 6, n. 11, p. 79-92, nov. 2008.  Disponível em: &lt;https://moodle.ifsc.edu.br/mod/resource/view.php?id=84550&gt;. Acesso em: 28 ago. 2018.</w:t>
             </w:r>
           </w:p>
         </w:tc>
@@ -17573,7 +19809,20 @@
               <w:rPr>
                 <w:sz w:val="18"/>
               </w:rPr>
-              <w:t>BESSANT, John; TIDD, Joe; COSTA, Francisco Araújo da. Inovação e empreendedorismo. 3. ed. Porto Alegre: Bookman, 2019.</w:t>
+              <w:t xml:space="preserve">BESSANT, John; TIDD, Joe; COSTA, Francisco Araújo da. </w:t>
+            </w:r>
+            <w:r>
+              <w:rPr>
+                <w:b/>
+                <w:sz w:val="18"/>
+              </w:rPr>
+              <w:t>Inovação e empreendedorismo</w:t>
+            </w:r>
+            <w:r>
+              <w:rPr>
+                <w:sz w:val="18"/>
+              </w:rPr>
+              <w:t>. 3. ed. Porto Alegre: Bookman, 2019.</w:t>
             </w:r>
           </w:p>
           <w:p>
@@ -17584,7 +19833,20 @@
               <w:rPr>
                 <w:sz w:val="18"/>
               </w:rPr>
-              <w:t>DORNELAS, José Carlos Assis. Empreendedorismo: transformando idéias em negócios. 3. ed. rev. e atual. Rio de Janeiro: Elsevier, 2008.</w:t>
+              <w:t xml:space="preserve">DORNELAS, José Carlos Assis. </w:t>
+            </w:r>
+            <w:r>
+              <w:rPr>
+                <w:b/>
+                <w:sz w:val="18"/>
+              </w:rPr>
+              <w:t>Empreendedorismo: transformando idéias em negócios</w:t>
+            </w:r>
+            <w:r>
+              <w:rPr>
+                <w:sz w:val="18"/>
+              </w:rPr>
+              <w:t>. 3. ed. rev. e atual. Rio de Janeiro: Elsevier, 2008.</w:t>
             </w:r>
           </w:p>
           <w:p>
@@ -17595,7 +19857,20 @@
               <w:rPr>
                 <w:sz w:val="18"/>
               </w:rPr>
-              <w:t>HISRICH, Robert D.; PETERS, Michael P.; SHEPHERD, Dean A. Empreendedorismo. Tradução de Francisco Araujo da Costa. 9. ed. Porto Alegre: AMGH, 2014.</w:t>
+              <w:t xml:space="preserve">HISRICH, Robert D.; PETERS, Michael P.; SHEPHERD, Dean A. </w:t>
+            </w:r>
+            <w:r>
+              <w:rPr>
+                <w:b/>
+                <w:sz w:val="18"/>
+              </w:rPr>
+              <w:t>Empreendedorismo</w:t>
+            </w:r>
+            <w:r>
+              <w:rPr>
+                <w:sz w:val="18"/>
+              </w:rPr>
+              <w:t>. Tradução de Francisco Araujo da Costa. 9. ed. Porto Alegre: AMGH, 2014.</w:t>
             </w:r>
           </w:p>
           <w:p>
@@ -17606,7 +19881,20 @@
               <w:rPr>
                 <w:sz w:val="18"/>
               </w:rPr>
-              <w:t>OLIVEIRA, Edson Marques. Empreendedorismo social: da teoria à prática, do sonho à realidade. Rio de Janeiro: Qualitymark, 2008.</w:t>
+              <w:t xml:space="preserve">OLIVEIRA, Edson Marques. </w:t>
+            </w:r>
+            <w:r>
+              <w:rPr>
+                <w:b/>
+                <w:sz w:val="18"/>
+              </w:rPr>
+              <w:t>Empreendedorismo social: da teoria à prática, do sonho à realidade</w:t>
+            </w:r>
+            <w:r>
+              <w:rPr>
+                <w:sz w:val="18"/>
+              </w:rPr>
+              <w:t>. Rio de Janeiro: Qualitymark, 2008.</w:t>
             </w:r>
           </w:p>
           <w:p>
@@ -17617,7 +19905,20 @@
               <w:rPr>
                 <w:sz w:val="18"/>
               </w:rPr>
-              <w:t>OSTERWALDER, Alexander; PIGNEUR, Yves. Business model generation = inovação em modelos de negócios : um manual para visionários, inovadores e revolucionários. Rio de Janeiro: Alta Books, 2011.</w:t>
+              <w:t xml:space="preserve">OSTERWALDER, Alexander; PIGNEUR, Yves. </w:t>
+            </w:r>
+            <w:r>
+              <w:rPr>
+                <w:b/>
+                <w:sz w:val="18"/>
+              </w:rPr>
+              <w:t>Business model generation = inovação em modelos de negócios : um manual para visionários, inovadores e revolucionários</w:t>
+            </w:r>
+            <w:r>
+              <w:rPr>
+                <w:sz w:val="18"/>
+              </w:rPr>
+              <w:t>. Rio de Janeiro: Alta Books, 2011.</w:t>
             </w:r>
           </w:p>
         </w:tc>
@@ -17653,7 +19954,20 @@
               <w:rPr>
                 <w:sz w:val="18"/>
               </w:rPr>
-              <w:t>BERNARDI, Luiz Antonio. Manual de empreendedorismo e gestão: fundamentos, estratégias e dinâmicas. 2. ed. São Paulo: Atlas, 2012.</w:t>
+              <w:t xml:space="preserve">BERNARDI, Luiz Antonio. </w:t>
+            </w:r>
+            <w:r>
+              <w:rPr>
+                <w:b/>
+                <w:sz w:val="18"/>
+              </w:rPr>
+              <w:t>Manual de empreendedorismo e gestão: fundamentos, estratégias e dinâmicas</w:t>
+            </w:r>
+            <w:r>
+              <w:rPr>
+                <w:sz w:val="18"/>
+              </w:rPr>
+              <w:t>. 2. ed. São Paulo: Atlas, 2012.</w:t>
             </w:r>
           </w:p>
           <w:p>
@@ -17664,7 +19978,20 @@
               <w:rPr>
                 <w:sz w:val="18"/>
               </w:rPr>
-              <w:t>DORNELAS, José Carlos Assis. Empreendedorismo corporativo: como ser empreendedor, inovar e se diferenciar na sua empresa. 2. ed. Rio de Janeiro: Elsevier, 2008.</w:t>
+              <w:t xml:space="preserve">DORNELAS, José Carlos Assis. </w:t>
+            </w:r>
+            <w:r>
+              <w:rPr>
+                <w:b/>
+                <w:sz w:val="18"/>
+              </w:rPr>
+              <w:t>Empreendedorismo corporativo: como ser empreendedor, inovar e se diferenciar na sua empresa</w:t>
+            </w:r>
+            <w:r>
+              <w:rPr>
+                <w:sz w:val="18"/>
+              </w:rPr>
+              <w:t>. 2. ed. Rio de Janeiro: Elsevier, 2008.</w:t>
             </w:r>
           </w:p>
           <w:p>
@@ -17675,7 +20002,20 @@
               <w:rPr>
                 <w:sz w:val="18"/>
               </w:rPr>
-              <w:t>OLIVEIRA, Djalma de Pinho Rebouças de. Empreendedorismo: vocação, capacitação e atuação direcionadas para o plano de negócios. São Paulo: Editora Atlas, 2014.</w:t>
+              <w:t xml:space="preserve">OLIVEIRA, Djalma de Pinho Rebouças de. </w:t>
+            </w:r>
+            <w:r>
+              <w:rPr>
+                <w:b/>
+                <w:sz w:val="18"/>
+              </w:rPr>
+              <w:t>Empreendedorismo: vocação, capacitação e atuação direcionadas para o plano de negócios</w:t>
+            </w:r>
+            <w:r>
+              <w:rPr>
+                <w:sz w:val="18"/>
+              </w:rPr>
+              <w:t>. São Paulo: Editora Atlas, 2014.</w:t>
             </w:r>
           </w:p>
         </w:tc>
@@ -18083,7 +20423,20 @@
               <w:rPr>
                 <w:sz w:val="18"/>
               </w:rPr>
-              <w:t>BRASIL. Lei nº 15.190, de 8 de agosto de 2025. Dispõe sobre o licenciamento ambiental; regulamenta o inciso IV do § 1º do art. 225 da Constituição Federal; altera as Leis nºs 9.605, de 12 de fevereiro de 1998 (Lei dos Crimes Ambientais), 9.985, de 18 de julho de 2000, e 6.938, de 31 de agosto de 1981; revoga dispositivos das Leis nºs 7.661, de 16 de maio de 1988, e 11.428, de 22 de dezembro de 2006; e dá outras providências. Disponível em: https://www.planalto.gov.br/ccivil_03/_ato2023-2026/2025/lei/l15190.htm. Acesso em: 15 jul. 2026. CONSELHO NACIONAL DO MEIO AMBIENTE. Resolução CONAMA nº 237, de 19 de dezembro de 1997. Dispõe sobre a revisão e complementação dos procedimentos e critérios utilizados para o licenciamento ambiental. Disponível em: https://conama.mma.gov.br/?option=com_sisconama&amp;task=arquivo.download&amp;id=237. Acesso em: 15 jul. 2026. CONSELHO ESTADUAL DO MEIO AMBIENTE (CONSEMA). Resolução CONSEMA nº 250, de 08 de agosto de 2024. Aprova, nos termos do inciso XIII, do art. 12, da Lei nº 14.675, de 13 de abril de 2009, a listagem das atividades sujeitas ao licenciamento ambiental, define os estudos ambientais necessários e estabelece outras providências. Disponível em: https://www.semae.sc.gov.br/download/resolucao-consema-no-250/ . Acesso em: 15 jul. 2026.</w:t>
+              <w:t xml:space="preserve">BRASIL. </w:t>
+            </w:r>
+            <w:r>
+              <w:rPr>
+                <w:b/>
+                <w:sz w:val="18"/>
+              </w:rPr>
+              <w:t>Lei nº 15.190, de 8 de agosto de 2025</w:t>
+            </w:r>
+            <w:r>
+              <w:rPr>
+                <w:sz w:val="18"/>
+              </w:rPr>
+              <w:t>. Dispõe sobre o licenciamento ambiental; regulamenta o inciso IV do § 1º do art. 225 da Constituição Federal; altera as Leis nºs 9.605, de 12 de fevereiro de 1998 (Lei dos Crimes Ambientais), 9.985, de 18 de julho de 2000, e 6.938, de 31 de agosto de 1981; revoga dispositivos das Leis nºs 7.661, de 16 de maio de 1988, e 11.428, de 22 de dezembro de 2006; e dá outras providências. Disponível em: https://www.planalto.gov.br/ccivil_03/_ato2023-2026/2025/lei/l15190.htm. Acesso em: 15 jul. 2026. CONSELHO NACIONAL DO MEIO AMBIENTE. Resolução CONAMA nº 237, de 19 de dezembro de 1997. Dispõe sobre a revisão e complementação dos procedimentos e critérios utilizados para o licenciamento ambiental. Disponível em: https://conama.mma.gov.br/?option=com_sisconama&amp;task=arquivo.download&amp;id=237. Acesso em: 15 jul. 2026. CONSELHO ESTADUAL DO MEIO AMBIENTE (CONSEMA). Resolução CONSEMA nº 250, de 08 de agosto de 2024. Aprova, nos termos do inciso XIII, do art. 12, da Lei nº 14.675, de 13 de abril de 2009, a listagem das atividades sujeitas ao licenciamento ambiental, define os estudos ambientais necessários e estabelece outras providências. Disponível em: https://www.semae.sc.gov.br/download/resolucao-consema-no-250/ . Acesso em: 15 jul. 2026.</w:t>
             </w:r>
           </w:p>
         </w:tc>
@@ -18119,7 +20472,20 @@
               <w:rPr>
                 <w:sz w:val="18"/>
               </w:rPr>
-              <w:t>BRASIL. Tribunal de Contas da União. Cartilha de licenciamento ambiental. Brasília, DF, 2004. Disponível em: &lt;https://moodle.ifsc.edu.br/mod/resource/view.php?id=84576&gt;. Acesso em: 28 ago. 2018. CONSELHO NACIONAL DO MEIO AMBIENTE. Legislação ambiental federal. Disponível em &lt;http://www2.mma.gov.br/port/conama/legi.cfm&gt;. Acesso em: 28 ago. 2018.</w:t>
+              <w:t xml:space="preserve">BRASIL. </w:t>
+            </w:r>
+            <w:r>
+              <w:rPr>
+                <w:b/>
+                <w:sz w:val="18"/>
+              </w:rPr>
+              <w:t>Tribunal de Contas da União</w:t>
+            </w:r>
+            <w:r>
+              <w:rPr>
+                <w:sz w:val="18"/>
+              </w:rPr>
+              <w:t>. Cartilha de licenciamento ambiental. Brasília, DF, 2004. Disponível em: &lt;https://moodle.ifsc.edu.br/mod/resource/view.php?id=84576&gt;. Acesso em: 28 ago. 2018. CONSELHO NACIONAL DO MEIO AMBIENTE. Legislação ambiental federal. Disponível em &lt;http://www2.mma.gov.br/port/conama/legi.cfm&gt;. Acesso em: 28 ago. 2018.</w:t>
             </w:r>
           </w:p>
           <w:p>
@@ -18130,7 +20496,20 @@
               <w:rPr>
                 <w:sz w:val="18"/>
               </w:rPr>
-              <w:t>______. Resoluções do CONAMA. Brasília, DF: MMA, 2012. Disponível em: &lt;https://moodle.ifsc.edu.br/mod/resource/view.php?id=84571&gt;. Acesso em: 28 ago. 2018.</w:t>
+              <w:t xml:space="preserve">______. </w:t>
+            </w:r>
+            <w:r>
+              <w:rPr>
+                <w:b/>
+                <w:sz w:val="18"/>
+              </w:rPr>
+              <w:t>Resoluções do CONAMA</w:t>
+            </w:r>
+            <w:r>
+              <w:rPr>
+                <w:sz w:val="18"/>
+              </w:rPr>
+              <w:t>. Brasília, DF: MMA, 2012. Disponível em: &lt;https://moodle.ifsc.edu.br/mod/resource/view.php?id=84571&gt;. Acesso em: 28 ago. 2018.</w:t>
             </w:r>
           </w:p>
         </w:tc>
@@ -18516,7 +20895,20 @@
               <w:rPr>
                 <w:sz w:val="18"/>
               </w:rPr>
-              <w:t>DESENVOLVIMENTO sustentável do turismo: uma compilação de boas práticas. São Paulo: Roca, 2005. 175 p. ISBN 8572415734.</w:t>
+              <w:t xml:space="preserve">DESENVOLVIMENTO sustentável do turismo: uma compilação de boas práticas. </w:t>
+            </w:r>
+            <w:r>
+              <w:rPr>
+                <w:b/>
+                <w:sz w:val="18"/>
+              </w:rPr>
+              <w:t>São Paulo: Roca, 2005</w:t>
+            </w:r>
+            <w:r>
+              <w:rPr>
+                <w:sz w:val="18"/>
+              </w:rPr>
+              <w:t>. 175 p. ISBN 8572415734.</w:t>
             </w:r>
           </w:p>
           <w:p>
@@ -18527,7 +20919,20 @@
               <w:rPr>
                 <w:sz w:val="18"/>
               </w:rPr>
-              <w:t>RUSCHMANN, Doris van de Meene; PHILIPPI JUNIOR, Arlindo (ed.). Gestão ambiental e sustentabilidade no turismo. Barueri: Manole, 2010. 1027 p. (Ambiental, 9). ISBN 9788520424971.</w:t>
+              <w:t xml:space="preserve">RUSCHMANN, Doris van de Meene; PHILIPPI JUNIOR, Arlindo (ed.). </w:t>
+            </w:r>
+            <w:r>
+              <w:rPr>
+                <w:b/>
+                <w:sz w:val="18"/>
+              </w:rPr>
+              <w:t>Gestão ambiental e sustentabilidade no turismo</w:t>
+            </w:r>
+            <w:r>
+              <w:rPr>
+                <w:sz w:val="18"/>
+              </w:rPr>
+              <w:t>. Barueri: Manole, 2010. 1027 p. (Ambiental, 9). ISBN 9788520424971.</w:t>
             </w:r>
           </w:p>
           <w:p>
@@ -18538,7 +20943,20 @@
               <w:rPr>
                 <w:sz w:val="18"/>
               </w:rPr>
-              <w:t>PIMENTEL, Thiago Duarte; EMMENDOERFER, Magnus Luiz; TOMAZZONI, Edegar Luis (org.). Gestão pública do turismo Brasil: teorias, metodologias e aplicações. Caxias do Sul, RS: EdUCS, 2014. 528 p., il., 23 cm. Inclui bibliografias. ISBN 9788570617354.</w:t>
+              <w:t xml:space="preserve">PIMENTEL, Thiago Duarte; EMMENDOERFER, Magnus Luiz; TOMAZZONI, Edegar Luis (org.). </w:t>
+            </w:r>
+            <w:r>
+              <w:rPr>
+                <w:b/>
+                <w:sz w:val="18"/>
+              </w:rPr>
+              <w:t>Gestão pública do turismo Brasil: teorias, metodologias e aplicações</w:t>
+            </w:r>
+            <w:r>
+              <w:rPr>
+                <w:sz w:val="18"/>
+              </w:rPr>
+              <w:t>. Caxias do Sul, RS: EdUCS, 2014. 528 p., il., 23 cm. Inclui bibliografias. ISBN 9788570617354.</w:t>
             </w:r>
           </w:p>
         </w:tc>
@@ -18574,7 +20992,20 @@
               <w:rPr>
                 <w:sz w:val="18"/>
               </w:rPr>
-              <w:t>IGNARRA, Luiz Renato. Fundamentos do turismo. 3. ed. rev. e ampl. São Paulo; Rio de Janeiro: Cengage Learning: Ed. SENAC Rio, 2013. 226 p., il. ISBN 9788522115396.</w:t>
+              <w:t xml:space="preserve">IGNARRA, Luiz Renato. </w:t>
+            </w:r>
+            <w:r>
+              <w:rPr>
+                <w:b/>
+                <w:sz w:val="18"/>
+              </w:rPr>
+              <w:t>Fundamentos do turismo</w:t>
+            </w:r>
+            <w:r>
+              <w:rPr>
+                <w:sz w:val="18"/>
+              </w:rPr>
+              <w:t>. 3. ed. rev. e ampl. São Paulo; Rio de Janeiro: Cengage Learning: Ed. SENAC Rio, 2013. 226 p., il. ISBN 9788522115396.</w:t>
             </w:r>
           </w:p>
           <w:p>
@@ -18585,7 +21016,20 @@
               <w:rPr>
                 <w:sz w:val="18"/>
               </w:rPr>
-              <w:t>SAMPAIO, Carlos Alberto Cioce. Desenvolvimento sustentável e turismo: implicações de um novo estilo de desenvolvimento humano na atividade turística. Florianópolis: Bernúncia, 2004. 129 p., il. (Meio ambiente &amp; desenvolvimento sustentável, 2). ISBN 8571141568.</w:t>
+              <w:t xml:space="preserve">SAMPAIO, Carlos Alberto Cioce. </w:t>
+            </w:r>
+            <w:r>
+              <w:rPr>
+                <w:b/>
+                <w:sz w:val="18"/>
+              </w:rPr>
+              <w:t>Desenvolvimento sustentável e turismo: implicações de um novo estilo de desenvolvimento humano na atividade turística</w:t>
+            </w:r>
+            <w:r>
+              <w:rPr>
+                <w:sz w:val="18"/>
+              </w:rPr>
+              <w:t>. Florianópolis: Bernúncia, 2004. 129 p., il. (Meio ambiente &amp; desenvolvimento sustentável, 2). ISBN 8571141568.</w:t>
             </w:r>
           </w:p>
           <w:p>
@@ -18596,7 +21040,20 @@
               <w:rPr>
                 <w:sz w:val="18"/>
               </w:rPr>
-              <w:t>SANTANA, Agustín. Antropologia do turismo: analogias, encontros e relações. Tradução de Eleonora Frenkel Barretto. São Paulo: Aleph, 2009. 230 p., il. (Turismo). Bibliografia: p. 213-230. ISBN 9788576570790.</w:t>
+              <w:t xml:space="preserve">SANTANA, Agustín. </w:t>
+            </w:r>
+            <w:r>
+              <w:rPr>
+                <w:b/>
+                <w:sz w:val="18"/>
+              </w:rPr>
+              <w:t>Antropologia do turismo: analogias, encontros e relações</w:t>
+            </w:r>
+            <w:r>
+              <w:rPr>
+                <w:sz w:val="18"/>
+              </w:rPr>
+              <w:t>. Tradução de Eleonora Frenkel Barretto. São Paulo: Aleph, 2009. 230 p., il. (Turismo). Bibliografia: p. 213-230. ISBN 9788576570790.</w:t>
             </w:r>
           </w:p>
         </w:tc>
@@ -19145,7 +21602,20 @@
               <w:rPr>
                 <w:sz w:val="18"/>
               </w:rPr>
-              <w:t>BALLESTERO-ALVAREZ, María Esmeralda; SOTO BALBÁS, Marcial. Minidicionário: espanhol-português, português-espanhol. São Paulo: FTD, 2007.</w:t>
+              <w:t xml:space="preserve">BALLESTERO-ALVAREZ, María Esmeralda; SOTO BALBÁS, Marcial. </w:t>
+            </w:r>
+            <w:r>
+              <w:rPr>
+                <w:b/>
+                <w:sz w:val="18"/>
+              </w:rPr>
+              <w:t>Minidicionário: espanhol-português, português-espanhol</w:t>
+            </w:r>
+            <w:r>
+              <w:rPr>
+                <w:sz w:val="18"/>
+              </w:rPr>
+              <w:t>. São Paulo: FTD, 2007.</w:t>
             </w:r>
           </w:p>
           <w:p>
@@ -19156,7 +21626,20 @@
               <w:rPr>
                 <w:sz w:val="18"/>
               </w:rPr>
-              <w:t>PROST, Gisèle; NORIEGA FERNÁNDEZ, Alfredo. Al día: curso de español para los negocios. 5. ed. Madrid: SGEL, 2012.</w:t>
+              <w:t xml:space="preserve">PROST, Gisèle; NORIEGA FERNÁNDEZ, Alfredo. </w:t>
+            </w:r>
+            <w:r>
+              <w:rPr>
+                <w:b/>
+                <w:sz w:val="18"/>
+              </w:rPr>
+              <w:t>Al día: curso de español para los negocios</w:t>
+            </w:r>
+            <w:r>
+              <w:rPr>
+                <w:sz w:val="18"/>
+              </w:rPr>
+              <w:t>. 5. ed. Madrid: SGEL, 2012.</w:t>
             </w:r>
           </w:p>
         </w:tc>
@@ -19192,7 +21675,20 @@
               <w:rPr>
                 <w:sz w:val="18"/>
               </w:rPr>
-              <w:t>FANJUL, Adrián (org.). Gramática y práctica de español para brasileños. 2. ed. São Paulo: Moderna, 2011.</w:t>
+              <w:t xml:space="preserve">FANJUL, Adrián (org.). </w:t>
+            </w:r>
+            <w:r>
+              <w:rPr>
+                <w:b/>
+                <w:sz w:val="18"/>
+              </w:rPr>
+              <w:t>Gramática y práctica de español para brasileños</w:t>
+            </w:r>
+            <w:r>
+              <w:rPr>
+                <w:sz w:val="18"/>
+              </w:rPr>
+              <w:t>. 2. ed. São Paulo: Moderna, 2011.</w:t>
             </w:r>
           </w:p>
           <w:p>
@@ -19203,7 +21699,20 @@
               <w:rPr>
                 <w:sz w:val="18"/>
               </w:rPr>
-              <w:t>GONZÁLEZ H. A. Conjugar: verbos de España y de América. Madrid: Edelsa Grupo Didascalia, 2011.</w:t>
+              <w:t xml:space="preserve">GONZÁLEZ H. A. </w:t>
+            </w:r>
+            <w:r>
+              <w:rPr>
+                <w:b/>
+                <w:sz w:val="18"/>
+              </w:rPr>
+              <w:t>Conjugar: verbos de España y de América</w:t>
+            </w:r>
+            <w:r>
+              <w:rPr>
+                <w:sz w:val="18"/>
+              </w:rPr>
+              <w:t>. Madrid: Edelsa Grupo Didascalia, 2011.</w:t>
             </w:r>
           </w:p>
           <w:p>
@@ -19214,7 +21723,20 @@
               <w:rPr>
                 <w:sz w:val="18"/>
               </w:rPr>
-              <w:t>PROST, Gisèle; NORIEGA FERNÁNDEZ, Alfredo. Al día: curso intermedio de español para los negocios. 3. ed. Madrid: SGEL, 2011.</w:t>
+              <w:t xml:space="preserve">PROST, Gisèle; NORIEGA FERNÁNDEZ, Alfredo. </w:t>
+            </w:r>
+            <w:r>
+              <w:rPr>
+                <w:b/>
+                <w:sz w:val="18"/>
+              </w:rPr>
+              <w:t>Al día: curso intermedio de español para los negocios</w:t>
+            </w:r>
+            <w:r>
+              <w:rPr>
+                <w:sz w:val="18"/>
+              </w:rPr>
+              <w:t>. 3. ed. Madrid: SGEL, 2011.</w:t>
             </w:r>
           </w:p>
         </w:tc>
@@ -19761,7 +22283,20 @@
               <w:rPr>
                 <w:sz w:val="18"/>
               </w:rPr>
-              <w:t>MUNHOZ, Rosângela. Inglês instrumental: estratégias de leitura: módulo I. 3. ed. reform. e rev. São Paulo: Heccus, 2018. 115 p., il. ISBN 9788567281087. MICHAELIS. Moderno dicionário inglês-português, português-inglês. São Paulo: Companhia Melhoramentos, 2009.</w:t>
+              <w:t xml:space="preserve">MUNHOZ, Rosângela. </w:t>
+            </w:r>
+            <w:r>
+              <w:rPr>
+                <w:b/>
+                <w:sz w:val="18"/>
+              </w:rPr>
+              <w:t>Inglês instrumental: estratégias de leitura: módulo I</w:t>
+            </w:r>
+            <w:r>
+              <w:rPr>
+                <w:sz w:val="18"/>
+              </w:rPr>
+              <w:t>. 3. ed. reform. e rev. São Paulo: Heccus, 2018. 115 p., il. ISBN 9788567281087. MICHAELIS. Moderno dicionário inglês-português, português-inglês. São Paulo: Companhia Melhoramentos, 2009.</w:t>
             </w:r>
           </w:p>
           <w:p>
@@ -19772,7 +22307,20 @@
               <w:rPr>
                 <w:sz w:val="18"/>
               </w:rPr>
-              <w:t>TORRES, Nelson. Gramática prática da língua inglesa: o inglês descomplicado. 10. ed. São Paulo: Saraiva, 2007.</w:t>
+              <w:t xml:space="preserve">TORRES, Nelson. </w:t>
+            </w:r>
+            <w:r>
+              <w:rPr>
+                <w:b/>
+                <w:sz w:val="18"/>
+              </w:rPr>
+              <w:t>Gramática prática da língua inglesa: o inglês descomplicado</w:t>
+            </w:r>
+            <w:r>
+              <w:rPr>
+                <w:sz w:val="18"/>
+              </w:rPr>
+              <w:t>. 10. ed. São Paulo: Saraiva, 2007.</w:t>
             </w:r>
           </w:p>
         </w:tc>
@@ -19808,7 +22356,20 @@
               <w:rPr>
                 <w:sz w:val="18"/>
               </w:rPr>
-              <w:t>LATHAM-KOENIG, Christina. English File: Beginner Student's Book. Oxford: Oxford University Press, 2018. 135 p, il., color. ISBN 9780194029803. LATHAM-KOENIG, Christina. English File: Intermediate Student's Book. Oxford: Oxford University Press, 2018. 167 p, il., color. ISBN 9780194035910.</w:t>
+              <w:t xml:space="preserve">LATHAM-KOENIG, Christina. </w:t>
+            </w:r>
+            <w:r>
+              <w:rPr>
+                <w:b/>
+                <w:sz w:val="18"/>
+              </w:rPr>
+              <w:t>English File: Beginner Student's Book</w:t>
+            </w:r>
+            <w:r>
+              <w:rPr>
+                <w:sz w:val="18"/>
+              </w:rPr>
+              <w:t>. Oxford: Oxford University Press, 2018. 135 p, il., color. ISBN 9780194029803. LATHAM-KOENIG, Christina. English File: Intermediate Student's Book. Oxford: Oxford University Press, 2018. 167 p, il., color. ISBN 9780194035910.</w:t>
             </w:r>
           </w:p>
           <w:p>
@@ -19819,7 +22380,20 @@
               <w:rPr>
                 <w:sz w:val="18"/>
               </w:rPr>
-              <w:t>LIMA, Denilso de. Gramática de uso da língua inglesa: a gramática do inglês na ponta da língua. Rio de Janeiro: Alta Books, 2018. 201 p. Inclui referencias bibliograficas. ISBN 9788550802923.</w:t>
+              <w:t xml:space="preserve">LIMA, Denilso de. </w:t>
+            </w:r>
+            <w:r>
+              <w:rPr>
+                <w:b/>
+                <w:sz w:val="18"/>
+              </w:rPr>
+              <w:t>Gramática de uso da língua inglesa: a gramática do inglês na ponta da língua</w:t>
+            </w:r>
+            <w:r>
+              <w:rPr>
+                <w:sz w:val="18"/>
+              </w:rPr>
+              <w:t>. Rio de Janeiro: Alta Books, 2018. 201 p. Inclui referencias bibliograficas. ISBN 9788550802923.</w:t>
             </w:r>
           </w:p>
         </w:tc>
@@ -20227,7 +22801,20 @@
               <w:rPr>
                 <w:sz w:val="18"/>
               </w:rPr>
-              <w:t>QUADROS, Ronice Müller de; KARNOPP, Lodenir Becker. Língua de sinais brasileira: estudos linguísticos. Porto Alegre: Artmed, 2004. 221 p., il. (se tiver na biblioteca) Ou</w:t>
+              <w:t xml:space="preserve">QUADROS, Ronice Müller de; KARNOPP, Lodenir Becker. </w:t>
+            </w:r>
+            <w:r>
+              <w:rPr>
+                <w:b/>
+                <w:sz w:val="18"/>
+              </w:rPr>
+              <w:t>Língua de sinais brasileira: estudos linguísticos</w:t>
+            </w:r>
+            <w:r>
+              <w:rPr>
+                <w:sz w:val="18"/>
+              </w:rPr>
+              <w:t>. Porto Alegre: Artmed, 2004. 221 p., il. (se tiver na biblioteca) Ou</w:t>
             </w:r>
           </w:p>
           <w:p>
@@ -20238,7 +22825,20 @@
               <w:rPr>
                 <w:sz w:val="18"/>
               </w:rPr>
-              <w:t>SILVA, Ronice Müller de Quadros, Rodrigo Nogueira Machado, Jair Barbosa da. Introdução ao estudo da Libras. São Paulo: Editora Contexto, 2025. E-book. p.capa. ISBN 9786555416367. Disponível em: https://app.minhabiblioteca.com.br/reader/books/9786555416367/. Acesso em: 23 jun. 2026.</w:t>
+              <w:t xml:space="preserve">SILVA, Ronice Müller de Quadros, Rodrigo Nogueira Machado, Jair Barbosa da. </w:t>
+            </w:r>
+            <w:r>
+              <w:rPr>
+                <w:b/>
+                <w:sz w:val="18"/>
+              </w:rPr>
+              <w:t>Introdução ao estudo da Libras</w:t>
+            </w:r>
+            <w:r>
+              <w:rPr>
+                <w:sz w:val="18"/>
+              </w:rPr>
+              <w:t>. São Paulo: Editora Contexto, 2025. E-book. p.capa. ISBN 9786555416367. Disponível em: https://app.minhabiblioteca.com.br/reader/books/9786555416367/. Acesso em: 23 jun. 2026.</w:t>
             </w:r>
           </w:p>
           <w:p>
@@ -20249,7 +22849,20 @@
               <w:rPr>
                 <w:sz w:val="18"/>
               </w:rPr>
-              <w:t>WILCOX, Sherman; WILCOX, Phyllis Perrin. Aprenda a ver. Rio de Janeiro: Arara Azul, 2005, 190 p. E-book. Disponível em: https://libras.uff.br/aprender-a-ver-3/. Acesso em: 23 jun. 2026.</w:t>
+              <w:t xml:space="preserve">WILCOX, Sherman; WILCOX, Phyllis Perrin. </w:t>
+            </w:r>
+            <w:r>
+              <w:rPr>
+                <w:b/>
+                <w:sz w:val="18"/>
+              </w:rPr>
+              <w:t>Aprenda a ver</w:t>
+            </w:r>
+            <w:r>
+              <w:rPr>
+                <w:sz w:val="18"/>
+              </w:rPr>
+              <w:t>. Rio de Janeiro: Arara Azul, 2005, 190 p. E-book. Disponível em: https://libras.uff.br/aprender-a-ver-3/. Acesso em: 23 jun. 2026.</w:t>
             </w:r>
           </w:p>
         </w:tc>
@@ -20285,7 +22898,20 @@
               <w:rPr>
                 <w:sz w:val="18"/>
               </w:rPr>
-              <w:t>MORAIS, Carlos E. L.; PLINSKI, Rejane R. K.; MARTINS, Gabriel P. T. C.; et al. Libras. 2. ed. Porto Alegre: SAGAH, 2018. E-book. Disponível em: https://app.minhabiblioteca.com.br/#/books/9788595027305/. Acesso em: 23 jun. 2026.</w:t>
+              <w:t xml:space="preserve">MORAIS, Carlos E. L.; PLINSKI, Rejane R. K.; MARTINS, Gabriel P. T. C.; et al. </w:t>
+            </w:r>
+            <w:r>
+              <w:rPr>
+                <w:b/>
+                <w:sz w:val="18"/>
+              </w:rPr>
+              <w:t>Libras</w:t>
+            </w:r>
+            <w:r>
+              <w:rPr>
+                <w:sz w:val="18"/>
+              </w:rPr>
+              <w:t>. 2. ed. Porto Alegre: SAGAH, 2018. E-book. Disponível em: https://app.minhabiblioteca.com.br/#/books/9788595027305/. Acesso em: 23 jun. 2026.</w:t>
             </w:r>
           </w:p>
           <w:p>
@@ -20296,7 +22922,20 @@
               <w:rPr>
                 <w:sz w:val="18"/>
               </w:rPr>
-              <w:t>QUADROS, Ronice Muller de; PIZZIO, Aline Lemos; REZENDE, Patrícia Luiza Ferreira. Língua brasileira de sinais I. Florianópolis: UFSC, 2009. Disponível em: http://www.libras.ufsc.br/colecaoLetrasLibras/eixoFormacaoEspecifica/linguaBrasileiraDeSinaisI/assets/459/Texto_base.pdf. Acesso em: 23 jun. 2026.</w:t>
+              <w:t xml:space="preserve">QUADROS, Ronice Muller de; PIZZIO, Aline Lemos; REZENDE, Patrícia Luiza Ferreira. </w:t>
+            </w:r>
+            <w:r>
+              <w:rPr>
+                <w:b/>
+                <w:sz w:val="18"/>
+              </w:rPr>
+              <w:t>Língua brasileira de sinais I</w:t>
+            </w:r>
+            <w:r>
+              <w:rPr>
+                <w:sz w:val="18"/>
+              </w:rPr>
+              <w:t>. Florianópolis: UFSC, 2009. Disponível em: http://www.libras.ufsc.br/colecaoLetrasLibras/eixoFormacaoEspecifica/linguaBrasileiraDeSinaisI/assets/459/Texto_base.pdf. Acesso em: 23 jun. 2026.</w:t>
             </w:r>
           </w:p>
           <w:p>
@@ -20307,7 +22946,20 @@
               <w:rPr>
                 <w:sz w:val="18"/>
               </w:rPr>
-              <w:t>VILHALVA, Shirley. Despertar do silêncio. Rio de Janeiro: Arara Azul, 2004. E-book. Disponível em:https://libras.uff.br/despertar-do-silencio-3/. Acesso em: 23 jun. 2026.</w:t>
+              <w:t xml:space="preserve">VILHALVA, Shirley. </w:t>
+            </w:r>
+            <w:r>
+              <w:rPr>
+                <w:b/>
+                <w:sz w:val="18"/>
+              </w:rPr>
+              <w:t>Despertar do silêncio</w:t>
+            </w:r>
+            <w:r>
+              <w:rPr>
+                <w:sz w:val="18"/>
+              </w:rPr>
+              <w:t>. Rio de Janeiro: Arara Azul, 2004. E-book. Disponível em:https://libras.uff.br/despertar-do-silencio-3/. Acesso em: 23 jun. 2026.</w:t>
             </w:r>
           </w:p>
         </w:tc>

</xml_diff>